<commit_message>
CV: Curtin Consulting Group engagement with Hockey WA added as experience; two pages
Co-Authored-By: Claude Fable 5.1 <noreply@anthropic.com>
Claude-Session: https://claude.ai/code/session_011X2nibp2ZJGG1sr585TrFg
</commit_message>
<xml_diff>
--- a/Waranyu-Bancherdvanich-CV.docx
+++ b/Waranyu-Bancherdvanich-CV.docx
@@ -102,7 +102,7 @@
             <w:pPr>
               <w:jc w:val="right"/>
             </w:pPr>
-            <w:hyperlink w:history="1" r:id="rIdfr0znj_3w3itl5zgmdorj">
+            <w:hyperlink w:history="1" r:id="rIdylqmelcvc63tyt0m5at01">
               <w:r>
                 <w:rPr>
                   <w:rFonts w:ascii="Calibri" w:cs="Calibri" w:eastAsia="Calibri" w:hAnsi="Calibri"/>
@@ -119,7 +119,7 @@
             <w:pPr>
               <w:jc w:val="right"/>
             </w:pPr>
-            <w:hyperlink w:history="1" r:id="rId1rsz4-mnauxig9f_i872b">
+            <w:hyperlink w:history="1" r:id="rIdupwippwkzus_gmkko8z0n">
               <w:r>
                 <w:rPr>
                   <w:rFonts w:ascii="Calibri" w:cs="Calibri" w:eastAsia="Calibri" w:hAnsi="Calibri"/>
@@ -140,7 +140,7 @@
               </w:rPr>
               <w:t xml:space="preserve"> · </w:t>
             </w:r>
-            <w:hyperlink w:history="1" r:id="rIdk2hdvdsn3klvmwx4cec97">
+            <w:hyperlink w:history="1" r:id="rIdrs8bmztg0rsnlky4vx9-q">
               <w:r>
                 <w:rPr>
                   <w:rFonts w:ascii="Calibri" w:cs="Calibri" w:eastAsia="Calibri" w:hAnsi="Calibri"/>
@@ -157,7 +157,7 @@
             <w:pPr>
               <w:jc w:val="right"/>
             </w:pPr>
-            <w:hyperlink w:history="1" r:id="rIdwdhsivemut1ulsrqhxkls">
+            <w:hyperlink w:history="1" r:id="rIdkeoltfaajcgpsaq1cbtgh">
               <w:r>
                 <w:rPr>
                   <w:rFonts w:ascii="Calibri" w:cs="Calibri" w:eastAsia="Calibri" w:hAnsi="Calibri"/>
@@ -219,7 +219,7 @@
           <w:sz w:val="19"/>
           <w:szCs w:val="19"/>
         </w:rPr>
-        <w:t xml:space="preserve">Master of Information Systems and Technology student at Curtin University (CWA 83.57), specialising in data analytics and visualisation, with a bachelor’s degree in statistics and finance. I build Power BI dashboards on data I have audited and modelled myself, and I forecast in R so the method can be checked. Four portfolio projects run on their real data at waranyu-cv.vercel.app. Seeking a data analyst internship in Perth, and graduate roles from July 2027.</w:t>
+        <w:t xml:space="preserve">Master of Information Systems and Technology student at Curtin University (CWA 83.57), specialising in data analytics and visualisation, with a bachelor’s degree in statistics and finance. I build Power BI dashboards on data I have audited and modelled myself, and I forecast in R so the method can be checked. Most recently I led the financial analysis for a Curtin Consulting Group engagement with Hockey WA. Four portfolio projects run on their real data at waranyu-cv.vercel.app. Seeking a data analyst internship in Perth, and graduate roles from July 2027.</w:t>
       </w:r>
     </w:p>
     <w:p>
@@ -601,7 +601,7 @@
                 <w:sz w:val="19"/>
                 <w:szCs w:val="19"/>
               </w:rPr>
-              <w:t xml:space="preserve">Forecasting and Statistical Modelling</w:t>
+              <w:t xml:space="preserve">Forecasting and Financial Modelling</w:t>
             </w:r>
           </w:p>
           <w:p>
@@ -615,7 +615,7 @@
                 <w:sz w:val="19"/>
                 <w:szCs w:val="19"/>
               </w:rPr>
-              <w:t xml:space="preserve">Experienced in linear regression, time-series analysis, forecasting, prediction intervals, and model interpretation using R.</w:t>
+              <w:t xml:space="preserve">Experienced in linear regression, time-series analysis, forecasting and prediction intervals in R, and in break-even, scenario and sensitivity modelling in Excel.</w:t>
             </w:r>
           </w:p>
         </w:tc>
@@ -828,7 +828,7 @@
               <w:spacing w:before="30"/>
               <w:jc w:val="right"/>
             </w:pPr>
-            <w:hyperlink w:history="1" r:id="rIdn6poqfxfhhyvxvkpdzadt">
+            <w:hyperlink w:history="1" r:id="rIdf6bqghq6gblmgzbmnsfh3">
               <w:r>
                 <w:rPr>
                   <w:rFonts w:ascii="Consolas" w:cs="Consolas" w:eastAsia="Consolas" w:hAnsi="Consolas"/>
@@ -1010,7 +1010,7 @@
               <w:spacing w:before="30"/>
               <w:jc w:val="right"/>
             </w:pPr>
-            <w:hyperlink w:history="1" r:id="rIdddgnqskseqd_oi_sqjhtw">
+            <w:hyperlink w:history="1" r:id="rIdyo3nxu817x0lhm2em_skt">
               <w:r>
                 <w:rPr>
                   <w:rFonts w:ascii="Consolas" w:cs="Consolas" w:eastAsia="Consolas" w:hAnsi="Consolas"/>
@@ -1192,7 +1192,7 @@
               <w:spacing w:before="30"/>
               <w:jc w:val="right"/>
             </w:pPr>
-            <w:hyperlink w:history="1" r:id="rIdejds_fc3idq__fa8gqisg">
+            <w:hyperlink w:history="1" r:id="rId4hbgk8vujwgwuv1n1pxd3">
               <w:r>
                 <w:rPr>
                   <w:rFonts w:ascii="Consolas" w:cs="Consolas" w:eastAsia="Consolas" w:hAnsi="Consolas"/>
@@ -1272,7 +1272,7 @@
                 <w:sz w:val="21"/>
                 <w:szCs w:val="21"/>
               </w:rPr>
-              <w:t xml:space="preserve">Digital Marketing &amp; Data Analytics Intern</w:t>
+              <w:t xml:space="preserve">Student Consultant (Finance Lead)</w:t>
             </w:r>
           </w:p>
           <w:p>
@@ -1286,7 +1286,7 @@
                 <w:sz w:val="19"/>
                 <w:szCs w:val="19"/>
               </w:rPr>
-              <w:t xml:space="preserve">Like Me Co., Ltd. – Bangkok, Thailand</w:t>
+              <w:t xml:space="preserve">Curtin Consulting Group, Curtin University · Client: Hockey WA</w:t>
             </w:r>
           </w:p>
           <w:p>
@@ -1305,7 +1305,7 @@
                 <w:sz w:val="19"/>
                 <w:szCs w:val="19"/>
               </w:rPr>
-              <w:t xml:space="preserve">Supported digital marketing campaigns through social media content, product research, and competitor analysis.</w:t>
+              <w:t xml:space="preserve">Led the financial analysis in a nine-person student consulting team advising Hockey WA, the state’s not-for-profit hockey body, on how to stream and own the broadcast of games at its new six-surface hockey centre in Perth without building its own platform.</w:t>
             </w:r>
           </w:p>
           <w:p>
@@ -1324,7 +1324,7 @@
                 <w:sz w:val="19"/>
                 <w:szCs w:val="19"/>
               </w:rPr>
-              <w:t xml:space="preserve">Conducted basic data tracking and market research to support campaign planning and business decisions.</w:t>
+              <w:t xml:space="preserve">Built a 20-year break-even model in Excel with best, base and worst-case scenarios, one-off and running cost tables, revenue estimates, and an appendix tracing every figure to its source.</w:t>
             </w:r>
           </w:p>
           <w:p>
@@ -1343,7 +1343,7 @@
                 <w:sz w:val="19"/>
                 <w:szCs w:val="19"/>
               </w:rPr>
-              <w:t xml:space="preserve">Assisted with content writing and customer trend analysis to improve marketing communication.</w:t>
+              <w:t xml:space="preserve">Ran a sensitivity analysis (each driver ±20%) showing that audience growth outweighs upfront build cost in determining payback, and used it to recommend investing in marketing rather than seeking funding for the build.</w:t>
             </w:r>
           </w:p>
           <w:p>
@@ -1362,7 +1362,205 @@
                 <w:sz w:val="19"/>
                 <w:szCs w:val="19"/>
               </w:rPr>
-              <w:t xml:space="preserve">Developed practical experience combining marketing insight with data-informed decision-making.</w:t>
+              <w:t xml:space="preserve">Benchmarked growth and audience-retention assumptions against 15+ public case studies, including Finnish floorball streaming, GAAGO, Solidsport and the NFL’s move to Prime Video, alongside the team’s evaluation of three ownership options and four camera and analysis providers against weighted criteria.</w:t>
+            </w:r>
+          </w:p>
+          <w:p>
+            <w:pPr>
+              <w:pStyle w:val="ListParagraph"/>
+              <w:numPr>
+                <w:ilvl w:val="0"/>
+                <w:numId w:val="2"/>
+              </w:numPr>
+              <w:spacing w:after="30"/>
+            </w:pPr>
+            <w:r>
+              <w:rPr>
+                <w:rFonts w:ascii="Calibri" w:cs="Calibri" w:eastAsia="Calibri" w:hAnsi="Calibri"/>
+                <w:color w:val="1C1B18"/>
+                <w:sz w:val="19"/>
+                <w:szCs w:val="19"/>
+              </w:rPr>
+              <w:t xml:space="preserve">Turned the analysis into board-ready slides and charts, revised after project director feedback, and presented the financial section at the final pitch to the client and an industry panel.</w:t>
+            </w:r>
+          </w:p>
+          <w:p>
+            <w:pPr>
+              <w:pStyle w:val="ListParagraph"/>
+              <w:numPr>
+                <w:ilvl w:val="0"/>
+                <w:numId w:val="2"/>
+              </w:numPr>
+              <w:spacing w:after="30"/>
+            </w:pPr>
+            <w:r>
+              <w:rPr>
+                <w:rFonts w:ascii="Calibri" w:cs="Calibri" w:eastAsia="Calibri" w:hAnsi="Calibri"/>
+                <w:color w:val="1C1B18"/>
+                <w:sz w:val="19"/>
+                <w:szCs w:val="19"/>
+              </w:rPr>
+              <w:t xml:space="preserve">Built an interactive React prototype of the recommended streaming platform (family, coach and admin views) and a 3D render of the venue’s camera layout.</w:t>
+            </w:r>
+          </w:p>
+        </w:tc>
+        <w:tc>
+          <w:tcPr>
+            <w:tcW w:type="dxa" w:w="2700"/>
+            <w:tcBorders>
+              <w:top w:val="none" w:color="FFFFFF" w:sz="0"/>
+              <w:left w:val="none" w:color="FFFFFF" w:sz="0"/>
+              <w:bottom w:val="none" w:color="FFFFFF" w:sz="0"/>
+              <w:right w:val="none" w:color="FFFFFF" w:sz="0"/>
+            </w:tcBorders>
+            <w:tcMar>
+              <w:top w:type="dxa" w:w="0"/>
+              <w:left w:type="dxa" w:w="0"/>
+              <w:bottom w:type="dxa" w:w="0"/>
+              <w:right w:type="dxa" w:w="0"/>
+            </w:tcMar>
+          </w:tcPr>
+          <w:p>
+            <w:pPr>
+              <w:spacing w:before="30"/>
+              <w:jc w:val="right"/>
+            </w:pPr>
+            <w:r>
+              <w:rPr>
+                <w:rFonts w:ascii="Consolas" w:cs="Consolas" w:eastAsia="Consolas" w:hAnsi="Consolas"/>
+                <w:color w:val="5D5A52"/>
+                <w:sz w:val="15"/>
+                <w:szCs w:val="15"/>
+              </w:rPr>
+              <w:t xml:space="preserve">2026 – Oct 2026</w:t>
+            </w:r>
+          </w:p>
+        </w:tc>
+      </w:tr>
+    </w:tbl>
+    <w:p>
+      <w:pPr>
+        <w:spacing w:after="0" w:before="0" w:line="110" w:lineRule="exact"/>
+      </w:pPr>
+    </w:p>
+    <w:tbl>
+      <w:tblPr>
+        <w:tblW w:type="dxa" w:w="10206"/>
+        <w:tblBorders>
+          <w:top w:val="single" w:color="auto" w:sz="4"/>
+          <w:left w:val="single" w:color="auto" w:sz="4"/>
+          <w:bottom w:val="single" w:color="auto" w:sz="4"/>
+          <w:right w:val="single" w:color="auto" w:sz="4"/>
+          <w:insideH w:val="single" w:color="auto" w:sz="4"/>
+          <w:insideV w:val="single" w:color="auto" w:sz="4"/>
+        </w:tblBorders>
+      </w:tblPr>
+      <w:tblGrid>
+        <w:gridCol w:w="7506"/>
+        <w:gridCol w:w="2700"/>
+      </w:tblGrid>
+      <w:tr>
+        <w:tc>
+          <w:tcPr>
+            <w:tcW w:type="dxa" w:w="7506"/>
+            <w:tcBorders>
+              <w:top w:val="none" w:color="FFFFFF" w:sz="0"/>
+              <w:left w:val="none" w:color="FFFFFF" w:sz="0"/>
+              <w:bottom w:val="none" w:color="FFFFFF" w:sz="0"/>
+              <w:right w:val="none" w:color="FFFFFF" w:sz="0"/>
+            </w:tcBorders>
+            <w:tcMar>
+              <w:top w:type="dxa" w:w="0"/>
+              <w:left w:type="dxa" w:w="0"/>
+              <w:bottom w:type="dxa" w:w="0"/>
+              <w:right w:type="dxa" w:w="0"/>
+            </w:tcMar>
+          </w:tcPr>
+          <w:p>
+            <w:pPr>
+              <w:spacing w:after="0"/>
+            </w:pPr>
+            <w:r>
+              <w:rPr>
+                <w:rFonts w:ascii="Georgia" w:cs="Georgia" w:eastAsia="Georgia" w:hAnsi="Georgia"/>
+                <w:b/>
+                <w:bCs/>
+                <w:color w:val="1C1B18"/>
+                <w:sz w:val="21"/>
+                <w:szCs w:val="21"/>
+              </w:rPr>
+              <w:t xml:space="preserve">Digital Marketing &amp; Data Analytics Intern</w:t>
+            </w:r>
+          </w:p>
+          <w:p>
+            <w:pPr>
+              <w:spacing w:after="40"/>
+            </w:pPr>
+            <w:r>
+              <w:rPr>
+                <w:rFonts w:ascii="Calibri" w:cs="Calibri" w:eastAsia="Calibri" w:hAnsi="Calibri"/>
+                <w:color w:val="5D5A52"/>
+                <w:sz w:val="19"/>
+                <w:szCs w:val="19"/>
+              </w:rPr>
+              <w:t xml:space="preserve">Like Me Co., Ltd. – Bangkok, Thailand</w:t>
+            </w:r>
+          </w:p>
+          <w:p>
+            <w:pPr>
+              <w:pStyle w:val="ListParagraph"/>
+              <w:numPr>
+                <w:ilvl w:val="0"/>
+                <w:numId w:val="2"/>
+              </w:numPr>
+              <w:spacing w:after="30"/>
+            </w:pPr>
+            <w:r>
+              <w:rPr>
+                <w:rFonts w:ascii="Calibri" w:cs="Calibri" w:eastAsia="Calibri" w:hAnsi="Calibri"/>
+                <w:color w:val="1C1B18"/>
+                <w:sz w:val="19"/>
+                <w:szCs w:val="19"/>
+              </w:rPr>
+              <w:t xml:space="preserve">Supported digital marketing campaigns through social media content, product research, and competitor analysis.</w:t>
+            </w:r>
+          </w:p>
+          <w:p>
+            <w:pPr>
+              <w:pStyle w:val="ListParagraph"/>
+              <w:numPr>
+                <w:ilvl w:val="0"/>
+                <w:numId w:val="2"/>
+              </w:numPr>
+              <w:spacing w:after="30"/>
+            </w:pPr>
+            <w:r>
+              <w:rPr>
+                <w:rFonts w:ascii="Calibri" w:cs="Calibri" w:eastAsia="Calibri" w:hAnsi="Calibri"/>
+                <w:color w:val="1C1B18"/>
+                <w:sz w:val="19"/>
+                <w:szCs w:val="19"/>
+              </w:rPr>
+              <w:t xml:space="preserve">Conducted basic data tracking and market research to support campaign planning and business decisions.</w:t>
+            </w:r>
+          </w:p>
+          <w:p>
+            <w:pPr>
+              <w:pStyle w:val="ListParagraph"/>
+              <w:numPr>
+                <w:ilvl w:val="0"/>
+                <w:numId w:val="2"/>
+              </w:numPr>
+              <w:spacing w:after="30"/>
+            </w:pPr>
+            <w:r>
+              <w:rPr>
+                <w:rFonts w:ascii="Calibri" w:cs="Calibri" w:eastAsia="Calibri" w:hAnsi="Calibri"/>
+                <w:color w:val="1C1B18"/>
+                <w:sz w:val="19"/>
+                <w:szCs w:val="19"/>
+              </w:rPr>
+              <w:t xml:space="preserve">Assisted with content writing and customer trend analysis to improve marketing communication.</w:t>
             </w:r>
           </w:p>
         </w:tc>
@@ -1516,45 +1714,7 @@
                 <w:sz w:val="19"/>
                 <w:szCs w:val="19"/>
               </w:rPr>
-              <w:t xml:space="preserve">Communicated clearly with customers and team members to support smooth service during busy periods.</w:t>
-            </w:r>
-          </w:p>
-          <w:p>
-            <w:pPr>
-              <w:pStyle w:val="ListParagraph"/>
-              <w:numPr>
-                <w:ilvl w:val="0"/>
-                <w:numId w:val="2"/>
-              </w:numPr>
-              <w:spacing w:after="30"/>
-            </w:pPr>
-            <w:r>
-              <w:rPr>
-                <w:rFonts w:ascii="Calibri" w:cs="Calibri" w:eastAsia="Calibri" w:hAnsi="Calibri"/>
-                <w:color w:val="1C1B18"/>
-                <w:sz w:val="19"/>
-                <w:szCs w:val="19"/>
-              </w:rPr>
               <w:t xml:space="preserve">Managed multiple tasks under pressure while maintaining accuracy with orders, payments, and customer requests.</w:t>
-            </w:r>
-          </w:p>
-          <w:p>
-            <w:pPr>
-              <w:pStyle w:val="ListParagraph"/>
-              <w:numPr>
-                <w:ilvl w:val="0"/>
-                <w:numId w:val="2"/>
-              </w:numPr>
-              <w:spacing w:after="30"/>
-            </w:pPr>
-            <w:r>
-              <w:rPr>
-                <w:rFonts w:ascii="Calibri" w:cs="Calibri" w:eastAsia="Calibri" w:hAnsi="Calibri"/>
-                <w:color w:val="1C1B18"/>
-                <w:sz w:val="19"/>
-                <w:szCs w:val="19"/>
-              </w:rPr>
-              <w:t xml:space="preserve">Supported a positive dining experience by responding to customer enquiries professionally.</w:t>
             </w:r>
           </w:p>
         </w:tc>
@@ -1898,38 +2058,6 @@
     <w:p>
       <w:pPr>
         <w:pBdr>
-          <w:bottom w:val="single" w:color="D8D2C4" w:sz="4" w:space="2"/>
-        </w:pBdr>
-        <w:spacing w:after="90" w:before="260"/>
-      </w:pPr>
-      <w:r>
-        <w:rPr>
-          <w:rFonts w:ascii="Consolas" w:cs="Consolas" w:eastAsia="Consolas" w:hAnsi="Consolas"/>
-          <w:color w:val="0F6B45"/>
-          <w:spacing w:val="40"/>
-          <w:sz w:val="15"/>
-          <w:szCs w:val="15"/>
-        </w:rPr>
-        <w:t xml:space="preserve">REFERENCES</w:t>
-      </w:r>
-    </w:p>
-    <w:p>
-      <w:pPr>
-        <w:spacing w:after="60"/>
-      </w:pPr>
-      <w:r>
-        <w:rPr>
-          <w:rFonts w:ascii="Calibri" w:cs="Calibri" w:eastAsia="Calibri" w:hAnsi="Calibri"/>
-          <w:color w:val="1C1B18"/>
-          <w:sz w:val="19"/>
-          <w:szCs w:val="19"/>
-        </w:rPr>
-        <w:t xml:space="preserve">Available on request.</w:t>
-      </w:r>
-    </w:p>
-    <w:p>
-      <w:pPr>
-        <w:pBdr>
           <w:top w:val="single" w:color="D8D2C4" w:sz="4" w:space="4"/>
         </w:pBdr>
         <w:tabs>
@@ -1944,7 +2072,7 @@
           <w:sz w:val="14"/>
           <w:szCs w:val="14"/>
         </w:rPr>
-        <w:t xml:space="preserve">Waranyu Bancherdvanich · CV</w:t>
+        <w:t xml:space="preserve">References available on request</w:t>
       </w:r>
       <w:r>
         <w:rPr>

</xml_diff>

<commit_message>
CV and site: Curtin Consulting Group dates, Jul to Nov 2026
Co-Authored-By: Claude Opus 5.5 <noreply@anthropic.com>
Claude-Session: https://claude.ai/code/session_011X2nibp2ZJGG1sr585TrFg
</commit_message>
<xml_diff>
--- a/Waranyu-Bancherdvanich-CV.docx
+++ b/Waranyu-Bancherdvanich-CV.docx
@@ -102,7 +102,7 @@
             <w:pPr>
               <w:jc w:val="right"/>
             </w:pPr>
-            <w:hyperlink w:history="1" r:id="rIdylqmelcvc63tyt0m5at01">
+            <w:hyperlink w:history="1" r:id="rIdbuznl_bjixnwcixfk0g7j">
               <w:r>
                 <w:rPr>
                   <w:rFonts w:ascii="Calibri" w:cs="Calibri" w:eastAsia="Calibri" w:hAnsi="Calibri"/>
@@ -119,7 +119,7 @@
             <w:pPr>
               <w:jc w:val="right"/>
             </w:pPr>
-            <w:hyperlink w:history="1" r:id="rIdupwippwkzus_gmkko8z0n">
+            <w:hyperlink w:history="1" r:id="rIdlhhbqx2crfbcx3wu6dsxj">
               <w:r>
                 <w:rPr>
                   <w:rFonts w:ascii="Calibri" w:cs="Calibri" w:eastAsia="Calibri" w:hAnsi="Calibri"/>
@@ -140,7 +140,7 @@
               </w:rPr>
               <w:t xml:space="preserve"> · </w:t>
             </w:r>
-            <w:hyperlink w:history="1" r:id="rIdrs8bmztg0rsnlky4vx9-q">
+            <w:hyperlink w:history="1" r:id="rIdc_qw43zjpbcom39tictih">
               <w:r>
                 <w:rPr>
                   <w:rFonts w:ascii="Calibri" w:cs="Calibri" w:eastAsia="Calibri" w:hAnsi="Calibri"/>
@@ -157,7 +157,7 @@
             <w:pPr>
               <w:jc w:val="right"/>
             </w:pPr>
-            <w:hyperlink w:history="1" r:id="rIdkeoltfaajcgpsaq1cbtgh">
+            <w:hyperlink w:history="1" r:id="rIdslzeedf1zqujxyf3nm9nf">
               <w:r>
                 <w:rPr>
                   <w:rFonts w:ascii="Calibri" w:cs="Calibri" w:eastAsia="Calibri" w:hAnsi="Calibri"/>
@@ -828,7 +828,7 @@
               <w:spacing w:before="30"/>
               <w:jc w:val="right"/>
             </w:pPr>
-            <w:hyperlink w:history="1" r:id="rIdf6bqghq6gblmgzbmnsfh3">
+            <w:hyperlink w:history="1" r:id="rIdd6uabsluticgo7-udqpyc">
               <w:r>
                 <w:rPr>
                   <w:rFonts w:ascii="Consolas" w:cs="Consolas" w:eastAsia="Consolas" w:hAnsi="Consolas"/>
@@ -1010,7 +1010,7 @@
               <w:spacing w:before="30"/>
               <w:jc w:val="right"/>
             </w:pPr>
-            <w:hyperlink w:history="1" r:id="rIdyo3nxu817x0lhm2em_skt">
+            <w:hyperlink w:history="1" r:id="rIdobwisj_cz40zvasacb1mf">
               <w:r>
                 <w:rPr>
                   <w:rFonts w:ascii="Consolas" w:cs="Consolas" w:eastAsia="Consolas" w:hAnsi="Consolas"/>
@@ -1192,7 +1192,7 @@
               <w:spacing w:before="30"/>
               <w:jc w:val="right"/>
             </w:pPr>
-            <w:hyperlink w:history="1" r:id="rId4hbgk8vujwgwuv1n1pxd3">
+            <w:hyperlink w:history="1" r:id="rIdo-4x0ilwiuyt-fphdijiu">
               <w:r>
                 <w:rPr>
                   <w:rFonts w:ascii="Consolas" w:cs="Consolas" w:eastAsia="Consolas" w:hAnsi="Consolas"/>
@@ -1432,7 +1432,7 @@
                 <w:sz w:val="15"/>
                 <w:szCs w:val="15"/>
               </w:rPr>
-              <w:t xml:space="preserve">2026 – Oct 2026</w:t>
+              <w:t xml:space="preserve">Jul 2026 – Nov 2026</w:t>
             </w:r>
           </w:p>
         </w:tc>

</xml_diff>

<commit_message>
CV and site: remove the course weighted average
Co-Authored-By: Claude Opus 5.5 <noreply@anthropic.com>
Claude-Session: https://claude.ai/code/session_011X2nibp2ZJGG1sr585TrFg
</commit_message>
<xml_diff>
--- a/Waranyu-Bancherdvanich-CV.docx
+++ b/Waranyu-Bancherdvanich-CV.docx
@@ -102,7 +102,7 @@
             <w:pPr>
               <w:jc w:val="right"/>
             </w:pPr>
-            <w:hyperlink w:history="1" r:id="rIdbuznl_bjixnwcixfk0g7j">
+            <w:hyperlink w:history="1" r:id="rId8fxfcekcupnswahadxyrt">
               <w:r>
                 <w:rPr>
                   <w:rFonts w:ascii="Calibri" w:cs="Calibri" w:eastAsia="Calibri" w:hAnsi="Calibri"/>
@@ -119,7 +119,7 @@
             <w:pPr>
               <w:jc w:val="right"/>
             </w:pPr>
-            <w:hyperlink w:history="1" r:id="rIdlhhbqx2crfbcx3wu6dsxj">
+            <w:hyperlink w:history="1" r:id="rIdi1hmyjfyde6ymhdmgaqq_">
               <w:r>
                 <w:rPr>
                   <w:rFonts w:ascii="Calibri" w:cs="Calibri" w:eastAsia="Calibri" w:hAnsi="Calibri"/>
@@ -140,7 +140,7 @@
               </w:rPr>
               <w:t xml:space="preserve"> · </w:t>
             </w:r>
-            <w:hyperlink w:history="1" r:id="rIdc_qw43zjpbcom39tictih">
+            <w:hyperlink w:history="1" r:id="rIdl9qbjgwflhrbihctb4szl">
               <w:r>
                 <w:rPr>
                   <w:rFonts w:ascii="Calibri" w:cs="Calibri" w:eastAsia="Calibri" w:hAnsi="Calibri"/>
@@ -157,7 +157,7 @@
             <w:pPr>
               <w:jc w:val="right"/>
             </w:pPr>
-            <w:hyperlink w:history="1" r:id="rIdslzeedf1zqujxyf3nm9nf">
+            <w:hyperlink w:history="1" r:id="rIdwsbtfa-b-povnpdg_bu7r">
               <w:r>
                 <w:rPr>
                   <w:rFonts w:ascii="Calibri" w:cs="Calibri" w:eastAsia="Calibri" w:hAnsi="Calibri"/>
@@ -219,7 +219,7 @@
           <w:sz w:val="19"/>
           <w:szCs w:val="19"/>
         </w:rPr>
-        <w:t xml:space="preserve">Master of Information Systems and Technology student at Curtin University (CWA 83.57), specialising in data analytics and visualisation, with a bachelor’s degree in statistics and finance. I build Power BI dashboards on data I have audited and modelled myself, and I forecast in R so the method can be checked. Most recently I led the financial analysis for a Curtin Consulting Group engagement with Hockey WA. Four portfolio projects run on their real data at waranyu-cv.vercel.app. Seeking a data analyst internship in Perth, and graduate roles from July 2027.</w:t>
+        <w:t xml:space="preserve">Master of Information Systems and Technology student at Curtin University, specialising in data analytics and visualisation, with a bachelor’s degree in statistics and finance. I build Power BI dashboards on data I have audited and modelled myself, and I forecast in R so the method can be checked. Most recently I led the financial analysis for a Curtin Consulting Group engagement with Hockey WA. Four portfolio projects run on their real data at waranyu-cv.vercel.app. Seeking a data analyst internship in Perth, and graduate roles from July 2027.</w:t>
       </w:r>
     </w:p>
     <w:p>
@@ -300,7 +300,7 @@
                 <w:sz w:val="19"/>
                 <w:szCs w:val="19"/>
               </w:rPr>
-              <w:t xml:space="preserve">Curtin University, Western Australia · Specialisation: Data Analytics and Visualisation · CWA: 83.57</w:t>
+              <w:t xml:space="preserve">Curtin University, Western Australia · Specialisation: Data Analytics and Visualisation</w:t>
             </w:r>
           </w:p>
         </w:tc>
@@ -828,7 +828,7 @@
               <w:spacing w:before="30"/>
               <w:jc w:val="right"/>
             </w:pPr>
-            <w:hyperlink w:history="1" r:id="rIdd6uabsluticgo7-udqpyc">
+            <w:hyperlink w:history="1" r:id="rIdhpnswuivcsmaby8ffd9st">
               <w:r>
                 <w:rPr>
                   <w:rFonts w:ascii="Consolas" w:cs="Consolas" w:eastAsia="Consolas" w:hAnsi="Consolas"/>
@@ -1010,7 +1010,7 @@
               <w:spacing w:before="30"/>
               <w:jc w:val="right"/>
             </w:pPr>
-            <w:hyperlink w:history="1" r:id="rIdobwisj_cz40zvasacb1mf">
+            <w:hyperlink w:history="1" r:id="rIdafepubftyr8pc1nc_egcs">
               <w:r>
                 <w:rPr>
                   <w:rFonts w:ascii="Consolas" w:cs="Consolas" w:eastAsia="Consolas" w:hAnsi="Consolas"/>
@@ -1192,7 +1192,7 @@
               <w:spacing w:before="30"/>
               <w:jc w:val="right"/>
             </w:pPr>
-            <w:hyperlink w:history="1" r:id="rIdo-4x0ilwiuyt-fphdijiu">
+            <w:hyperlink w:history="1" r:id="rIdkwl7f0tdv2ycewxhstumw">
               <w:r>
                 <w:rPr>
                   <w:rFonts w:ascii="Consolas" w:cs="Consolas" w:eastAsia="Consolas" w:hAnsi="Consolas"/>

</xml_diff>

<commit_message>
CV: single-column layout throughout, still two pages
Co-Authored-By: Claude Opus 5.5 <noreply@anthropic.com>
Claude-Session: https://claude.ai/code/session_011X2nibp2ZJGG1sr585TrFg
</commit_message>
<xml_diff>
--- a/Waranyu-Bancherdvanich-CV.docx
+++ b/Waranyu-Bancherdvanich-CV.docx
@@ -102,7 +102,7 @@
             <w:pPr>
               <w:jc w:val="right"/>
             </w:pPr>
-            <w:hyperlink w:history="1" r:id="rId8fxfcekcupnswahadxyrt">
+            <w:hyperlink w:history="1" r:id="rId1rvzsfzlbc_9tuemifenq">
               <w:r>
                 <w:rPr>
                   <w:rFonts w:ascii="Calibri" w:cs="Calibri" w:eastAsia="Calibri" w:hAnsi="Calibri"/>
@@ -119,7 +119,7 @@
             <w:pPr>
               <w:jc w:val="right"/>
             </w:pPr>
-            <w:hyperlink w:history="1" r:id="rIdi1hmyjfyde6ymhdmgaqq_">
+            <w:hyperlink w:history="1" r:id="rIdob2mgpnrcwqxpjied3pde">
               <w:r>
                 <w:rPr>
                   <w:rFonts w:ascii="Calibri" w:cs="Calibri" w:eastAsia="Calibri" w:hAnsi="Calibri"/>
@@ -140,7 +140,7 @@
               </w:rPr>
               <w:t xml:space="preserve"> · </w:t>
             </w:r>
-            <w:hyperlink w:history="1" r:id="rIdl9qbjgwflhrbihctb4szl">
+            <w:hyperlink w:history="1" r:id="rIdcjjupdybn9daypke6e7pg">
               <w:r>
                 <w:rPr>
                   <w:rFonts w:ascii="Calibri" w:cs="Calibri" w:eastAsia="Calibri" w:hAnsi="Calibri"/>
@@ -157,7 +157,7 @@
             <w:pPr>
               <w:jc w:val="right"/>
             </w:pPr>
-            <w:hyperlink w:history="1" r:id="rIdwsbtfa-b-povnpdg_bu7r">
+            <w:hyperlink w:history="1" r:id="rIdk9lngyl_ndt0atrrhdqd6">
               <w:r>
                 <w:rPr>
                   <w:rFonts w:ascii="Calibri" w:cs="Calibri" w:eastAsia="Calibri" w:hAnsi="Calibri"/>
@@ -459,215 +459,126 @@
         <w:t xml:space="preserve">KEY SKILLS</w:t>
       </w:r>
     </w:p>
-    <w:tbl>
-      <w:tblPr>
-        <w:tblW w:type="dxa" w:w="10206"/>
-        <w:tblBorders>
-          <w:top w:val="single" w:color="auto" w:sz="4"/>
-          <w:left w:val="single" w:color="auto" w:sz="4"/>
-          <w:bottom w:val="single" w:color="auto" w:sz="4"/>
-          <w:right w:val="single" w:color="auto" w:sz="4"/>
-          <w:insideH w:val="single" w:color="auto" w:sz="4"/>
-          <w:insideV w:val="single" w:color="auto" w:sz="4"/>
-        </w:tblBorders>
-      </w:tblPr>
-      <w:tblGrid>
-        <w:gridCol w:w="5103"/>
-        <w:gridCol w:w="5103"/>
-      </w:tblGrid>
-      <w:tr>
-        <w:tc>
-          <w:tcPr>
-            <w:tcW w:type="dxa" w:w="5103"/>
-            <w:tcBorders>
-              <w:top w:val="none" w:color="FFFFFF" w:sz="0"/>
-              <w:left w:val="none" w:color="FFFFFF" w:sz="0"/>
-              <w:bottom w:val="none" w:color="FFFFFF" w:sz="0"/>
-              <w:right w:val="none" w:color="FFFFFF" w:sz="0"/>
-            </w:tcBorders>
-            <w:tcMar>
-              <w:top w:type="dxa" w:w="0"/>
-              <w:left w:type="dxa" w:w="0"/>
-              <w:bottom w:type="dxa" w:w="0"/>
-              <w:right w:type="dxa" w:w="220"/>
-            </w:tcMar>
-          </w:tcPr>
-          <w:p>
-            <w:pPr>
-              <w:spacing w:after="0"/>
-            </w:pPr>
-            <w:r>
-              <w:rPr>
-                <w:rFonts w:ascii="Calibri" w:cs="Calibri" w:eastAsia="Calibri" w:hAnsi="Calibri"/>
-                <w:b/>
-                <w:bCs/>
-                <w:color w:val="1C1B18"/>
-                <w:sz w:val="19"/>
-                <w:szCs w:val="19"/>
-              </w:rPr>
-              <w:t xml:space="preserve">Data Analysis and Visualisation</w:t>
-            </w:r>
-          </w:p>
-          <w:p>
-            <w:pPr>
-              <w:spacing w:after="100"/>
-            </w:pPr>
-            <w:r>
-              <w:rPr>
-                <w:rFonts w:ascii="Calibri" w:cs="Calibri" w:eastAsia="Calibri" w:hAnsi="Calibri"/>
-                <w:color w:val="1C1B18"/>
-                <w:sz w:val="19"/>
-                <w:szCs w:val="19"/>
-              </w:rPr>
-              <w:t xml:space="preserve">Skilled in using Power BI, Tableau, Excel, Python, and R to clean, analyse, and present data insights through dashboards and reports.</w:t>
-            </w:r>
-          </w:p>
-        </w:tc>
-        <w:tc>
-          <w:tcPr>
-            <w:tcW w:type="dxa" w:w="5103"/>
-            <w:tcBorders>
-              <w:top w:val="none" w:color="FFFFFF" w:sz="0"/>
-              <w:left w:val="none" w:color="FFFFFF" w:sz="0"/>
-              <w:bottom w:val="none" w:color="FFFFFF" w:sz="0"/>
-              <w:right w:val="none" w:color="FFFFFF" w:sz="0"/>
-            </w:tcBorders>
-            <w:tcMar>
-              <w:top w:type="dxa" w:w="0"/>
-              <w:left w:type="dxa" w:w="0"/>
-              <w:bottom w:type="dxa" w:w="0"/>
-              <w:right w:type="dxa" w:w="220"/>
-            </w:tcMar>
-          </w:tcPr>
-          <w:p>
-            <w:pPr>
-              <w:spacing w:after="0"/>
-            </w:pPr>
-            <w:r>
-              <w:rPr>
-                <w:rFonts w:ascii="Calibri" w:cs="Calibri" w:eastAsia="Calibri" w:hAnsi="Calibri"/>
-                <w:b/>
-                <w:bCs/>
-                <w:color w:val="1C1B18"/>
-                <w:sz w:val="19"/>
-                <w:szCs w:val="19"/>
-              </w:rPr>
-              <w:t xml:space="preserve">Data Modelling and Database Design</w:t>
-            </w:r>
-          </w:p>
-          <w:p>
-            <w:pPr>
-              <w:spacing w:after="100"/>
-            </w:pPr>
-            <w:r>
-              <w:rPr>
-                <w:rFonts w:ascii="Calibri" w:cs="Calibri" w:eastAsia="Calibri" w:hAnsi="Calibri"/>
-                <w:color w:val="1C1B18"/>
-                <w:sz w:val="19"/>
-                <w:szCs w:val="19"/>
-              </w:rPr>
-              <w:t xml:space="preserve">Knowledge of SQL, ERD design, dimensional modelling, star schema design, and database structure.</w:t>
-            </w:r>
-          </w:p>
-        </w:tc>
-      </w:tr>
-      <w:tr>
-        <w:tc>
-          <w:tcPr>
-            <w:tcW w:type="dxa" w:w="5103"/>
-            <w:tcBorders>
-              <w:top w:val="none" w:color="FFFFFF" w:sz="0"/>
-              <w:left w:val="none" w:color="FFFFFF" w:sz="0"/>
-              <w:bottom w:val="none" w:color="FFFFFF" w:sz="0"/>
-              <w:right w:val="none" w:color="FFFFFF" w:sz="0"/>
-            </w:tcBorders>
-            <w:tcMar>
-              <w:top w:type="dxa" w:w="0"/>
-              <w:left w:type="dxa" w:w="0"/>
-              <w:bottom w:type="dxa" w:w="0"/>
-              <w:right w:type="dxa" w:w="220"/>
-            </w:tcMar>
-          </w:tcPr>
-          <w:p>
-            <w:pPr>
-              <w:spacing w:after="0"/>
-            </w:pPr>
-            <w:r>
-              <w:rPr>
-                <w:rFonts w:ascii="Calibri" w:cs="Calibri" w:eastAsia="Calibri" w:hAnsi="Calibri"/>
-                <w:b/>
-                <w:bCs/>
-                <w:color w:val="1C1B18"/>
-                <w:sz w:val="19"/>
-                <w:szCs w:val="19"/>
-              </w:rPr>
-              <w:t xml:space="preserve">Forecasting and Financial Modelling</w:t>
-            </w:r>
-          </w:p>
-          <w:p>
-            <w:pPr>
-              <w:spacing w:after="100"/>
-            </w:pPr>
-            <w:r>
-              <w:rPr>
-                <w:rFonts w:ascii="Calibri" w:cs="Calibri" w:eastAsia="Calibri" w:hAnsi="Calibri"/>
-                <w:color w:val="1C1B18"/>
-                <w:sz w:val="19"/>
-                <w:szCs w:val="19"/>
-              </w:rPr>
-              <w:t xml:space="preserve">Experienced in linear regression, time-series analysis, forecasting and prediction intervals in R, and in break-even, scenario and sensitivity modelling in Excel.</w:t>
-            </w:r>
-          </w:p>
-        </w:tc>
-        <w:tc>
-          <w:tcPr>
-            <w:tcW w:type="dxa" w:w="5103"/>
-            <w:tcBorders>
-              <w:top w:val="none" w:color="FFFFFF" w:sz="0"/>
-              <w:left w:val="none" w:color="FFFFFF" w:sz="0"/>
-              <w:bottom w:val="none" w:color="FFFFFF" w:sz="0"/>
-              <w:right w:val="none" w:color="FFFFFF" w:sz="0"/>
-            </w:tcBorders>
-            <w:tcMar>
-              <w:top w:type="dxa" w:w="0"/>
-              <w:left w:type="dxa" w:w="0"/>
-              <w:bottom w:type="dxa" w:w="0"/>
-              <w:right w:type="dxa" w:w="220"/>
-            </w:tcMar>
-          </w:tcPr>
-          <w:p>
-            <w:pPr>
-              <w:spacing w:after="0"/>
-            </w:pPr>
-            <w:r>
-              <w:rPr>
-                <w:rFonts w:ascii="Calibri" w:cs="Calibri" w:eastAsia="Calibri" w:hAnsi="Calibri"/>
-                <w:b/>
-                <w:bCs/>
-                <w:color w:val="1C1B18"/>
-                <w:sz w:val="19"/>
-                <w:szCs w:val="19"/>
-              </w:rPr>
-              <w:t xml:space="preserve">Communication and Data Storytelling</w:t>
-            </w:r>
-          </w:p>
-          <w:p>
-            <w:pPr>
-              <w:spacing w:after="100"/>
-            </w:pPr>
-            <w:r>
-              <w:rPr>
-                <w:rFonts w:ascii="Calibri" w:cs="Calibri" w:eastAsia="Calibri" w:hAnsi="Calibri"/>
-                <w:color w:val="1C1B18"/>
-                <w:sz w:val="19"/>
-                <w:szCs w:val="19"/>
-              </w:rPr>
-              <w:t xml:space="preserve">Able to explain data findings clearly through dashboards, reports, and presentations.</w:t>
-            </w:r>
-          </w:p>
-        </w:tc>
-      </w:tr>
-    </w:tbl>
+    <w:p>
+      <w:pPr>
+        <w:spacing w:after="0"/>
+      </w:pPr>
+      <w:r>
+        <w:rPr>
+          <w:rFonts w:ascii="Calibri" w:cs="Calibri" w:eastAsia="Calibri" w:hAnsi="Calibri"/>
+          <w:b/>
+          <w:bCs/>
+          <w:color w:val="1C1B18"/>
+          <w:sz w:val="19"/>
+          <w:szCs w:val="19"/>
+        </w:rPr>
+        <w:t xml:space="preserve">Data Analysis and Visualisation</w:t>
+      </w:r>
+    </w:p>
+    <w:p>
+      <w:pPr>
+        <w:spacing w:after="90"/>
+      </w:pPr>
+      <w:r>
+        <w:rPr>
+          <w:rFonts w:ascii="Calibri" w:cs="Calibri" w:eastAsia="Calibri" w:hAnsi="Calibri"/>
+          <w:color w:val="1C1B18"/>
+          <w:sz w:val="19"/>
+          <w:szCs w:val="19"/>
+        </w:rPr>
+        <w:t xml:space="preserve">Skilled in using Power BI, Tableau, Excel, Python, and R to clean, analyse, and present data insights through dashboards and reports.</w:t>
+      </w:r>
+    </w:p>
+    <w:p>
+      <w:pPr>
+        <w:spacing w:after="0"/>
+      </w:pPr>
+      <w:r>
+        <w:rPr>
+          <w:rFonts w:ascii="Calibri" w:cs="Calibri" w:eastAsia="Calibri" w:hAnsi="Calibri"/>
+          <w:b/>
+          <w:bCs/>
+          <w:color w:val="1C1B18"/>
+          <w:sz w:val="19"/>
+          <w:szCs w:val="19"/>
+        </w:rPr>
+        <w:t xml:space="preserve">Data Modelling and Database Design</w:t>
+      </w:r>
+    </w:p>
+    <w:p>
+      <w:pPr>
+        <w:spacing w:after="90"/>
+      </w:pPr>
+      <w:r>
+        <w:rPr>
+          <w:rFonts w:ascii="Calibri" w:cs="Calibri" w:eastAsia="Calibri" w:hAnsi="Calibri"/>
+          <w:color w:val="1C1B18"/>
+          <w:sz w:val="19"/>
+          <w:szCs w:val="19"/>
+        </w:rPr>
+        <w:t xml:space="preserve">Knowledge of SQL, ERD design, dimensional modelling, star schema design, and database structure.</w:t>
+      </w:r>
+    </w:p>
+    <w:p>
+      <w:pPr>
+        <w:spacing w:after="0"/>
+      </w:pPr>
+      <w:r>
+        <w:rPr>
+          <w:rFonts w:ascii="Calibri" w:cs="Calibri" w:eastAsia="Calibri" w:hAnsi="Calibri"/>
+          <w:b/>
+          <w:bCs/>
+          <w:color w:val="1C1B18"/>
+          <w:sz w:val="19"/>
+          <w:szCs w:val="19"/>
+        </w:rPr>
+        <w:t xml:space="preserve">Forecasting and Financial Modelling</w:t>
+      </w:r>
+    </w:p>
+    <w:p>
+      <w:pPr>
+        <w:spacing w:after="90"/>
+      </w:pPr>
+      <w:r>
+        <w:rPr>
+          <w:rFonts w:ascii="Calibri" w:cs="Calibri" w:eastAsia="Calibri" w:hAnsi="Calibri"/>
+          <w:color w:val="1C1B18"/>
+          <w:sz w:val="19"/>
+          <w:szCs w:val="19"/>
+        </w:rPr>
+        <w:t xml:space="preserve">Experienced in linear regression, time-series analysis, forecasting and prediction intervals in R, and in break-even, scenario and sensitivity modelling in Excel.</w:t>
+      </w:r>
+    </w:p>
+    <w:p>
+      <w:pPr>
+        <w:spacing w:after="0"/>
+      </w:pPr>
+      <w:r>
+        <w:rPr>
+          <w:rFonts w:ascii="Calibri" w:cs="Calibri" w:eastAsia="Calibri" w:hAnsi="Calibri"/>
+          <w:b/>
+          <w:bCs/>
+          <w:color w:val="1C1B18"/>
+          <w:sz w:val="19"/>
+          <w:szCs w:val="19"/>
+        </w:rPr>
+        <w:t xml:space="preserve">Communication and Data Storytelling</w:t>
+      </w:r>
+    </w:p>
+    <w:p>
+      <w:pPr>
+        <w:spacing w:after="90"/>
+      </w:pPr>
+      <w:r>
+        <w:rPr>
+          <w:rFonts w:ascii="Calibri" w:cs="Calibri" w:eastAsia="Calibri" w:hAnsi="Calibri"/>
+          <w:color w:val="1C1B18"/>
+          <w:sz w:val="19"/>
+          <w:szCs w:val="19"/>
+        </w:rPr>
+        <w:t xml:space="preserve">Able to explain data findings clearly through dashboards, reports, and presentations.</w:t>
+      </w:r>
+    </w:p>
     <w:p>
       <w:pPr>
         <w:pBdr>
@@ -828,7 +739,7 @@
               <w:spacing w:before="30"/>
               <w:jc w:val="right"/>
             </w:pPr>
-            <w:hyperlink w:history="1" r:id="rIdhpnswuivcsmaby8ffd9st">
+            <w:hyperlink w:history="1" r:id="rIdpc6qpdyq_eqgkuq-jbhho">
               <w:r>
                 <w:rPr>
                   <w:rFonts w:ascii="Consolas" w:cs="Consolas" w:eastAsia="Consolas" w:hAnsi="Consolas"/>
@@ -1010,7 +921,7 @@
               <w:spacing w:before="30"/>
               <w:jc w:val="right"/>
             </w:pPr>
-            <w:hyperlink w:history="1" r:id="rIdafepubftyr8pc1nc_egcs">
+            <w:hyperlink w:history="1" r:id="rIdiwlsth395npgbaaypatvx">
               <w:r>
                 <w:rPr>
                   <w:rFonts w:ascii="Consolas" w:cs="Consolas" w:eastAsia="Consolas" w:hAnsi="Consolas"/>
@@ -1192,7 +1103,7 @@
               <w:spacing w:before="30"/>
               <w:jc w:val="right"/>
             </w:pPr>
-            <w:hyperlink w:history="1" r:id="rIdkwl7f0tdv2ycewxhstumw">
+            <w:hyperlink w:history="1" r:id="rIddhwgqbjbnkjadcgaxmeyl">
               <w:r>
                 <w:rPr>
                   <w:rFonts w:ascii="Consolas" w:cs="Consolas" w:eastAsia="Consolas" w:hAnsi="Consolas"/>
@@ -1965,59 +1876,16 @@
           </w:p>
           <w:p>
             <w:pPr>
-              <w:pStyle w:val="ListParagraph"/>
-              <w:numPr>
-                <w:ilvl w:val="0"/>
-                <w:numId w:val="2"/>
-              </w:numPr>
-              <w:spacing w:after="30"/>
-            </w:pPr>
-            <w:r>
-              <w:rPr>
-                <w:rFonts w:ascii="Calibri" w:cs="Calibri" w:eastAsia="Calibri" w:hAnsi="Calibri"/>
-                <w:color w:val="1C1B18"/>
-                <w:sz w:val="19"/>
-                <w:szCs w:val="19"/>
-              </w:rPr>
-              <w:t xml:space="preserve">Foundations: Data, Data, Everywhere</w:t>
-            </w:r>
-          </w:p>
-          <w:p>
-            <w:pPr>
-              <w:pStyle w:val="ListParagraph"/>
-              <w:numPr>
-                <w:ilvl w:val="0"/>
-                <w:numId w:val="2"/>
-              </w:numPr>
-              <w:spacing w:after="30"/>
-            </w:pPr>
-            <w:r>
-              <w:rPr>
-                <w:rFonts w:ascii="Calibri" w:cs="Calibri" w:eastAsia="Calibri" w:hAnsi="Calibri"/>
-                <w:color w:val="1C1B18"/>
-                <w:sz w:val="19"/>
-                <w:szCs w:val="19"/>
-              </w:rPr>
-              <w:t xml:space="preserve">Ask Questions to Make Data-Driven Decisions</w:t>
-            </w:r>
-          </w:p>
-          <w:p>
-            <w:pPr>
-              <w:pStyle w:val="ListParagraph"/>
-              <w:numPr>
-                <w:ilvl w:val="0"/>
-                <w:numId w:val="2"/>
-              </w:numPr>
-              <w:spacing w:after="30"/>
-            </w:pPr>
-            <w:r>
-              <w:rPr>
-                <w:rFonts w:ascii="Calibri" w:cs="Calibri" w:eastAsia="Calibri" w:hAnsi="Calibri"/>
-                <w:color w:val="1C1B18"/>
-                <w:sz w:val="19"/>
-                <w:szCs w:val="19"/>
-              </w:rPr>
-              <w:t xml:space="preserve">Prepare Data for Exploration</w:t>
+              <w:spacing w:after="60"/>
+            </w:pPr>
+            <w:r>
+              <w:rPr>
+                <w:rFonts w:ascii="Calibri" w:cs="Calibri" w:eastAsia="Calibri" w:hAnsi="Calibri"/>
+                <w:color w:val="1C1B18"/>
+                <w:sz w:val="19"/>
+                <w:szCs w:val="19"/>
+              </w:rPr>
+              <w:t xml:space="preserve">Foundations: Data, Data, Everywhere · Ask Questions to Make Data-Driven Decisions · Prepare Data for Exploration</w:t>
             </w:r>
           </w:p>
         </w:tc>

</xml_diff>

<commit_message>
CV: remove the Achievements section
Co-Authored-By: Claude Opus 5.5 <noreply@anthropic.com>
Claude-Session: https://claude.ai/code/session_011X2nibp2ZJGG1sr585TrFg
</commit_message>
<xml_diff>
--- a/Waranyu-Bancherdvanich-CV.docx
+++ b/Waranyu-Bancherdvanich-CV.docx
@@ -102,7 +102,7 @@
             <w:pPr>
               <w:jc w:val="right"/>
             </w:pPr>
-            <w:hyperlink w:history="1" r:id="rId1rvzsfzlbc_9tuemifenq">
+            <w:hyperlink w:history="1" r:id="rId6z7lrahpkrrnfr3qxtiif">
               <w:r>
                 <w:rPr>
                   <w:rFonts w:ascii="Calibri" w:cs="Calibri" w:eastAsia="Calibri" w:hAnsi="Calibri"/>
@@ -119,7 +119,7 @@
             <w:pPr>
               <w:jc w:val="right"/>
             </w:pPr>
-            <w:hyperlink w:history="1" r:id="rIdob2mgpnrcwqxpjied3pde">
+            <w:hyperlink w:history="1" r:id="rIdyob710q7lgri3s5n78iol">
               <w:r>
                 <w:rPr>
                   <w:rFonts w:ascii="Calibri" w:cs="Calibri" w:eastAsia="Calibri" w:hAnsi="Calibri"/>
@@ -140,7 +140,7 @@
               </w:rPr>
               <w:t xml:space="preserve"> · </w:t>
             </w:r>
-            <w:hyperlink w:history="1" r:id="rIdcjjupdybn9daypke6e7pg">
+            <w:hyperlink w:history="1" r:id="rId_nyxp5mqo-24qfpriyxb9">
               <w:r>
                 <w:rPr>
                   <w:rFonts w:ascii="Calibri" w:cs="Calibri" w:eastAsia="Calibri" w:hAnsi="Calibri"/>
@@ -157,7 +157,7 @@
             <w:pPr>
               <w:jc w:val="right"/>
             </w:pPr>
-            <w:hyperlink w:history="1" r:id="rIdk9lngyl_ndt0atrrhdqd6">
+            <w:hyperlink w:history="1" r:id="rIdphndyholcegqcqk6nmark">
               <w:r>
                 <w:rPr>
                   <w:rFonts w:ascii="Calibri" w:cs="Calibri" w:eastAsia="Calibri" w:hAnsi="Calibri"/>
@@ -739,7 +739,7 @@
               <w:spacing w:before="30"/>
               <w:jc w:val="right"/>
             </w:pPr>
-            <w:hyperlink w:history="1" r:id="rIdpc6qpdyq_eqgkuq-jbhho">
+            <w:hyperlink w:history="1" r:id="rIdpayuo7ldoqrpdq2torzd-">
               <w:r>
                 <w:rPr>
                   <w:rFonts w:ascii="Consolas" w:cs="Consolas" w:eastAsia="Consolas" w:hAnsi="Consolas"/>
@@ -921,7 +921,7 @@
               <w:spacing w:before="30"/>
               <w:jc w:val="right"/>
             </w:pPr>
-            <w:hyperlink w:history="1" r:id="rIdiwlsth395npgbaaypatvx">
+            <w:hyperlink w:history="1" r:id="rIdp-tdvkfdjpsntm_uvexg2">
               <w:r>
                 <w:rPr>
                   <w:rFonts w:ascii="Consolas" w:cs="Consolas" w:eastAsia="Consolas" w:hAnsi="Consolas"/>
@@ -1103,7 +1103,7 @@
               <w:spacing w:before="30"/>
               <w:jc w:val="right"/>
             </w:pPr>
-            <w:hyperlink w:history="1" r:id="rIddhwgqbjbnkjadcgaxmeyl">
+            <w:hyperlink w:history="1" r:id="rIdlnaauatexzkxlozthutpq">
               <w:r>
                 <w:rPr>
                   <w:rFonts w:ascii="Consolas" w:cs="Consolas" w:eastAsia="Consolas" w:hAnsi="Consolas"/>
@@ -1658,136 +1658,6 @@
                 <w:szCs w:val="15"/>
               </w:rPr>
               <w:t xml:space="preserve">Nov 2023 – Present</w:t>
-            </w:r>
-          </w:p>
-        </w:tc>
-      </w:tr>
-    </w:tbl>
-    <w:p>
-      <w:pPr>
-        <w:pBdr>
-          <w:bottom w:val="single" w:color="D8D2C4" w:sz="4" w:space="2"/>
-        </w:pBdr>
-        <w:spacing w:after="90" w:before="260"/>
-      </w:pPr>
-      <w:r>
-        <w:rPr>
-          <w:rFonts w:ascii="Consolas" w:cs="Consolas" w:eastAsia="Consolas" w:hAnsi="Consolas"/>
-          <w:color w:val="0F6B45"/>
-          <w:spacing w:val="40"/>
-          <w:sz w:val="15"/>
-          <w:szCs w:val="15"/>
-        </w:rPr>
-        <w:t xml:space="preserve">ACHIEVEMENTS</w:t>
-      </w:r>
-    </w:p>
-    <w:tbl>
-      <w:tblPr>
-        <w:tblW w:type="dxa" w:w="10206"/>
-        <w:tblBorders>
-          <w:top w:val="single" w:color="auto" w:sz="4"/>
-          <w:left w:val="single" w:color="auto" w:sz="4"/>
-          <w:bottom w:val="single" w:color="auto" w:sz="4"/>
-          <w:right w:val="single" w:color="auto" w:sz="4"/>
-          <w:insideH w:val="single" w:color="auto" w:sz="4"/>
-          <w:insideV w:val="single" w:color="auto" w:sz="4"/>
-        </w:tblBorders>
-      </w:tblPr>
-      <w:tblGrid>
-        <w:gridCol w:w="9006"/>
-        <w:gridCol w:w="1200"/>
-      </w:tblGrid>
-      <w:tr>
-        <w:tc>
-          <w:tcPr>
-            <w:tcW w:type="dxa" w:w="9006"/>
-            <w:tcBorders>
-              <w:top w:val="none" w:color="FFFFFF" w:sz="0"/>
-              <w:left w:val="none" w:color="FFFFFF" w:sz="0"/>
-              <w:bottom w:val="none" w:color="FFFFFF" w:sz="0"/>
-              <w:right w:val="none" w:color="FFFFFF" w:sz="0"/>
-            </w:tcBorders>
-            <w:tcMar>
-              <w:top w:type="dxa" w:w="0"/>
-              <w:left w:type="dxa" w:w="0"/>
-              <w:bottom w:type="dxa" w:w="0"/>
-              <w:right w:type="dxa" w:w="0"/>
-            </w:tcMar>
-          </w:tcPr>
-          <w:p>
-            <w:pPr>
-              <w:spacing w:after="0"/>
-            </w:pPr>
-            <w:r>
-              <w:rPr>
-                <w:rFonts w:ascii="Georgia" w:cs="Georgia" w:eastAsia="Georgia" w:hAnsi="Georgia"/>
-                <w:b/>
-                <w:bCs/>
-                <w:color w:val="1C1B18"/>
-                <w:sz w:val="21"/>
-                <w:szCs w:val="21"/>
-              </w:rPr>
-              <w:t xml:space="preserve">Best Business Case Pitch — “Branding is All About Counting”</w:t>
-            </w:r>
-          </w:p>
-          <w:p>
-            <w:pPr>
-              <w:spacing w:after="40"/>
-            </w:pPr>
-            <w:r>
-              <w:rPr>
-                <w:rFonts w:ascii="Calibri" w:cs="Calibri" w:eastAsia="Calibri" w:hAnsi="Calibri"/>
-                <w:color w:val="5D5A52"/>
-                <w:sz w:val="19"/>
-                <w:szCs w:val="19"/>
-              </w:rPr>
-              <w:t xml:space="preserve">NSO Data Camp, Thailand</w:t>
-            </w:r>
-          </w:p>
-          <w:p>
-            <w:pPr>
-              <w:spacing w:after="60"/>
-            </w:pPr>
-            <w:r>
-              <w:rPr>
-                <w:rFonts w:ascii="Calibri" w:cs="Calibri" w:eastAsia="Calibri" w:hAnsi="Calibri"/>
-                <w:color w:val="1C1B18"/>
-                <w:sz w:val="19"/>
-                <w:szCs w:val="19"/>
-              </w:rPr>
-              <w:t xml:space="preserve">Selected for Best Business Case Pitch after presenting a data-driven business model using tourism statistics, customer segmentation, and branding strategy.</w:t>
-            </w:r>
-          </w:p>
-        </w:tc>
-        <w:tc>
-          <w:tcPr>
-            <w:tcW w:type="dxa" w:w="1200"/>
-            <w:tcBorders>
-              <w:top w:val="none" w:color="FFFFFF" w:sz="0"/>
-              <w:left w:val="none" w:color="FFFFFF" w:sz="0"/>
-              <w:bottom w:val="none" w:color="FFFFFF" w:sz="0"/>
-              <w:right w:val="none" w:color="FFFFFF" w:sz="0"/>
-            </w:tcBorders>
-            <w:tcMar>
-              <w:top w:type="dxa" w:w="0"/>
-              <w:left w:type="dxa" w:w="0"/>
-              <w:bottom w:type="dxa" w:w="0"/>
-              <w:right w:type="dxa" w:w="0"/>
-            </w:tcMar>
-          </w:tcPr>
-          <w:p>
-            <w:pPr>
-              <w:spacing w:before="30"/>
-              <w:jc w:val="right"/>
-            </w:pPr>
-            <w:r>
-              <w:rPr>
-                <w:rFonts w:ascii="Consolas" w:cs="Consolas" w:eastAsia="Consolas" w:hAnsi="Consolas"/>
-                <w:color w:val="5D5A52"/>
-                <w:sz w:val="15"/>
-                <w:szCs w:val="15"/>
-              </w:rPr>
-              <w:t xml:space="preserve">2023</w:t>
             </w:r>
           </w:p>
         </w:tc>

</xml_diff>

<commit_message>
CV: Six Senses Gourmet role title is Supervisor
Co-Authored-By: Claude Opus 5.5 <noreply@anthropic.com>
Claude-Session: https://claude.ai/code/session_011X2nibp2ZJGG1sr585TrFg
</commit_message>
<xml_diff>
--- a/Waranyu-Bancherdvanich-CV.docx
+++ b/Waranyu-Bancherdvanich-CV.docx
@@ -102,7 +102,7 @@
             <w:pPr>
               <w:jc w:val="right"/>
             </w:pPr>
-            <w:hyperlink w:history="1" r:id="rId6z7lrahpkrrnfr3qxtiif">
+            <w:hyperlink w:history="1" r:id="rIdvmw6juvmjuc2yf5rveytg">
               <w:r>
                 <w:rPr>
                   <w:rFonts w:ascii="Calibri" w:cs="Calibri" w:eastAsia="Calibri" w:hAnsi="Calibri"/>
@@ -119,7 +119,7 @@
             <w:pPr>
               <w:jc w:val="right"/>
             </w:pPr>
-            <w:hyperlink w:history="1" r:id="rIdyob710q7lgri3s5n78iol">
+            <w:hyperlink w:history="1" r:id="rIdxs6okhgxkzrylqu1lb_7y">
               <w:r>
                 <w:rPr>
                   <w:rFonts w:ascii="Calibri" w:cs="Calibri" w:eastAsia="Calibri" w:hAnsi="Calibri"/>
@@ -140,7 +140,7 @@
               </w:rPr>
               <w:t xml:space="preserve"> · </w:t>
             </w:r>
-            <w:hyperlink w:history="1" r:id="rId_nyxp5mqo-24qfpriyxb9">
+            <w:hyperlink w:history="1" r:id="rIdp93j-op0lt408gyfey9fp">
               <w:r>
                 <w:rPr>
                   <w:rFonts w:ascii="Calibri" w:cs="Calibri" w:eastAsia="Calibri" w:hAnsi="Calibri"/>
@@ -157,7 +157,7 @@
             <w:pPr>
               <w:jc w:val="right"/>
             </w:pPr>
-            <w:hyperlink w:history="1" r:id="rIdphndyholcegqcqk6nmark">
+            <w:hyperlink w:history="1" r:id="rId5swv_5ci1_dl6y-vqxkxg">
               <w:r>
                 <w:rPr>
                   <w:rFonts w:ascii="Calibri" w:cs="Calibri" w:eastAsia="Calibri" w:hAnsi="Calibri"/>
@@ -739,7 +739,7 @@
               <w:spacing w:before="30"/>
               <w:jc w:val="right"/>
             </w:pPr>
-            <w:hyperlink w:history="1" r:id="rIdpayuo7ldoqrpdq2torzd-">
+            <w:hyperlink w:history="1" r:id="rIdjp--hxaluduxinm5siffk">
               <w:r>
                 <w:rPr>
                   <w:rFonts w:ascii="Consolas" w:cs="Consolas" w:eastAsia="Consolas" w:hAnsi="Consolas"/>
@@ -921,7 +921,7 @@
               <w:spacing w:before="30"/>
               <w:jc w:val="right"/>
             </w:pPr>
-            <w:hyperlink w:history="1" r:id="rIdp-tdvkfdjpsntm_uvexg2">
+            <w:hyperlink w:history="1" r:id="rIdfewsrzlzgboaohqbdkpjl">
               <w:r>
                 <w:rPr>
                   <w:rFonts w:ascii="Consolas" w:cs="Consolas" w:eastAsia="Consolas" w:hAnsi="Consolas"/>
@@ -1103,7 +1103,7 @@
               <w:spacing w:before="30"/>
               <w:jc w:val="right"/>
             </w:pPr>
-            <w:hyperlink w:history="1" r:id="rIdlnaauatexzkxlozthutpq">
+            <w:hyperlink w:history="1" r:id="rIdedocnlwr70dw4fdqgie00">
               <w:r>
                 <w:rPr>
                   <w:rFonts w:ascii="Consolas" w:cs="Consolas" w:eastAsia="Consolas" w:hAnsi="Consolas"/>
@@ -1573,7 +1573,7 @@
                 <w:sz w:val="21"/>
                 <w:szCs w:val="21"/>
               </w:rPr>
-              <w:t xml:space="preserve">Bartender / Wait Staff</w:t>
+              <w:t xml:space="preserve">Supervisor</w:t>
             </w:r>
           </w:p>
           <w:p>

</xml_diff>

<commit_message>
CV and site: Hockey WA entry cut to five one-line bullets
Co-Authored-By: Claude Opus 5.5 <noreply@anthropic.com>
Claude-Session: https://claude.ai/code/session_011X2nibp2ZJGG1sr585TrFg
</commit_message>
<xml_diff>
--- a/Waranyu-Bancherdvanich-CV.docx
+++ b/Waranyu-Bancherdvanich-CV.docx
@@ -102,7 +102,7 @@
             <w:pPr>
               <w:jc w:val="right"/>
             </w:pPr>
-            <w:hyperlink w:history="1" r:id="rIdvmw6juvmjuc2yf5rveytg">
+            <w:hyperlink w:history="1" r:id="rId1r-0yjf82ph6g4q9g8bj-">
               <w:r>
                 <w:rPr>
                   <w:rFonts w:ascii="Calibri" w:cs="Calibri" w:eastAsia="Calibri" w:hAnsi="Calibri"/>
@@ -119,7 +119,7 @@
             <w:pPr>
               <w:jc w:val="right"/>
             </w:pPr>
-            <w:hyperlink w:history="1" r:id="rIdxs6okhgxkzrylqu1lb_7y">
+            <w:hyperlink w:history="1" r:id="rIdgeuk3wvsqh94wb7ixapsr">
               <w:r>
                 <w:rPr>
                   <w:rFonts w:ascii="Calibri" w:cs="Calibri" w:eastAsia="Calibri" w:hAnsi="Calibri"/>
@@ -140,7 +140,7 @@
               </w:rPr>
               <w:t xml:space="preserve"> · </w:t>
             </w:r>
-            <w:hyperlink w:history="1" r:id="rIdp93j-op0lt408gyfey9fp">
+            <w:hyperlink w:history="1" r:id="rId07xnhag69dlajoeegcfuz">
               <w:r>
                 <w:rPr>
                   <w:rFonts w:ascii="Calibri" w:cs="Calibri" w:eastAsia="Calibri" w:hAnsi="Calibri"/>
@@ -157,7 +157,7 @@
             <w:pPr>
               <w:jc w:val="right"/>
             </w:pPr>
-            <w:hyperlink w:history="1" r:id="rId5swv_5ci1_dl6y-vqxkxg">
+            <w:hyperlink w:history="1" r:id="rIdev3j7jwsfnmmud_nc1n-l">
               <w:r>
                 <w:rPr>
                   <w:rFonts w:ascii="Calibri" w:cs="Calibri" w:eastAsia="Calibri" w:hAnsi="Calibri"/>
@@ -739,7 +739,7 @@
               <w:spacing w:before="30"/>
               <w:jc w:val="right"/>
             </w:pPr>
-            <w:hyperlink w:history="1" r:id="rIdjp--hxaluduxinm5siffk">
+            <w:hyperlink w:history="1" r:id="rIddwkn-8qk4orc7h7xmouzi">
               <w:r>
                 <w:rPr>
                   <w:rFonts w:ascii="Consolas" w:cs="Consolas" w:eastAsia="Consolas" w:hAnsi="Consolas"/>
@@ -921,7 +921,7 @@
               <w:spacing w:before="30"/>
               <w:jc w:val="right"/>
             </w:pPr>
-            <w:hyperlink w:history="1" r:id="rIdfewsrzlzgboaohqbdkpjl">
+            <w:hyperlink w:history="1" r:id="rIdvqsqvvm7akpwh70tvpfsv">
               <w:r>
                 <w:rPr>
                   <w:rFonts w:ascii="Consolas" w:cs="Consolas" w:eastAsia="Consolas" w:hAnsi="Consolas"/>
@@ -1103,7 +1103,7 @@
               <w:spacing w:before="30"/>
               <w:jc w:val="right"/>
             </w:pPr>
-            <w:hyperlink w:history="1" r:id="rIdedocnlwr70dw4fdqgie00">
+            <w:hyperlink w:history="1" r:id="rIdfkfoi95cona3_l9vmsfm8">
               <w:r>
                 <w:rPr>
                   <w:rFonts w:ascii="Consolas" w:cs="Consolas" w:eastAsia="Consolas" w:hAnsi="Consolas"/>
@@ -1216,7 +1216,7 @@
                 <w:sz w:val="19"/>
                 <w:szCs w:val="19"/>
               </w:rPr>
-              <w:t xml:space="preserve">Led the financial analysis in a nine-person student consulting team advising Hockey WA, the state’s not-for-profit hockey body, on how to stream and own the broadcast of games at its new six-surface hockey centre in Perth without building its own platform.</w:t>
+              <w:t xml:space="preserve">Led the financial analysis for Hockey WA’s broadcast streaming strategy.</w:t>
             </w:r>
           </w:p>
           <w:p>
@@ -1235,7 +1235,7 @@
                 <w:sz w:val="19"/>
                 <w:szCs w:val="19"/>
               </w:rPr>
-              <w:t xml:space="preserve">Built a 20-year break-even model in Excel with best, base and worst-case scenarios, one-off and running cost tables, revenue estimates, and an appendix tracing every figure to its source.</w:t>
+              <w:t xml:space="preserve">Built a 20-year Excel break-even model with best, base and worst-case scenarios.</w:t>
             </w:r>
           </w:p>
           <w:p>
@@ -1254,7 +1254,7 @@
                 <w:sz w:val="19"/>
                 <w:szCs w:val="19"/>
               </w:rPr>
-              <w:t xml:space="preserve">Ran a sensitivity analysis (each driver ±20%) showing that audience growth outweighs upfront build cost in determining payback, and used it to recommend investing in marketing rather than seeking funding for the build.</w:t>
+              <w:t xml:space="preserve">Ran a ±20% sensitivity analysis: audience growth, not build cost, drives payback.</w:t>
             </w:r>
           </w:p>
           <w:p>
@@ -1273,7 +1273,7 @@
                 <w:sz w:val="19"/>
                 <w:szCs w:val="19"/>
               </w:rPr>
-              <w:t xml:space="preserve">Benchmarked growth and audience-retention assumptions against 15+ public case studies, including Finnish floorball streaming, GAAGO, Solidsport and the NFL’s move to Prime Video, alongside the team’s evaluation of three ownership options and four camera and analysis providers against weighted criteria.</w:t>
+              <w:t xml:space="preserve">Benchmarked against 15+ case studies (GAAGO, Solidsport, NFL on Prime Video).</w:t>
             </w:r>
           </w:p>
           <w:p>
@@ -1292,26 +1292,7 @@
                 <w:sz w:val="19"/>
                 <w:szCs w:val="19"/>
               </w:rPr>
-              <w:t xml:space="preserve">Turned the analysis into board-ready slides and charts, revised after project director feedback, and presented the financial section at the final pitch to the client and an industry panel.</w:t>
-            </w:r>
-          </w:p>
-          <w:p>
-            <w:pPr>
-              <w:pStyle w:val="ListParagraph"/>
-              <w:numPr>
-                <w:ilvl w:val="0"/>
-                <w:numId w:val="2"/>
-              </w:numPr>
-              <w:spacing w:after="30"/>
-            </w:pPr>
-            <w:r>
-              <w:rPr>
-                <w:rFonts w:ascii="Calibri" w:cs="Calibri" w:eastAsia="Calibri" w:hAnsi="Calibri"/>
-                <w:color w:val="1C1B18"/>
-                <w:sz w:val="19"/>
-                <w:szCs w:val="19"/>
-              </w:rPr>
-              <w:t xml:space="preserve">Built an interactive React prototype of the recommended streaming platform (family, coach and admin views) and a 3D render of the venue’s camera layout.</w:t>
+              <w:t xml:space="preserve">Pitched the financial case to the client and an industry panel; built a React prototype.</w:t>
             </w:r>
           </w:p>
         </w:tc>

</xml_diff>

<commit_message>
CV and site: last Hockey WA bullet names the 3D render and web prototype as client deliverables
Co-Authored-By: Claude Opus 5.5 <noreply@anthropic.com>
Claude-Session: https://claude.ai/code/session_011X2nibp2ZJGG1sr585TrFg
</commit_message>
<xml_diff>
--- a/Waranyu-Bancherdvanich-CV.docx
+++ b/Waranyu-Bancherdvanich-CV.docx
@@ -102,7 +102,7 @@
             <w:pPr>
               <w:jc w:val="right"/>
             </w:pPr>
-            <w:hyperlink w:history="1" r:id="rId1r-0yjf82ph6g4q9g8bj-">
+            <w:hyperlink w:history="1" r:id="rIdfus8_j_c1rvwc_uyypf_l">
               <w:r>
                 <w:rPr>
                   <w:rFonts w:ascii="Calibri" w:cs="Calibri" w:eastAsia="Calibri" w:hAnsi="Calibri"/>
@@ -119,7 +119,7 @@
             <w:pPr>
               <w:jc w:val="right"/>
             </w:pPr>
-            <w:hyperlink w:history="1" r:id="rIdgeuk3wvsqh94wb7ixapsr">
+            <w:hyperlink w:history="1" r:id="rIdqzkxlwdp2-r7qzrekha01">
               <w:r>
                 <w:rPr>
                   <w:rFonts w:ascii="Calibri" w:cs="Calibri" w:eastAsia="Calibri" w:hAnsi="Calibri"/>
@@ -140,7 +140,7 @@
               </w:rPr>
               <w:t xml:space="preserve"> · </w:t>
             </w:r>
-            <w:hyperlink w:history="1" r:id="rId07xnhag69dlajoeegcfuz">
+            <w:hyperlink w:history="1" r:id="rId7mldlh3ieuk04mid72shu">
               <w:r>
                 <w:rPr>
                   <w:rFonts w:ascii="Calibri" w:cs="Calibri" w:eastAsia="Calibri" w:hAnsi="Calibri"/>
@@ -157,7 +157,7 @@
             <w:pPr>
               <w:jc w:val="right"/>
             </w:pPr>
-            <w:hyperlink w:history="1" r:id="rIdev3j7jwsfnmmud_nc1n-l">
+            <w:hyperlink w:history="1" r:id="rIdibsd-ghvbukzl1fswvnhu">
               <w:r>
                 <w:rPr>
                   <w:rFonts w:ascii="Calibri" w:cs="Calibri" w:eastAsia="Calibri" w:hAnsi="Calibri"/>
@@ -739,7 +739,7 @@
               <w:spacing w:before="30"/>
               <w:jc w:val="right"/>
             </w:pPr>
-            <w:hyperlink w:history="1" r:id="rIddwkn-8qk4orc7h7xmouzi">
+            <w:hyperlink w:history="1" r:id="rIdjj36djxldr9xptsispnyd">
               <w:r>
                 <w:rPr>
                   <w:rFonts w:ascii="Consolas" w:cs="Consolas" w:eastAsia="Consolas" w:hAnsi="Consolas"/>
@@ -921,7 +921,7 @@
               <w:spacing w:before="30"/>
               <w:jc w:val="right"/>
             </w:pPr>
-            <w:hyperlink w:history="1" r:id="rIdvqsqvvm7akpwh70tvpfsv">
+            <w:hyperlink w:history="1" r:id="rIdvhog-39rykgcgnxv7p7xx">
               <w:r>
                 <w:rPr>
                   <w:rFonts w:ascii="Consolas" w:cs="Consolas" w:eastAsia="Consolas" w:hAnsi="Consolas"/>
@@ -1103,7 +1103,7 @@
               <w:spacing w:before="30"/>
               <w:jc w:val="right"/>
             </w:pPr>
-            <w:hyperlink w:history="1" r:id="rIdfkfoi95cona3_l9vmsfm8">
+            <w:hyperlink w:history="1" r:id="rId-_h9lzifohd9etqndsl97">
               <w:r>
                 <w:rPr>
                   <w:rFonts w:ascii="Consolas" w:cs="Consolas" w:eastAsia="Consolas" w:hAnsi="Consolas"/>
@@ -1292,7 +1292,7 @@
                 <w:sz w:val="19"/>
                 <w:szCs w:val="19"/>
               </w:rPr>
-              <w:t xml:space="preserve">Pitched the financial case to the client and an industry panel; built a React prototype.</w:t>
+              <w:t xml:space="preserve">Built a 3D venue camera render and a streaming web prototype as client deliverables.</w:t>
             </w:r>
           </w:p>
         </w:tc>

</xml_diff>

<commit_message>
CV and site: Hockey WA bullets with the scenario, sensitivity and deliverable figures
Co-Authored-By: Claude Opus 5.5 <noreply@anthropic.com>
Claude-Session: https://claude.ai/code/session_011X2nibp2ZJGG1sr585TrFg
</commit_message>
<xml_diff>
--- a/Waranyu-Bancherdvanich-CV.docx
+++ b/Waranyu-Bancherdvanich-CV.docx
@@ -102,7 +102,7 @@
             <w:pPr>
               <w:jc w:val="right"/>
             </w:pPr>
-            <w:hyperlink w:history="1" r:id="rIdfus8_j_c1rvwc_uyypf_l">
+            <w:hyperlink w:history="1" r:id="rIdwhaov5bkiy9oha4grqw_1">
               <w:r>
                 <w:rPr>
                   <w:rFonts w:ascii="Calibri" w:cs="Calibri" w:eastAsia="Calibri" w:hAnsi="Calibri"/>
@@ -119,7 +119,7 @@
             <w:pPr>
               <w:jc w:val="right"/>
             </w:pPr>
-            <w:hyperlink w:history="1" r:id="rIdqzkxlwdp2-r7qzrekha01">
+            <w:hyperlink w:history="1" r:id="rIdm62lragixf42kdpkhygx8">
               <w:r>
                 <w:rPr>
                   <w:rFonts w:ascii="Calibri" w:cs="Calibri" w:eastAsia="Calibri" w:hAnsi="Calibri"/>
@@ -140,7 +140,7 @@
               </w:rPr>
               <w:t xml:space="preserve"> · </w:t>
             </w:r>
-            <w:hyperlink w:history="1" r:id="rId7mldlh3ieuk04mid72shu">
+            <w:hyperlink w:history="1" r:id="rIdynktswh9gcbg519ur8g2o">
               <w:r>
                 <w:rPr>
                   <w:rFonts w:ascii="Calibri" w:cs="Calibri" w:eastAsia="Calibri" w:hAnsi="Calibri"/>
@@ -157,7 +157,7 @@
             <w:pPr>
               <w:jc w:val="right"/>
             </w:pPr>
-            <w:hyperlink w:history="1" r:id="rIdibsd-ghvbukzl1fswvnhu">
+            <w:hyperlink w:history="1" r:id="rIdqdrf1xphgx88ehl4k5pnm">
               <w:r>
                 <w:rPr>
                   <w:rFonts w:ascii="Calibri" w:cs="Calibri" w:eastAsia="Calibri" w:hAnsi="Calibri"/>
@@ -739,7 +739,7 @@
               <w:spacing w:before="30"/>
               <w:jc w:val="right"/>
             </w:pPr>
-            <w:hyperlink w:history="1" r:id="rIdjj36djxldr9xptsispnyd">
+            <w:hyperlink w:history="1" r:id="rIdclj5ng7xcrzpimm1krbjf">
               <w:r>
                 <w:rPr>
                   <w:rFonts w:ascii="Consolas" w:cs="Consolas" w:eastAsia="Consolas" w:hAnsi="Consolas"/>
@@ -921,7 +921,7 @@
               <w:spacing w:before="30"/>
               <w:jc w:val="right"/>
             </w:pPr>
-            <w:hyperlink w:history="1" r:id="rIdvhog-39rykgcgnxv7p7xx">
+            <w:hyperlink w:history="1" r:id="rIdnuddysxmazvao44ls13hi">
               <w:r>
                 <w:rPr>
                   <w:rFonts w:ascii="Consolas" w:cs="Consolas" w:eastAsia="Consolas" w:hAnsi="Consolas"/>
@@ -1103,7 +1103,7 @@
               <w:spacing w:before="30"/>
               <w:jc w:val="right"/>
             </w:pPr>
-            <w:hyperlink w:history="1" r:id="rId-_h9lzifohd9etqndsl97">
+            <w:hyperlink w:history="1" r:id="rIdms7xchhtfd9epibfkfdzi">
               <w:r>
                 <w:rPr>
                   <w:rFonts w:ascii="Consolas" w:cs="Consolas" w:eastAsia="Consolas" w:hAnsi="Consolas"/>
@@ -1216,7 +1216,7 @@
                 <w:sz w:val="19"/>
                 <w:szCs w:val="19"/>
               </w:rPr>
-              <w:t xml:space="preserve">Led the financial analysis for Hockey WA’s broadcast streaming strategy.</w:t>
+              <w:t xml:space="preserve">Led the financial analysis in a 9-person team developing Hockey WA’s broadcast streaming strategy.</w:t>
             </w:r>
           </w:p>
           <w:p>
@@ -1235,7 +1235,7 @@
                 <w:sz w:val="19"/>
                 <w:szCs w:val="19"/>
               </w:rPr>
-              <w:t xml:space="preserve">Built a 20-year Excel break-even model with best, base and worst-case scenarios.</w:t>
+              <w:t xml:space="preserve">Built a 20-year Excel break-even model across 3 scenarios, giving the board a payback range to decide on, in place of a provider arrangement that returned no revenue.</w:t>
             </w:r>
           </w:p>
           <w:p>
@@ -1254,7 +1254,7 @@
                 <w:sz w:val="19"/>
                 <w:szCs w:val="19"/>
               </w:rPr>
-              <w:t xml:space="preserve">Ran a ±20% sensitivity analysis: audience growth, not build cost, drives payback.</w:t>
+              <w:t xml:space="preserve">Tested 5 drivers at ±20%: audience growth moved payback 7× more than build cost, refocusing the recommendation on marketing over upfront funding.</w:t>
             </w:r>
           </w:p>
           <w:p>
@@ -1273,7 +1273,7 @@
                 <w:sz w:val="19"/>
                 <w:szCs w:val="19"/>
               </w:rPr>
-              <w:t xml:space="preserve">Benchmarked against 15+ case studies (GAAGO, Solidsport, NFL on Prime Video).</w:t>
+              <w:t xml:space="preserve">Benchmarked assumptions against 15+ case studies, so every forecast could be traced to a public source.</w:t>
             </w:r>
           </w:p>
           <w:p>
@@ -1292,7 +1292,7 @@
                 <w:sz w:val="19"/>
                 <w:szCs w:val="19"/>
               </w:rPr>
-              <w:t xml:space="preserve">Built a 3D venue camera render and a streaming web prototype as client deliverables.</w:t>
+              <w:t xml:space="preserve">Created an 18-camera 3D venue render and a 3-view streaming prototype, turning the plan into something the client and panel could see and use.</w:t>
             </w:r>
           </w:p>
         </w:tc>

</xml_diff>

<commit_message>
CV: project links read "See the project"
Co-Authored-By: Claude Opus 5.5 <noreply@anthropic.com>
Claude-Session: https://claude.ai/code/session_011X2nibp2ZJGG1sr585TrFg
</commit_message>
<xml_diff>
--- a/Waranyu-Bancherdvanich-CV.docx
+++ b/Waranyu-Bancherdvanich-CV.docx
@@ -102,7 +102,7 @@
             <w:pPr>
               <w:jc w:val="right"/>
             </w:pPr>
-            <w:hyperlink w:history="1" r:id="rIdwhaov5bkiy9oha4grqw_1">
+            <w:hyperlink w:history="1" r:id="rIdb1su_1bw1jxt_mpuvocx0">
               <w:r>
                 <w:rPr>
                   <w:rFonts w:ascii="Calibri" w:cs="Calibri" w:eastAsia="Calibri" w:hAnsi="Calibri"/>
@@ -119,7 +119,7 @@
             <w:pPr>
               <w:jc w:val="right"/>
             </w:pPr>
-            <w:hyperlink w:history="1" r:id="rIdm62lragixf42kdpkhygx8">
+            <w:hyperlink w:history="1" r:id="rIdlxw8cbgazr1x8sjnt4jsr">
               <w:r>
                 <w:rPr>
                   <w:rFonts w:ascii="Calibri" w:cs="Calibri" w:eastAsia="Calibri" w:hAnsi="Calibri"/>
@@ -140,7 +140,7 @@
               </w:rPr>
               <w:t xml:space="preserve"> · </w:t>
             </w:r>
-            <w:hyperlink w:history="1" r:id="rIdynktswh9gcbg519ur8g2o">
+            <w:hyperlink w:history="1" r:id="rIdqxlgitsdu5c0zeranulgj">
               <w:r>
                 <w:rPr>
                   <w:rFonts w:ascii="Calibri" w:cs="Calibri" w:eastAsia="Calibri" w:hAnsi="Calibri"/>
@@ -157,7 +157,7 @@
             <w:pPr>
               <w:jc w:val="right"/>
             </w:pPr>
-            <w:hyperlink w:history="1" r:id="rIdqdrf1xphgx88ehl4k5pnm">
+            <w:hyperlink w:history="1" r:id="rIdzkbmfrnhcn_ofsj7g7jam">
               <w:r>
                 <w:rPr>
                   <w:rFonts w:ascii="Calibri" w:cs="Calibri" w:eastAsia="Calibri" w:hAnsi="Calibri"/>
@@ -739,7 +739,7 @@
               <w:spacing w:before="30"/>
               <w:jc w:val="right"/>
             </w:pPr>
-            <w:hyperlink w:history="1" r:id="rIdclj5ng7xcrzpimm1krbjf">
+            <w:hyperlink w:history="1" r:id="rId1pzwxwfi0xecv-3qvneqc">
               <w:r>
                 <w:rPr>
                   <w:rFonts w:ascii="Consolas" w:cs="Consolas" w:eastAsia="Consolas" w:hAnsi="Consolas"/>
@@ -748,7 +748,7 @@
                   <w:szCs w:val="15"/>
                   <w:u w:val="single"/>
                 </w:rPr>
-                <w:t xml:space="preserve">Case study ↗</w:t>
+                <w:t xml:space="preserve">See the project ↗</w:t>
               </w:r>
             </w:hyperlink>
           </w:p>
@@ -921,7 +921,7 @@
               <w:spacing w:before="30"/>
               <w:jc w:val="right"/>
             </w:pPr>
-            <w:hyperlink w:history="1" r:id="rIdnuddysxmazvao44ls13hi">
+            <w:hyperlink w:history="1" r:id="rIdowdtfubnk6t2nkpenx71i">
               <w:r>
                 <w:rPr>
                   <w:rFonts w:ascii="Consolas" w:cs="Consolas" w:eastAsia="Consolas" w:hAnsi="Consolas"/>
@@ -930,7 +930,7 @@
                   <w:szCs w:val="15"/>
                   <w:u w:val="single"/>
                 </w:rPr>
-                <w:t xml:space="preserve">Case study ↗</w:t>
+                <w:t xml:space="preserve">See the project ↗</w:t>
               </w:r>
             </w:hyperlink>
           </w:p>
@@ -1103,7 +1103,7 @@
               <w:spacing w:before="30"/>
               <w:jc w:val="right"/>
             </w:pPr>
-            <w:hyperlink w:history="1" r:id="rIdms7xchhtfd9epibfkfdzi">
+            <w:hyperlink w:history="1" r:id="rIdloimsmasx0g9bp5ezrerj">
               <w:r>
                 <w:rPr>
                   <w:rFonts w:ascii="Consolas" w:cs="Consolas" w:eastAsia="Consolas" w:hAnsi="Consolas"/>
@@ -1112,7 +1112,7 @@
                   <w:szCs w:val="15"/>
                   <w:u w:val="single"/>
                 </w:rPr>
-                <w:t xml:space="preserve">Case study ↗</w:t>
+                <w:t xml:space="preserve">See the project ↗</w:t>
               </w:r>
             </w:hyperlink>
           </w:p>

</xml_diff>

<commit_message>
CV: add the MGMT6052 capstone with LocoLabo under Academic Projects
Co-Authored-By: Claude Opus 5.5 <noreply@anthropic.com>
Claude-Session: https://claude.ai/code/session_011X2nibp2ZJGG1sr585TrFg
</commit_message>
<xml_diff>
--- a/Waranyu-Bancherdvanich-CV.docx
+++ b/Waranyu-Bancherdvanich-CV.docx
@@ -22,7 +22,7 @@
       <w:pPr>
         <w:spacing w:after="60"/>
       </w:pPr>
-      <w:hyperlink w:history="1" r:id="rIdspx6u5yyziecsjn3ewozg">
+      <w:hyperlink w:history="1" r:id="rIdkhffht8foj_msla1o8cmh">
         <w:r>
           <w:rPr>
             <w:rFonts w:ascii="Calibri" w:cs="Calibri" w:eastAsia="Calibri" w:hAnsi="Calibri"/>
@@ -42,7 +42,7 @@
         </w:rPr>
         <w:t xml:space="preserve">  |  </w:t>
       </w:r>
-      <w:hyperlink w:history="1" r:id="rId73v-te33zhlfl1rts_l4i">
+      <w:hyperlink w:history="1" r:id="rIdwee7b-hlyhvp9jmys0i-b">
         <w:r>
           <w:rPr>
             <w:rFonts w:ascii="Calibri" w:cs="Calibri" w:eastAsia="Calibri" w:hAnsi="Calibri"/>
@@ -62,7 +62,7 @@
         </w:rPr>
         <w:t xml:space="preserve">  |  </w:t>
       </w:r>
-      <w:hyperlink w:history="1" r:id="rIdmz4e-a2axrmjsb7g1cukv">
+      <w:hyperlink w:history="1" r:id="rIdry0ry2n5onsdvcllgos6n">
         <w:r>
           <w:rPr>
             <w:rFonts w:ascii="Calibri" w:cs="Calibri" w:eastAsia="Calibri" w:hAnsi="Calibri"/>
@@ -82,7 +82,7 @@
         </w:rPr>
         <w:t xml:space="preserve">  |  </w:t>
       </w:r>
-      <w:hyperlink w:history="1" r:id="rIdfnud_o2zvwioxuli8i0en">
+      <w:hyperlink w:history="1" r:id="rIdgpkmdqe_cln2mdzzcsfcr">
         <w:r>
           <w:rPr>
             <w:rFonts w:ascii="Calibri" w:cs="Calibri" w:eastAsia="Calibri" w:hAnsi="Calibri"/>
@@ -798,7 +798,7 @@
           <w:sz w:val="21"/>
           <w:szCs w:val="21"/>
         </w:rPr>
-        <w:t xml:space="preserve">FreshMart Sales Performance Dashboard</w:t>
+        <w:t xml:space="preserve">MGMT6052 Consultancy Project (Capstone) – Quality and Documentation Manager</w:t>
       </w:r>
     </w:p>
     <w:p>
@@ -816,6 +816,145 @@
           <w:sz w:val="21"/>
           <w:szCs w:val="21"/>
         </w:rPr>
+        <w:t xml:space="preserve">Curtin University | Client: LocoLabo, Curtin Business School</w:t>
+      </w:r>
+      <w:r>
+        <w:rPr>
+          <w:rFonts w:ascii="Calibri" w:cs="Calibri" w:eastAsia="Calibri" w:hAnsi="Calibri"/>
+          <w:color w:val="000000"/>
+          <w:sz w:val="21"/>
+          <w:szCs w:val="21"/>
+        </w:rPr>
+        <w:t xml:space="preserve">	August 2026 - October 2026</w:t>
+      </w:r>
+    </w:p>
+    <w:p>
+      <w:pPr>
+        <w:pStyle w:val="ListParagraph"/>
+        <w:numPr>
+          <w:ilvl w:val="0"/>
+          <w:numId w:val="2"/>
+        </w:numPr>
+        <w:spacing w:after="20"/>
+      </w:pPr>
+      <w:r>
+        <w:rPr>
+          <w:rFonts w:ascii="Calibri" w:cs="Calibri" w:eastAsia="Calibri" w:hAnsi="Calibri"/>
+          <w:color w:val="000000"/>
+          <w:sz w:val="21"/>
+          <w:szCs w:val="21"/>
+        </w:rPr>
+        <w:t xml:space="preserve">Tested the base AI model across 15 business domains and pinpointed Australian privacy law as its weak spot (21%, with 79% of answers citing foreign law), earning client approval for the domain.</w:t>
+      </w:r>
+    </w:p>
+    <w:p>
+      <w:pPr>
+        <w:pStyle w:val="ListParagraph"/>
+        <w:numPr>
+          <w:ilvl w:val="0"/>
+          <w:numId w:val="2"/>
+        </w:numPr>
+        <w:spacing w:after="20"/>
+      </w:pPr>
+      <w:r>
+        <w:rPr>
+          <w:rFonts w:ascii="Calibri" w:cs="Calibri" w:eastAsia="Calibri" w:hAnsi="Calibri"/>
+          <w:color w:val="000000"/>
+          <w:sz w:val="21"/>
+          <w:szCs w:val="21"/>
+        </w:rPr>
+        <w:t xml:space="preserve">Wrote 105 training examples, then rewrote 37 that a manual review found mirrored the sealed 170-question benchmark, so the final score measured real learning.</w:t>
+      </w:r>
+    </w:p>
+    <w:p>
+      <w:pPr>
+        <w:pStyle w:val="ListParagraph"/>
+        <w:numPr>
+          <w:ilvl w:val="0"/>
+          <w:numId w:val="2"/>
+        </w:numPr>
+        <w:spacing w:after="20"/>
+      </w:pPr>
+      <w:r>
+        <w:rPr>
+          <w:rFonts w:ascii="Calibri" w:cs="Calibri" w:eastAsia="Calibri" w:hAnsi="Calibri"/>
+          <w:color w:val="000000"/>
+          <w:sz w:val="21"/>
+          <w:szCs w:val="21"/>
+        </w:rPr>
+        <w:t xml:space="preserve">Ran 8 LoRA fine-tuning experiments, one change per run; training the MLP layers lifted accuracy from 38% to 81%, the project’s biggest gain, while keeping 57 of 60 general-knowledge answers.</w:t>
+      </w:r>
+    </w:p>
+    <w:p>
+      <w:pPr>
+        <w:pStyle w:val="ListParagraph"/>
+        <w:numPr>
+          <w:ilvl w:val="0"/>
+          <w:numId w:val="2"/>
+        </w:numPr>
+        <w:spacing w:after="20"/>
+      </w:pPr>
+      <w:r>
+        <w:rPr>
+          <w:rFonts w:ascii="Calibri" w:cs="Calibri" w:eastAsia="Calibri" w:hAnsi="Calibri"/>
+          <w:color w:val="000000"/>
+          <w:sz w:val="21"/>
+          <w:szCs w:val="21"/>
+        </w:rPr>
+        <w:t xml:space="preserve">Reordered training data to place reasoning before the answer, cutting wrong “no principle applies” guesses from 54 to 5.</w:t>
+      </w:r>
+    </w:p>
+    <w:p>
+      <w:pPr>
+        <w:pStyle w:val="ListParagraph"/>
+        <w:numPr>
+          <w:ilvl w:val="0"/>
+          <w:numId w:val="2"/>
+        </w:numPr>
+        <w:spacing w:after="20"/>
+      </w:pPr>
+      <w:r>
+        <w:rPr>
+          <w:rFonts w:ascii="Calibri" w:cs="Calibri" w:eastAsia="Calibri" w:hAnsi="Calibri"/>
+          <w:color w:val="000000"/>
+          <w:sz w:val="21"/>
+          <w:szCs w:val="21"/>
+        </w:rPr>
+        <w:t xml:space="preserve">Produced a 27-slide client presentation and a 6-step handover recipe, so the next team can build an adapter for a new subject much faster.</w:t>
+      </w:r>
+    </w:p>
+    <w:p>
+      <w:pPr>
+        <w:keepNext/>
+        <w:spacing w:after="0" w:before="140"/>
+      </w:pPr>
+      <w:r>
+        <w:rPr>
+          <w:rFonts w:ascii="Calibri" w:cs="Calibri" w:eastAsia="Calibri" w:hAnsi="Calibri"/>
+          <w:b/>
+          <w:bCs/>
+          <w:color w:val="000000"/>
+          <w:sz w:val="21"/>
+          <w:szCs w:val="21"/>
+        </w:rPr>
+        <w:t xml:space="preserve">FreshMart Sales Performance Dashboard</w:t>
+      </w:r>
+    </w:p>
+    <w:p>
+      <w:pPr>
+        <w:keepNext/>
+        <w:tabs>
+          <w:tab w:val="right" w:pos="10106"/>
+        </w:tabs>
+        <w:spacing w:after="20"/>
+      </w:pPr>
+      <w:r>
+        <w:rPr>
+          <w:rFonts w:ascii="Calibri" w:cs="Calibri" w:eastAsia="Calibri" w:hAnsi="Calibri"/>
+          <w:color w:val="404040"/>
+          <w:sz w:val="21"/>
+          <w:szCs w:val="21"/>
+        </w:rPr>
         <w:t xml:space="preserve">Power BI, Power Query, DAX, Data Modelling</w:t>
       </w:r>
       <w:r>
@@ -827,7 +966,7 @@
         </w:rPr>
         <w:t xml:space="preserve">	</w:t>
       </w:r>
-      <w:hyperlink w:history="1" r:id="rIdovtyezac1qczbblx-ypmd">
+      <w:hyperlink w:history="1" r:id="rIdquxlyg-diqw3ptc7weycq">
         <w:r>
           <w:rPr>
             <w:rFonts w:ascii="Calibri" w:cs="Calibri" w:eastAsia="Calibri" w:hAnsi="Calibri"/>
@@ -939,7 +1078,7 @@
         </w:rPr>
         <w:t xml:space="preserve">	</w:t>
       </w:r>
-      <w:hyperlink w:history="1" r:id="rIdlgjk5ggfp9hi1w811yclo">
+      <w:hyperlink w:history="1" r:id="rIdykywp0hutrkvcfhjoqdfl">
         <w:r>
           <w:rPr>
             <w:rFonts w:ascii="Calibri" w:cs="Calibri" w:eastAsia="Calibri" w:hAnsi="Calibri"/>
@@ -1070,7 +1209,7 @@
         </w:rPr>
         <w:t xml:space="preserve">	</w:t>
       </w:r>
-      <w:hyperlink w:history="1" r:id="rId6eywd2r90fqackadipidr">
+      <w:hyperlink w:history="1" r:id="rIdnqiga22_9oegyho4cxgfy">
         <w:r>
           <w:rPr>
             <w:rFonts w:ascii="Calibri" w:cs="Calibri" w:eastAsia="Calibri" w:hAnsi="Calibri"/>

</xml_diff>

<commit_message>
CV: capstone bullets rewritten around the result for the client
Co-Authored-By: Claude Opus 5.5 <noreply@anthropic.com>
Claude-Session: https://claude.ai/code/session_011X2nibp2ZJGG1sr585TrFg
</commit_message>
<xml_diff>
--- a/Waranyu-Bancherdvanich-CV.docx
+++ b/Waranyu-Bancherdvanich-CV.docx
@@ -25,7 +25,7 @@
         <w:spacing w:after="0"/>
         <w:jc w:val="center"/>
       </w:pPr>
-      <w:hyperlink w:history="1" r:id="rIdnu54gs3modsriky--tdho">
+      <w:hyperlink w:history="1" r:id="rIdqqanv53vjf5y0juznuezu">
         <w:r>
           <w:rPr>
             <w:rFonts w:ascii="Open Sans" w:cs="Open Sans" w:eastAsia="Open Sans" w:hAnsi="Open Sans"/>
@@ -50,7 +50,7 @@
         </w:rPr>
         <w:t xml:space="preserve"> | </w:t>
       </w:r>
-      <w:hyperlink w:history="1" r:id="rIda0_guezw5w8u0bcyvxi7d">
+      <w:hyperlink w:history="1" r:id="rIdqi6ct5puv-l56twwbbd3b">
         <w:r>
           <w:rPr>
             <w:rFonts w:ascii="Open Sans" w:cs="Open Sans" w:eastAsia="Open Sans" w:hAnsi="Open Sans"/>
@@ -70,7 +70,7 @@
         <w:spacing w:after="120"/>
         <w:jc w:val="center"/>
       </w:pPr>
-      <w:hyperlink w:history="1" r:id="rId2xhp6g6he0vgpcfdwidmf">
+      <w:hyperlink w:history="1" r:id="rIdx8fsly8aoh7s4t9ufxxi6">
         <w:r>
           <w:rPr>
             <w:rFonts w:ascii="Open Sans" w:cs="Open Sans" w:eastAsia="Open Sans" w:hAnsi="Open Sans"/>
@@ -95,7 +95,7 @@
         </w:rPr>
         <w:t xml:space="preserve"> | </w:t>
       </w:r>
-      <w:hyperlink w:history="1" r:id="rId0bmvre6srk9ktowdnt-j5">
+      <w:hyperlink w:history="1" r:id="rIddmyq4aeldzqt2qxtrjzvt">
         <w:r>
           <w:rPr>
             <w:rFonts w:ascii="Open Sans" w:cs="Open Sans" w:eastAsia="Open Sans" w:hAnsi="Open Sans"/>
@@ -740,79 +740,61 @@
           <w:sz w:val="19"/>
           <w:szCs w:val="19"/>
         </w:rPr>
-        <w:t xml:space="preserve">Tested the base AI model across 15 business domains and pinpointed Australian privacy law as its weak spot (21%, with 79% of answers citing foreign law), earning client approval for the domain.</w:t>
-      </w:r>
-    </w:p>
-    <w:p>
-      <w:pPr>
-        <w:pStyle w:val="ListParagraph"/>
-        <w:numPr>
-          <w:ilvl w:val="0"/>
-          <w:numId w:val="2"/>
-        </w:numPr>
-      </w:pPr>
-      <w:r>
-        <w:rPr>
-          <w:rFonts w:ascii="Open Sans" w:cs="Open Sans" w:eastAsia="Open Sans" w:hAnsi="Open Sans"/>
-          <w:color w:val="000000"/>
-          <w:sz w:val="19"/>
-          <w:szCs w:val="19"/>
-        </w:rPr>
-        <w:t xml:space="preserve">Wrote 105 training examples, then rewrote 37 that a manual review found mirrored the sealed 170-question benchmark, so the final score measured real learning.</w:t>
-      </w:r>
-    </w:p>
-    <w:p>
-      <w:pPr>
-        <w:pStyle w:val="ListParagraph"/>
-        <w:numPr>
-          <w:ilvl w:val="0"/>
-          <w:numId w:val="2"/>
-        </w:numPr>
-      </w:pPr>
-      <w:r>
-        <w:rPr>
-          <w:rFonts w:ascii="Open Sans" w:cs="Open Sans" w:eastAsia="Open Sans" w:hAnsi="Open Sans"/>
-          <w:color w:val="000000"/>
-          <w:sz w:val="19"/>
-          <w:szCs w:val="19"/>
-        </w:rPr>
-        <w:t xml:space="preserve">Ran 8 LoRA fine-tuning experiments, one change per run; training the MLP layers lifted accuracy from 38% to 81%, the project’s biggest gain, while keeping 57 of 60 general-knowledge answers.</w:t>
-      </w:r>
-    </w:p>
-    <w:p>
-      <w:pPr>
-        <w:pStyle w:val="ListParagraph"/>
-        <w:numPr>
-          <w:ilvl w:val="0"/>
-          <w:numId w:val="2"/>
-        </w:numPr>
-      </w:pPr>
-      <w:r>
-        <w:rPr>
-          <w:rFonts w:ascii="Open Sans" w:cs="Open Sans" w:eastAsia="Open Sans" w:hAnsi="Open Sans"/>
-          <w:color w:val="000000"/>
-          <w:sz w:val="19"/>
-          <w:szCs w:val="19"/>
-        </w:rPr>
-        <w:t xml:space="preserve">Reordered training data to place reasoning before the answer, cutting wrong “no principle applies” guesses from 54 to 5.</w:t>
-      </w:r>
-    </w:p>
-    <w:p>
-      <w:pPr>
-        <w:pStyle w:val="ListParagraph"/>
-        <w:numPr>
-          <w:ilvl w:val="0"/>
-          <w:numId w:val="2"/>
-        </w:numPr>
-      </w:pPr>
-      <w:r>
-        <w:rPr>
-          <w:rFonts w:ascii="Open Sans" w:cs="Open Sans" w:eastAsia="Open Sans" w:hAnsi="Open Sans"/>
-          <w:color w:val="000000"/>
-          <w:sz w:val="19"/>
-          <w:szCs w:val="19"/>
-        </w:rPr>
-        <w:t xml:space="preserve">Produced a 27-slide client presentation and a 6-step handover recipe, so the next team can build an adapter for a new subject much faster.</w:t>
+        <w:t xml:space="preserve">Tested the base AI model across 15 business areas and identified Australian privacy law as its weakest, giving the client clear evidence to approve the project focus.</w:t>
+      </w:r>
+    </w:p>
+    <w:p>
+      <w:pPr>
+        <w:pStyle w:val="ListParagraph"/>
+        <w:numPr>
+          <w:ilvl w:val="0"/>
+          <w:numId w:val="2"/>
+        </w:numPr>
+      </w:pPr>
+      <w:r>
+        <w:rPr>
+          <w:rFonts w:ascii="Open Sans" w:cs="Open Sans" w:eastAsia="Open Sans" w:hAnsi="Open Sans"/>
+          <w:color w:val="000000"/>
+          <w:sz w:val="19"/>
+          <w:szCs w:val="19"/>
+        </w:rPr>
+        <w:t xml:space="preserve">Trained a privacy-law expert adapter that reached 81% accuracy on a sealed 170-question test, using only free tools, proving the client’s “small model, plug-in expert” idea works.</w:t>
+      </w:r>
+    </w:p>
+    <w:p>
+      <w:pPr>
+        <w:pStyle w:val="ListParagraph"/>
+        <w:numPr>
+          <w:ilvl w:val="0"/>
+          <w:numId w:val="2"/>
+        </w:numPr>
+      </w:pPr>
+      <w:r>
+        <w:rPr>
+          <w:rFonts w:ascii="Open Sans" w:cs="Open Sans" w:eastAsia="Open Sans" w:hAnsi="Open Sans"/>
+          <w:color w:val="000000"/>
+          <w:sz w:val="19"/>
+          <w:szCs w:val="19"/>
+        </w:rPr>
+        <w:t xml:space="preserve">Found a one-line training setting that more than doubled accuracy (38% to 81%), now the core of the recipe recommended to the client.</w:t>
+      </w:r>
+    </w:p>
+    <w:p>
+      <w:pPr>
+        <w:pStyle w:val="ListParagraph"/>
+        <w:numPr>
+          <w:ilvl w:val="0"/>
+          <w:numId w:val="2"/>
+        </w:numPr>
+      </w:pPr>
+      <w:r>
+        <w:rPr>
+          <w:rFonts w:ascii="Open Sans" w:cs="Open Sans" w:eastAsia="Open Sans" w:hAnsi="Open Sans"/>
+          <w:color w:val="000000"/>
+          <w:sz w:val="19"/>
+          <w:szCs w:val="19"/>
+        </w:rPr>
+        <w:t xml:space="preserve">Delivered a 6-step handover recipe and client presentation, so the next team can build an adapter for a new subject much faster.</w:t>
       </w:r>
     </w:p>
     <w:p>
@@ -843,7 +825,7 @@
         </w:rPr>
         <w:t xml:space="preserve">	</w:t>
       </w:r>
-      <w:hyperlink w:history="1" r:id="rIduwntd79fhvp8irpwg6ehb">
+      <w:hyperlink w:history="1" r:id="rIdgxmhfz5r-qr6ldvtzb07f">
         <w:r>
           <w:rPr>
             <w:rFonts w:ascii="Open Sans" w:cs="Open Sans" w:eastAsia="Open Sans" w:hAnsi="Open Sans"/>
@@ -953,7 +935,7 @@
         </w:rPr>
         <w:t xml:space="preserve">	</w:t>
       </w:r>
-      <w:hyperlink w:history="1" r:id="rIdueiw1zeweoypynwj13pea">
+      <w:hyperlink w:history="1" r:id="rIdu0uhi6fwvrhijznadhmqb">
         <w:r>
           <w:rPr>
             <w:rFonts w:ascii="Open Sans" w:cs="Open Sans" w:eastAsia="Open Sans" w:hAnsi="Open Sans"/>
@@ -1081,7 +1063,7 @@
         </w:rPr>
         <w:t xml:space="preserve">	</w:t>
       </w:r>
-      <w:hyperlink w:history="1" r:id="rIdqcixdzwjjbzjhjd018mob">
+      <w:hyperlink w:history="1" r:id="rId599tcfgvxz-k2h6u-becg">
         <w:r>
           <w:rPr>
             <w:rFonts w:ascii="Open Sans" w:cs="Open Sans" w:eastAsia="Open Sans" w:hAnsi="Open Sans"/>

</xml_diff>

<commit_message>
CV: drop the dates on the capstone project
Co-Authored-By: Claude Opus 5.5 <noreply@anthropic.com>
Claude-Session: https://claude.ai/code/session_011X2nibp2ZJGG1sr585TrFg
</commit_message>
<xml_diff>
--- a/Waranyu-Bancherdvanich-CV.docx
+++ b/Waranyu-Bancherdvanich-CV.docx
@@ -25,7 +25,7 @@
         <w:spacing w:after="0"/>
         <w:jc w:val="center"/>
       </w:pPr>
-      <w:hyperlink w:history="1" r:id="rIdqqanv53vjf5y0juznuezu">
+      <w:hyperlink w:history="1" r:id="rIdjhjtrshsizrknhuelzwb_">
         <w:r>
           <w:rPr>
             <w:rFonts w:ascii="Open Sans" w:cs="Open Sans" w:eastAsia="Open Sans" w:hAnsi="Open Sans"/>
@@ -50,7 +50,7 @@
         </w:rPr>
         <w:t xml:space="preserve"> | </w:t>
       </w:r>
-      <w:hyperlink w:history="1" r:id="rIdqi6ct5puv-l56twwbbd3b">
+      <w:hyperlink w:history="1" r:id="rIdrgwmnp30vwr58od8yxx_r">
         <w:r>
           <w:rPr>
             <w:rFonts w:ascii="Open Sans" w:cs="Open Sans" w:eastAsia="Open Sans" w:hAnsi="Open Sans"/>
@@ -70,7 +70,7 @@
         <w:spacing w:after="120"/>
         <w:jc w:val="center"/>
       </w:pPr>
-      <w:hyperlink w:history="1" r:id="rIdx8fsly8aoh7s4t9ufxxi6">
+      <w:hyperlink w:history="1" r:id="rIddaeigy4_zsfak6kb5pwq_">
         <w:r>
           <w:rPr>
             <w:rFonts w:ascii="Open Sans" w:cs="Open Sans" w:eastAsia="Open Sans" w:hAnsi="Open Sans"/>
@@ -95,7 +95,7 @@
         </w:rPr>
         <w:t xml:space="preserve"> | </w:t>
       </w:r>
-      <w:hyperlink w:history="1" r:id="rIddmyq4aeldzqt2qxtrjzvt">
+      <w:hyperlink w:history="1" r:id="rIdxjpc4-a3jd0iavxf-kbyg">
         <w:r>
           <w:rPr>
             <w:rFonts w:ascii="Open Sans" w:cs="Open Sans" w:eastAsia="Open Sans" w:hAnsi="Open Sans"/>
@@ -697,17 +697,6 @@
         </w:rPr>
         <w:t xml:space="preserve">MGMT6052 Consultancy Project (Capstone)</w:t>
       </w:r>
-      <w:r>
-        <w:rPr>
-          <w:rFonts w:ascii="Open Sans" w:cs="Open Sans" w:eastAsia="Open Sans" w:hAnsi="Open Sans"/>
-          <w:b/>
-          <w:bCs/>
-          <w:color w:val="000000"/>
-          <w:sz w:val="19"/>
-          <w:szCs w:val="19"/>
-        </w:rPr>
-        <w:t xml:space="preserve">	Aug 2026 – Oct 2026</w:t>
-      </w:r>
     </w:p>
     <w:p>
       <w:pPr>
@@ -825,7 +814,7 @@
         </w:rPr>
         <w:t xml:space="preserve">	</w:t>
       </w:r>
-      <w:hyperlink w:history="1" r:id="rIdgxmhfz5r-qr6ldvtzb07f">
+      <w:hyperlink w:history="1" r:id="rIdz9vcthrgr4jjafmfjzu8e">
         <w:r>
           <w:rPr>
             <w:rFonts w:ascii="Open Sans" w:cs="Open Sans" w:eastAsia="Open Sans" w:hAnsi="Open Sans"/>
@@ -935,7 +924,7 @@
         </w:rPr>
         <w:t xml:space="preserve">	</w:t>
       </w:r>
-      <w:hyperlink w:history="1" r:id="rIdu0uhi6fwvrhijznadhmqb">
+      <w:hyperlink w:history="1" r:id="rIdmh4w3ox9iboahchb8ijuf">
         <w:r>
           <w:rPr>
             <w:rFonts w:ascii="Open Sans" w:cs="Open Sans" w:eastAsia="Open Sans" w:hAnsi="Open Sans"/>
@@ -1063,7 +1052,7 @@
         </w:rPr>
         <w:t xml:space="preserve">	</w:t>
       </w:r>
-      <w:hyperlink w:history="1" r:id="rId599tcfgvxz-k2h6u-becg">
+      <w:hyperlink w:history="1" r:id="rIdjvkrxnkad3nzxok2tntu6">
         <w:r>
           <w:rPr>
             <w:rFonts w:ascii="Open Sans" w:cs="Open Sans" w:eastAsia="Open Sans" w:hAnsi="Open Sans"/>

</xml_diff>

<commit_message>
CV: project bullets now state the impact of each step
FreshMart, Renewable and Football bullets name the method and what it
achieved; tool keywords moved to each project's subtitle line.

Co-Authored-By: Claude Opus 5.5 <noreply@anthropic.com>
Claude-Session: https://claude.ai/code/session_011X2nibp2ZJGG1sr585TrFg
</commit_message>
<xml_diff>
--- a/Waranyu-Bancherdvanich-CV.docx
+++ b/Waranyu-Bancherdvanich-CV.docx
@@ -25,7 +25,7 @@
         <w:spacing w:after="0"/>
         <w:jc w:val="center"/>
       </w:pPr>
-      <w:hyperlink w:history="1" r:id="rIdjhjtrshsizrknhuelzwb_">
+      <w:hyperlink w:history="1" r:id="rIdvuznhm95jwvlgpxbmhede">
         <w:r>
           <w:rPr>
             <w:rFonts w:ascii="Open Sans" w:cs="Open Sans" w:eastAsia="Open Sans" w:hAnsi="Open Sans"/>
@@ -50,7 +50,7 @@
         </w:rPr>
         <w:t xml:space="preserve"> | </w:t>
       </w:r>
-      <w:hyperlink w:history="1" r:id="rIdrgwmnp30vwr58od8yxx_r">
+      <w:hyperlink w:history="1" r:id="rId5o9ccb3tqygbfxkw1mtnr">
         <w:r>
           <w:rPr>
             <w:rFonts w:ascii="Open Sans" w:cs="Open Sans" w:eastAsia="Open Sans" w:hAnsi="Open Sans"/>
@@ -70,7 +70,7 @@
         <w:spacing w:after="120"/>
         <w:jc w:val="center"/>
       </w:pPr>
-      <w:hyperlink w:history="1" r:id="rIddaeigy4_zsfak6kb5pwq_">
+      <w:hyperlink w:history="1" r:id="rIduxdrluysqg_y8ofkzafai">
         <w:r>
           <w:rPr>
             <w:rFonts w:ascii="Open Sans" w:cs="Open Sans" w:eastAsia="Open Sans" w:hAnsi="Open Sans"/>
@@ -95,7 +95,7 @@
         </w:rPr>
         <w:t xml:space="preserve"> | </w:t>
       </w:r>
-      <w:hyperlink w:history="1" r:id="rIdxjpc4-a3jd0iavxf-kbyg">
+      <w:hyperlink w:history="1" r:id="rIdtytjbobrwerzrr1_tz-35">
         <w:r>
           <w:rPr>
             <w:rFonts w:ascii="Open Sans" w:cs="Open Sans" w:eastAsia="Open Sans" w:hAnsi="Open Sans"/>
@@ -814,7 +814,7 @@
         </w:rPr>
         <w:t xml:space="preserve">	</w:t>
       </w:r>
-      <w:hyperlink w:history="1" r:id="rIdz9vcthrgr4jjafmfjzu8e">
+      <w:hyperlink w:history="1" r:id="rIdxgn0_cli5amury7fi9fq_">
         <w:r>
           <w:rPr>
             <w:rFonts w:ascii="Open Sans" w:cs="Open Sans" w:eastAsia="Open Sans" w:hAnsi="Open Sans"/>
@@ -839,61 +839,61 @@
           <w:sz w:val="19"/>
           <w:szCs w:val="19"/>
         </w:rPr>
-        <w:t xml:space="preserve">Power BI, Power Query, DAX, Data Modelling</w:t>
-      </w:r>
-    </w:p>
-    <w:p>
-      <w:pPr>
-        <w:pStyle w:val="ListParagraph"/>
-        <w:numPr>
-          <w:ilvl w:val="0"/>
-          <w:numId w:val="2"/>
-        </w:numPr>
-      </w:pPr>
-      <w:r>
-        <w:rPr>
-          <w:rFonts w:ascii="Open Sans" w:cs="Open Sans" w:eastAsia="Open Sans" w:hAnsi="Open Sans"/>
-          <w:color w:val="000000"/>
-          <w:sz w:val="19"/>
-          <w:szCs w:val="19"/>
-        </w:rPr>
-        <w:t xml:space="preserve">Built a Power BI retail sales dashboard using Power Query, DAX, and star schema modelling to analyse revenue, margin, product performance, and store performance.</w:t>
-      </w:r>
-    </w:p>
-    <w:p>
-      <w:pPr>
-        <w:pStyle w:val="ListParagraph"/>
-        <w:numPr>
-          <w:ilvl w:val="0"/>
-          <w:numId w:val="2"/>
-        </w:numPr>
-      </w:pPr>
-      <w:r>
-        <w:rPr>
-          <w:rFonts w:ascii="Open Sans" w:cs="Open Sans" w:eastAsia="Open Sans" w:hAnsi="Open Sans"/>
-          <w:color w:val="000000"/>
-          <w:sz w:val="19"/>
-          <w:szCs w:val="19"/>
-        </w:rPr>
-        <w:t xml:space="preserve">Cleaned and standardised source data, including duplicate removal, category correction, and data type validation.</w:t>
-      </w:r>
-    </w:p>
-    <w:p>
-      <w:pPr>
-        <w:pStyle w:val="ListParagraph"/>
-        <w:numPr>
-          <w:ilvl w:val="0"/>
-          <w:numId w:val="2"/>
-        </w:numPr>
-      </w:pPr>
-      <w:r>
-        <w:rPr>
-          <w:rFonts w:ascii="Open Sans" w:cs="Open Sans" w:eastAsia="Open Sans" w:hAnsi="Open Sans"/>
-          <w:color w:val="000000"/>
-          <w:sz w:val="19"/>
-          <w:szCs w:val="19"/>
-        </w:rPr>
-        <w:t xml:space="preserve">Created KPI measures and visual insights to identify sales trends, product/category performance, and district-level performance gaps.</w:t>
+        <w:t xml:space="preserve">Power BI, Power Query, DAX, Kimball Star Schema</w:t>
+      </w:r>
+    </w:p>
+    <w:p>
+      <w:pPr>
+        <w:pStyle w:val="ListParagraph"/>
+        <w:numPr>
+          <w:ilvl w:val="0"/>
+          <w:numId w:val="2"/>
+        </w:numPr>
+      </w:pPr>
+      <w:r>
+        <w:rPr>
+          <w:rFonts w:ascii="Open Sans" w:cs="Open Sans" w:eastAsia="Open Sans" w:hAnsi="Open Sans"/>
+          <w:color w:val="000000"/>
+          <w:sz w:val="19"/>
+          <w:szCs w:val="19"/>
+        </w:rPr>
+        <w:t xml:space="preserve">Audited 5 raw operational files in Power Query and remapped 93 orphaned sales rows instead of dropping them, keeping revenue totals accurate and the data gap visible.</w:t>
+      </w:r>
+    </w:p>
+    <w:p>
+      <w:pPr>
+        <w:pStyle w:val="ListParagraph"/>
+        <w:numPr>
+          <w:ilvl w:val="0"/>
+          <w:numId w:val="2"/>
+        </w:numPr>
+      </w:pPr>
+      <w:r>
+        <w:rPr>
+          <w:rFonts w:ascii="Open Sans" w:cs="Open Sans" w:eastAsia="Open Sans" w:hAnsi="Open Sans"/>
+          <w:color w:val="000000"/>
+          <w:sz w:val="19"/>
+          <w:szCs w:val="19"/>
+        </w:rPr>
+        <w:t xml:space="preserve">Modelled 17,697 transactions across 12 stores into a Kimball star schema, so managers can see which regions and categories drive profit without stitching spreadsheets together.</w:t>
+      </w:r>
+    </w:p>
+    <w:p>
+      <w:pPr>
+        <w:pStyle w:val="ListParagraph"/>
+        <w:numPr>
+          <w:ilvl w:val="0"/>
+          <w:numId w:val="2"/>
+        </w:numPr>
+      </w:pPr>
+      <w:r>
+        <w:rPr>
+          <w:rFonts w:ascii="Open Sans" w:cs="Open Sans" w:eastAsia="Open Sans" w:hAnsi="Open Sans"/>
+          <w:color w:val="000000"/>
+          <w:sz w:val="19"/>
+          <w:szCs w:val="19"/>
+        </w:rPr>
+        <w:t xml:space="preserve">Built DAX measures for revenue, gross margin and year-on-year time intelligence, so growth is judged against a fair like-for-like comparison rather than a raw total.</w:t>
       </w:r>
     </w:p>
     <w:p>
@@ -924,7 +924,7 @@
         </w:rPr>
         <w:t xml:space="preserve">	</w:t>
       </w:r>
-      <w:hyperlink w:history="1" r:id="rIdmh4w3ox9iboahchb8ijuf">
+      <w:hyperlink w:history="1" r:id="rIdefagzjcdk59ww9triroz6">
         <w:r>
           <w:rPr>
             <w:rFonts w:ascii="Open Sans" w:cs="Open Sans" w:eastAsia="Open Sans" w:hAnsi="Open Sans"/>
@@ -949,79 +949,61 @@
           <w:sz w:val="19"/>
           <w:szCs w:val="19"/>
         </w:rPr>
-        <w:t xml:space="preserve">Power BI, DAX, R, Forecasting</w:t>
-      </w:r>
-    </w:p>
-    <w:p>
-      <w:pPr>
-        <w:pStyle w:val="ListParagraph"/>
-        <w:numPr>
-          <w:ilvl w:val="0"/>
-          <w:numId w:val="2"/>
-        </w:numPr>
-      </w:pPr>
-      <w:r>
-        <w:rPr>
-          <w:rFonts w:ascii="Open Sans" w:cs="Open Sans" w:eastAsia="Open Sans" w:hAnsi="Open Sans"/>
-          <w:color w:val="000000"/>
-          <w:sz w:val="19"/>
-          <w:szCs w:val="19"/>
-        </w:rPr>
-        <w:t xml:space="preserve">Developed a Power BI dashboard to analyse Australia’s renewable electricity transition from 2005–2024 and forecast progress to 2035.</w:t>
-      </w:r>
-    </w:p>
-    <w:p>
-      <w:pPr>
-        <w:pStyle w:val="ListParagraph"/>
-        <w:numPr>
-          <w:ilvl w:val="0"/>
-          <w:numId w:val="2"/>
-        </w:numPr>
-      </w:pPr>
-      <w:r>
-        <w:rPr>
-          <w:rFonts w:ascii="Open Sans" w:cs="Open Sans" w:eastAsia="Open Sans" w:hAnsi="Open Sans"/>
-          <w:color w:val="000000"/>
-          <w:sz w:val="19"/>
-          <w:szCs w:val="19"/>
-        </w:rPr>
-        <w:t xml:space="preserve">Cleaned and standardised multi-country electricity data, including energy source mapping and GWh-to-TWh conversion.</w:t>
-      </w:r>
-    </w:p>
-    <w:p>
-      <w:pPr>
-        <w:pStyle w:val="ListParagraph"/>
-        <w:numPr>
-          <w:ilvl w:val="0"/>
-          <w:numId w:val="2"/>
-        </w:numPr>
-      </w:pPr>
-      <w:r>
-        <w:rPr>
-          <w:rFonts w:ascii="Open Sans" w:cs="Open Sans" w:eastAsia="Open Sans" w:hAnsi="Open Sans"/>
-          <w:color w:val="000000"/>
-          <w:sz w:val="19"/>
-          <w:szCs w:val="19"/>
-        </w:rPr>
-        <w:t xml:space="preserve">Created DAX measures for renewable share, renewable generation, non-renewable generation, and renewable source mix.</w:t>
-      </w:r>
-    </w:p>
-    <w:p>
-      <w:pPr>
-        <w:pStyle w:val="ListParagraph"/>
-        <w:numPr>
-          <w:ilvl w:val="0"/>
-          <w:numId w:val="2"/>
-        </w:numPr>
-      </w:pPr>
-      <w:r>
-        <w:rPr>
-          <w:rFonts w:ascii="Open Sans" w:cs="Open Sans" w:eastAsia="Open Sans" w:hAnsi="Open Sans"/>
-          <w:color w:val="000000"/>
-          <w:sz w:val="19"/>
-          <w:szCs w:val="19"/>
-        </w:rPr>
-        <w:t xml:space="preserve">Used R-based linear regression to forecast renewable generation and renewable share with prediction intervals and model statistics.</w:t>
+        <w:t xml:space="preserve">Power BI, Power Query, DAX, R, Linear Regression</w:t>
+      </w:r>
+    </w:p>
+    <w:p>
+      <w:pPr>
+        <w:pStyle w:val="ListParagraph"/>
+        <w:numPr>
+          <w:ilvl w:val="0"/>
+          <w:numId w:val="2"/>
+        </w:numPr>
+      </w:pPr>
+      <w:r>
+        <w:rPr>
+          <w:rFonts w:ascii="Open Sans" w:cs="Open Sans" w:eastAsia="Open Sans" w:hAnsi="Open Sans"/>
+          <w:color w:val="000000"/>
+          <w:sz w:val="19"/>
+          <w:szCs w:val="19"/>
+        </w:rPr>
+        <w:t xml:space="preserve">Reconciled electricity data from 4 national agencies into a galaxy schema with GWh-to-TWh conversion, so country totals cannot be double-counted.</w:t>
+      </w:r>
+    </w:p>
+    <w:p>
+      <w:pPr>
+        <w:pStyle w:val="ListParagraph"/>
+        <w:numPr>
+          <w:ilvl w:val="0"/>
+          <w:numId w:val="2"/>
+        </w:numPr>
+      </w:pPr>
+      <w:r>
+        <w:rPr>
+          <w:rFonts w:ascii="Open Sans" w:cs="Open Sans" w:eastAsia="Open Sans" w:hAnsi="Open Sans"/>
+          <w:color w:val="000000"/>
+          <w:sz w:val="19"/>
+          <w:szCs w:val="19"/>
+        </w:rPr>
+        <w:t xml:space="preserve">Built a Power BI dashboard tracking Australia’s renewable share from 9% to 35% (2005–2024), benchmarked against Germany, New Zealand and China.</w:t>
+      </w:r>
+    </w:p>
+    <w:p>
+      <w:pPr>
+        <w:pStyle w:val="ListParagraph"/>
+        <w:numPr>
+          <w:ilvl w:val="0"/>
+          <w:numId w:val="2"/>
+        </w:numPr>
+      </w:pPr>
+      <w:r>
+        <w:rPr>
+          <w:rFonts w:ascii="Open Sans" w:cs="Open Sans" w:eastAsia="Open Sans" w:hAnsi="Open Sans"/>
+          <w:color w:val="000000"/>
+          <w:sz w:val="19"/>
+          <w:szCs w:val="19"/>
+        </w:rPr>
+        <w:t xml:space="preserve">Forecast to 2035 with R linear regression (R² 0.85, 95% prediction interval), quantifying a 44.6% share against the 82% target for decision-makers.</w:t>
       </w:r>
     </w:p>
     <w:p>
@@ -1052,7 +1034,7 @@
         </w:rPr>
         <w:t xml:space="preserve">	</w:t>
       </w:r>
-      <w:hyperlink w:history="1" r:id="rIdjvkrxnkad3nzxok2tntu6">
+      <w:hyperlink w:history="1" r:id="rIdat3ieipph1ualxmna_a1v">
         <w:r>
           <w:rPr>
             <w:rFonts w:ascii="Open Sans" w:cs="Open Sans" w:eastAsia="Open Sans" w:hAnsi="Open Sans"/>
@@ -1077,79 +1059,79 @@
           <w:sz w:val="19"/>
           <w:szCs w:val="19"/>
         </w:rPr>
-        <w:t xml:space="preserve">SQL, Oracle, ERD, Database Design</w:t>
-      </w:r>
-    </w:p>
-    <w:p>
-      <w:pPr>
-        <w:pStyle w:val="ListParagraph"/>
-        <w:numPr>
-          <w:ilvl w:val="0"/>
-          <w:numId w:val="2"/>
-        </w:numPr>
-      </w:pPr>
-      <w:r>
-        <w:rPr>
-          <w:rFonts w:ascii="Open Sans" w:cs="Open Sans" w:eastAsia="Open Sans" w:hAnsi="Open Sans"/>
-          <w:color w:val="000000"/>
-          <w:sz w:val="19"/>
-          <w:szCs w:val="19"/>
-        </w:rPr>
-        <w:t xml:space="preserve">Designed a relational database model for a football club management system.</w:t>
-      </w:r>
-    </w:p>
-    <w:p>
-      <w:pPr>
-        <w:pStyle w:val="ListParagraph"/>
-        <w:numPr>
-          <w:ilvl w:val="0"/>
-          <w:numId w:val="2"/>
-        </w:numPr>
-      </w:pPr>
-      <w:r>
-        <w:rPr>
-          <w:rFonts w:ascii="Open Sans" w:cs="Open Sans" w:eastAsia="Open Sans" w:hAnsi="Open Sans"/>
-          <w:color w:val="000000"/>
-          <w:sz w:val="19"/>
-          <w:szCs w:val="19"/>
-        </w:rPr>
-        <w:t xml:space="preserve">Developed an ERD and business rules to define relationships between key entities.</w:t>
-      </w:r>
-    </w:p>
-    <w:p>
-      <w:pPr>
-        <w:pStyle w:val="ListParagraph"/>
-        <w:numPr>
-          <w:ilvl w:val="0"/>
-          <w:numId w:val="2"/>
-        </w:numPr>
-      </w:pPr>
-      <w:r>
-        <w:rPr>
-          <w:rFonts w:ascii="Open Sans" w:cs="Open Sans" w:eastAsia="Open Sans" w:hAnsi="Open Sans"/>
-          <w:color w:val="000000"/>
-          <w:sz w:val="19"/>
-          <w:szCs w:val="19"/>
-        </w:rPr>
-        <w:t xml:space="preserve">Created a logical database schema with clear table structures, relationships, and constraints.</w:t>
-      </w:r>
-    </w:p>
-    <w:p>
-      <w:pPr>
-        <w:pStyle w:val="ListParagraph"/>
-        <w:numPr>
-          <w:ilvl w:val="0"/>
-          <w:numId w:val="2"/>
-        </w:numPr>
-      </w:pPr>
-      <w:r>
-        <w:rPr>
-          <w:rFonts w:ascii="Open Sans" w:cs="Open Sans" w:eastAsia="Open Sans" w:hAnsi="Open Sans"/>
-          <w:color w:val="000000"/>
-          <w:sz w:val="19"/>
-          <w:szCs w:val="19"/>
-        </w:rPr>
-        <w:t xml:space="preserve">Built and tested Oracle SQL tables to support accurate data storage and relational integrity.</w:t>
+        <w:t xml:space="preserve">Group project (3) – Oracle SQL, ERD, Normalisation</w:t>
+      </w:r>
+    </w:p>
+    <w:p>
+      <w:pPr>
+        <w:pStyle w:val="ListParagraph"/>
+        <w:numPr>
+          <w:ilvl w:val="0"/>
+          <w:numId w:val="2"/>
+        </w:numPr>
+      </w:pPr>
+      <w:r>
+        <w:rPr>
+          <w:rFonts w:ascii="Open Sans" w:cs="Open Sans" w:eastAsia="Open Sans" w:hAnsi="Open Sans"/>
+          <w:color w:val="000000"/>
+          <w:sz w:val="19"/>
+          <w:szCs w:val="19"/>
+        </w:rPr>
+        <w:t xml:space="preserve">Translated 18 business rules into an ERD and a normalised 16-table Oracle schema, so questions like the season ladder are answered without duplicated data.</w:t>
+      </w:r>
+    </w:p>
+    <w:p>
+      <w:pPr>
+        <w:pStyle w:val="ListParagraph"/>
+        <w:numPr>
+          <w:ilvl w:val="0"/>
+          <w:numId w:val="2"/>
+        </w:numPr>
+      </w:pPr>
+      <w:r>
+        <w:rPr>
+          <w:rFonts w:ascii="Open Sans" w:cs="Open Sans" w:eastAsia="Open Sans" w:hAnsi="Open Sans"/>
+          <w:color w:val="000000"/>
+          <w:sz w:val="19"/>
+          <w:szCs w:val="19"/>
+        </w:rPr>
+        <w:t xml:space="preserve">Wrote 9 analytical SQL queries using joins, subqueries and HAVING, answering real organiser questions such as the ladder, top scorers and goals per ground.</w:t>
+      </w:r>
+    </w:p>
+    <w:p>
+      <w:pPr>
+        <w:pStyle w:val="ListParagraph"/>
+        <w:numPr>
+          <w:ilvl w:val="0"/>
+          <w:numId w:val="2"/>
+        </w:numPr>
+      </w:pPr>
+      <w:r>
+        <w:rPr>
+          <w:rFonts w:ascii="Open Sans" w:cs="Open Sans" w:eastAsia="Open Sans" w:hAnsi="Open Sans"/>
+          <w:color w:val="000000"/>
+          <w:sz w:val="19"/>
+          <w:szCs w:val="19"/>
+        </w:rPr>
+        <w:t xml:space="preserve">Used a LEFT JOIN to keep goalless games in the averages, avoiding the inflated goals-per-ground figures an inner join would have produced.</w:t>
+      </w:r>
+    </w:p>
+    <w:p>
+      <w:pPr>
+        <w:pStyle w:val="ListParagraph"/>
+        <w:numPr>
+          <w:ilvl w:val="0"/>
+          <w:numId w:val="2"/>
+        </w:numPr>
+      </w:pPr>
+      <w:r>
+        <w:rPr>
+          <w:rFonts w:ascii="Open Sans" w:cs="Open Sans" w:eastAsia="Open Sans" w:hAnsi="Open Sans"/>
+          <w:color w:val="000000"/>
+          <w:sz w:val="19"/>
+          <w:szCs w:val="19"/>
+        </w:rPr>
+        <w:t xml:space="preserve">Revised the finished design after review, removing a many-to-many table and correcting 2 business rules, so the schema matches what the data represents.</w:t>
       </w:r>
     </w:p>
     <w:p>

</xml_diff>

<commit_message>
CV: renewable project states the policy finding and answers the 82% question
Share stalled during the 2014 RET review freeze and grew about five times
faster after the 2015 target reset; the R forecast gives 37.8% for 2030
(95% upper bound 46.6%), so the 82% target is unlikely on current trend.

Co-Authored-By: Claude Opus 5.5 <noreply@anthropic.com>
Claude-Session: https://claude.ai/code/session_011X2nibp2ZJGG1sr585TrFg
</commit_message>
<xml_diff>
--- a/Waranyu-Bancherdvanich-CV.docx
+++ b/Waranyu-Bancherdvanich-CV.docx
@@ -25,7 +25,7 @@
         <w:spacing w:after="0"/>
         <w:jc w:val="center"/>
       </w:pPr>
-      <w:hyperlink w:history="1" r:id="rIdvuznhm95jwvlgpxbmhede">
+      <w:hyperlink w:history="1" r:id="rIdsxpsylpuq68b4cigql_jz">
         <w:r>
           <w:rPr>
             <w:rFonts w:ascii="Open Sans" w:cs="Open Sans" w:eastAsia="Open Sans" w:hAnsi="Open Sans"/>
@@ -50,7 +50,7 @@
         </w:rPr>
         <w:t xml:space="preserve"> | </w:t>
       </w:r>
-      <w:hyperlink w:history="1" r:id="rId5o9ccb3tqygbfxkw1mtnr">
+      <w:hyperlink w:history="1" r:id="rIdvhsf3g1tohghbwzsyzds4">
         <w:r>
           <w:rPr>
             <w:rFonts w:ascii="Open Sans" w:cs="Open Sans" w:eastAsia="Open Sans" w:hAnsi="Open Sans"/>
@@ -70,7 +70,7 @@
         <w:spacing w:after="120"/>
         <w:jc w:val="center"/>
       </w:pPr>
-      <w:hyperlink w:history="1" r:id="rIduxdrluysqg_y8ofkzafai">
+      <w:hyperlink w:history="1" r:id="rId4a1bafnjnqclpd08ipvtn">
         <w:r>
           <w:rPr>
             <w:rFonts w:ascii="Open Sans" w:cs="Open Sans" w:eastAsia="Open Sans" w:hAnsi="Open Sans"/>
@@ -95,7 +95,7 @@
         </w:rPr>
         <w:t xml:space="preserve"> | </w:t>
       </w:r>
-      <w:hyperlink w:history="1" r:id="rIdtytjbobrwerzrr1_tz-35">
+      <w:hyperlink w:history="1" r:id="rIdqwio32zrkp2tl5j-yhs8a">
         <w:r>
           <w:rPr>
             <w:rFonts w:ascii="Open Sans" w:cs="Open Sans" w:eastAsia="Open Sans" w:hAnsi="Open Sans"/>
@@ -814,7 +814,7 @@
         </w:rPr>
         <w:t xml:space="preserve">	</w:t>
       </w:r>
-      <w:hyperlink w:history="1" r:id="rIdxgn0_cli5amury7fi9fq_">
+      <w:hyperlink w:history="1" r:id="rIdszt440cwfj80wkihailnf">
         <w:r>
           <w:rPr>
             <w:rFonts w:ascii="Open Sans" w:cs="Open Sans" w:eastAsia="Open Sans" w:hAnsi="Open Sans"/>
@@ -924,7 +924,7 @@
         </w:rPr>
         <w:t xml:space="preserve">	</w:t>
       </w:r>
-      <w:hyperlink w:history="1" r:id="rIdefagzjcdk59ww9triroz6">
+      <w:hyperlink w:history="1" r:id="rId4gt9rqcxxxgmigdxltfn1">
         <w:r>
           <w:rPr>
             <w:rFonts w:ascii="Open Sans" w:cs="Open Sans" w:eastAsia="Open Sans" w:hAnsi="Open Sans"/>
@@ -949,61 +949,61 @@
           <w:sz w:val="19"/>
           <w:szCs w:val="19"/>
         </w:rPr>
-        <w:t xml:space="preserve">Power BI, Power Query, DAX, R, Linear Regression</w:t>
-      </w:r>
-    </w:p>
-    <w:p>
-      <w:pPr>
-        <w:pStyle w:val="ListParagraph"/>
-        <w:numPr>
-          <w:ilvl w:val="0"/>
-          <w:numId w:val="2"/>
-        </w:numPr>
-      </w:pPr>
-      <w:r>
-        <w:rPr>
-          <w:rFonts w:ascii="Open Sans" w:cs="Open Sans" w:eastAsia="Open Sans" w:hAnsi="Open Sans"/>
-          <w:color w:val="000000"/>
-          <w:sz w:val="19"/>
-          <w:szCs w:val="19"/>
-        </w:rPr>
-        <w:t xml:space="preserve">Reconciled electricity data from 4 national agencies into a galaxy schema with GWh-to-TWh conversion, so country totals cannot be double-counted.</w:t>
-      </w:r>
-    </w:p>
-    <w:p>
-      <w:pPr>
-        <w:pStyle w:val="ListParagraph"/>
-        <w:numPr>
-          <w:ilvl w:val="0"/>
-          <w:numId w:val="2"/>
-        </w:numPr>
-      </w:pPr>
-      <w:r>
-        <w:rPr>
-          <w:rFonts w:ascii="Open Sans" w:cs="Open Sans" w:eastAsia="Open Sans" w:hAnsi="Open Sans"/>
-          <w:color w:val="000000"/>
-          <w:sz w:val="19"/>
-          <w:szCs w:val="19"/>
-        </w:rPr>
-        <w:t xml:space="preserve">Built a Power BI dashboard tracking Australia’s renewable share from 9% to 35% (2005–2024), benchmarked against Germany, New Zealand and China.</w:t>
-      </w:r>
-    </w:p>
-    <w:p>
-      <w:pPr>
-        <w:pStyle w:val="ListParagraph"/>
-        <w:numPr>
-          <w:ilvl w:val="0"/>
-          <w:numId w:val="2"/>
-        </w:numPr>
-      </w:pPr>
-      <w:r>
-        <w:rPr>
-          <w:rFonts w:ascii="Open Sans" w:cs="Open Sans" w:eastAsia="Open Sans" w:hAnsi="Open Sans"/>
-          <w:color w:val="000000"/>
-          <w:sz w:val="19"/>
-          <w:szCs w:val="19"/>
-        </w:rPr>
-        <w:t xml:space="preserve">Forecast to 2035 with R linear regression (R² 0.85, 95% prediction interval), quantifying a 44.6% share against the 82% target for decision-makers.</w:t>
+        <w:t xml:space="preserve">Power BI, Power Query, DAX, R, Linear Regression, Policy Analysis</w:t>
+      </w:r>
+    </w:p>
+    <w:p>
+      <w:pPr>
+        <w:pStyle w:val="ListParagraph"/>
+        <w:numPr>
+          <w:ilvl w:val="0"/>
+          <w:numId w:val="2"/>
+        </w:numPr>
+      </w:pPr>
+      <w:r>
+        <w:rPr>
+          <w:rFonts w:ascii="Open Sans" w:cs="Open Sans" w:eastAsia="Open Sans" w:hAnsi="Open Sans"/>
+          <w:color w:val="000000"/>
+          <w:sz w:val="19"/>
+          <w:szCs w:val="19"/>
+        </w:rPr>
+        <w:t xml:space="preserve">Reconciled data from 4 national agencies into a Power BI galaxy schema, tracking Australia’s renewable share from 9% to 35% (2005–2024) against Germany, New Zealand and China.</w:t>
+      </w:r>
+    </w:p>
+    <w:p>
+      <w:pPr>
+        <w:pStyle w:val="ListParagraph"/>
+        <w:numPr>
+          <w:ilvl w:val="0"/>
+          <w:numId w:val="2"/>
+        </w:numPr>
+      </w:pPr>
+      <w:r>
+        <w:rPr>
+          <w:rFonts w:ascii="Open Sans" w:cs="Open Sans" w:eastAsia="Open Sans" w:hAnsi="Open Sans"/>
+          <w:color w:val="000000"/>
+          <w:sz w:val="19"/>
+          <w:szCs w:val="19"/>
+        </w:rPr>
+        <w:t xml:space="preserve">Linked the trend to policy: share stalled at 13–15% during the 2014 investment freeze over the Renewable Energy Target review, then grew 2.5 points a year after the 2015 target reset, nearly 5× the earlier pace.</w:t>
+      </w:r>
+    </w:p>
+    <w:p>
+      <w:pPr>
+        <w:pStyle w:val="ListParagraph"/>
+        <w:numPr>
+          <w:ilvl w:val="0"/>
+          <w:numId w:val="2"/>
+        </w:numPr>
+      </w:pPr>
+      <w:r>
+        <w:rPr>
+          <w:rFonts w:ascii="Open Sans" w:cs="Open Sans" w:eastAsia="Open Sans" w:hAnsi="Open Sans"/>
+          <w:color w:val="000000"/>
+          <w:sz w:val="19"/>
+          <w:szCs w:val="19"/>
+        </w:rPr>
+        <w:t xml:space="preserve">Forecast with R linear regression (R² 0.85) that Australia reaches only 37.8% by 2030 and 44.6% by 2035; even the 95% upper bound for 2030 is 46.6%, so the 82% target is unlikely on the current trend.</w:t>
       </w:r>
     </w:p>
     <w:p>
@@ -1034,7 +1034,7 @@
         </w:rPr>
         <w:t xml:space="preserve">	</w:t>
       </w:r>
-      <w:hyperlink w:history="1" r:id="rIdat3ieipph1ualxmna_a1v">
+      <w:hyperlink w:history="1" r:id="rIdr0thkjhavyf_r3v8jb62o">
         <w:r>
           <w:rPr>
             <w:rFonts w:ascii="Open Sans" w:cs="Open Sans" w:eastAsia="Open Sans" w:hAnsi="Open Sans"/>

</xml_diff>

<commit_message>
CV: football project lists the data dictionary and sample season instead of the review revision
Co-Authored-By: Claude Opus 5.5 <noreply@anthropic.com>
Claude-Session: https://claude.ai/code/session_011X2nibp2ZJGG1sr585TrFg
</commit_message>
<xml_diff>
--- a/Waranyu-Bancherdvanich-CV.docx
+++ b/Waranyu-Bancherdvanich-CV.docx
@@ -25,7 +25,7 @@
         <w:spacing w:after="0"/>
         <w:jc w:val="center"/>
       </w:pPr>
-      <w:hyperlink w:history="1" r:id="rIdsxpsylpuq68b4cigql_jz">
+      <w:hyperlink w:history="1" r:id="rIdbx0nv14peznghoaqlm6fy">
         <w:r>
           <w:rPr>
             <w:rFonts w:ascii="Open Sans" w:cs="Open Sans" w:eastAsia="Open Sans" w:hAnsi="Open Sans"/>
@@ -50,7 +50,7 @@
         </w:rPr>
         <w:t xml:space="preserve"> | </w:t>
       </w:r>
-      <w:hyperlink w:history="1" r:id="rIdvhsf3g1tohghbwzsyzds4">
+      <w:hyperlink w:history="1" r:id="rIdki6dhazjeer4ovzvidlmx">
         <w:r>
           <w:rPr>
             <w:rFonts w:ascii="Open Sans" w:cs="Open Sans" w:eastAsia="Open Sans" w:hAnsi="Open Sans"/>
@@ -70,7 +70,7 @@
         <w:spacing w:after="120"/>
         <w:jc w:val="center"/>
       </w:pPr>
-      <w:hyperlink w:history="1" r:id="rId4a1bafnjnqclpd08ipvtn">
+      <w:hyperlink w:history="1" r:id="rId4dcq6thjfgmmb97am_iwi">
         <w:r>
           <w:rPr>
             <w:rFonts w:ascii="Open Sans" w:cs="Open Sans" w:eastAsia="Open Sans" w:hAnsi="Open Sans"/>
@@ -95,7 +95,7 @@
         </w:rPr>
         <w:t xml:space="preserve"> | </w:t>
       </w:r>
-      <w:hyperlink w:history="1" r:id="rIdqwio32zrkp2tl5j-yhs8a">
+      <w:hyperlink w:history="1" r:id="rIdjfujv2rnoedx2rayl7hq9">
         <w:r>
           <w:rPr>
             <w:rFonts w:ascii="Open Sans" w:cs="Open Sans" w:eastAsia="Open Sans" w:hAnsi="Open Sans"/>
@@ -814,7 +814,7 @@
         </w:rPr>
         <w:t xml:space="preserve">	</w:t>
       </w:r>
-      <w:hyperlink w:history="1" r:id="rIdszt440cwfj80wkihailnf">
+      <w:hyperlink w:history="1" r:id="rIdig9n5kdsa5ovkvdb4kuif">
         <w:r>
           <w:rPr>
             <w:rFonts w:ascii="Open Sans" w:cs="Open Sans" w:eastAsia="Open Sans" w:hAnsi="Open Sans"/>
@@ -924,7 +924,7 @@
         </w:rPr>
         <w:t xml:space="preserve">	</w:t>
       </w:r>
-      <w:hyperlink w:history="1" r:id="rId4gt9rqcxxxgmigdxltfn1">
+      <w:hyperlink w:history="1" r:id="rId02uoksnp2n7dozcix0cxk">
         <w:r>
           <w:rPr>
             <w:rFonts w:ascii="Open Sans" w:cs="Open Sans" w:eastAsia="Open Sans" w:hAnsi="Open Sans"/>
@@ -1034,7 +1034,7 @@
         </w:rPr>
         <w:t xml:space="preserve">	</w:t>
       </w:r>
-      <w:hyperlink w:history="1" r:id="rIdr0thkjhavyf_r3v8jb62o">
+      <w:hyperlink w:history="1" r:id="rIdjcjqz25vhnkkesrgil-cv">
         <w:r>
           <w:rPr>
             <w:rFonts w:ascii="Open Sans" w:cs="Open Sans" w:eastAsia="Open Sans" w:hAnsi="Open Sans"/>
@@ -1131,7 +1131,7 @@
           <w:sz w:val="19"/>
           <w:szCs w:val="19"/>
         </w:rPr>
-        <w:t xml:space="preserve">Revised the finished design after review, removing a many-to-many table and correcting 2 business rules, so the schema matches what the data represents.</w:t>
+        <w:t xml:space="preserve">Created a data dictionary and inserted a full sample season (8 clubs, 96 players, 56 games, 154 goals), so the schema is documented for others and every query is tested on realistic data.</w:t>
       </w:r>
     </w:p>
     <w:p>

</xml_diff>

<commit_message>
CV: one or two figures per project bullet
Co-Authored-By: Claude Opus 5.5 <noreply@anthropic.com>
Claude-Session: https://claude.ai/code/session_011X2nibp2ZJGG1sr585TrFg
</commit_message>
<xml_diff>
--- a/Waranyu-Bancherdvanich-CV.docx
+++ b/Waranyu-Bancherdvanich-CV.docx
@@ -25,7 +25,7 @@
         <w:spacing w:after="0"/>
         <w:jc w:val="center"/>
       </w:pPr>
-      <w:hyperlink w:history="1" r:id="rIdbx0nv14peznghoaqlm6fy">
+      <w:hyperlink w:history="1" r:id="rIdzpnx_yxvyagauk2ks0myj">
         <w:r>
           <w:rPr>
             <w:rFonts w:ascii="Open Sans" w:cs="Open Sans" w:eastAsia="Open Sans" w:hAnsi="Open Sans"/>
@@ -50,7 +50,7 @@
         </w:rPr>
         <w:t xml:space="preserve"> | </w:t>
       </w:r>
-      <w:hyperlink w:history="1" r:id="rIdki6dhazjeer4ovzvidlmx">
+      <w:hyperlink w:history="1" r:id="rIddlky7kqtbyiyvfuujcadq">
         <w:r>
           <w:rPr>
             <w:rFonts w:ascii="Open Sans" w:cs="Open Sans" w:eastAsia="Open Sans" w:hAnsi="Open Sans"/>
@@ -70,7 +70,7 @@
         <w:spacing w:after="120"/>
         <w:jc w:val="center"/>
       </w:pPr>
-      <w:hyperlink w:history="1" r:id="rId4dcq6thjfgmmb97am_iwi">
+      <w:hyperlink w:history="1" r:id="rId1vxd-ctuix2xv4gf4hlkg">
         <w:r>
           <w:rPr>
             <w:rFonts w:ascii="Open Sans" w:cs="Open Sans" w:eastAsia="Open Sans" w:hAnsi="Open Sans"/>
@@ -95,7 +95,7 @@
         </w:rPr>
         <w:t xml:space="preserve"> | </w:t>
       </w:r>
-      <w:hyperlink w:history="1" r:id="rIdjfujv2rnoedx2rayl7hq9">
+      <w:hyperlink w:history="1" r:id="rIdfui-ioppw3djkeb2vvcjp">
         <w:r>
           <w:rPr>
             <w:rFonts w:ascii="Open Sans" w:cs="Open Sans" w:eastAsia="Open Sans" w:hAnsi="Open Sans"/>
@@ -814,7 +814,7 @@
         </w:rPr>
         <w:t xml:space="preserve">	</w:t>
       </w:r>
-      <w:hyperlink w:history="1" r:id="rIdig9n5kdsa5ovkvdb4kuif">
+      <w:hyperlink w:history="1" r:id="rIdx2ms0hjlposukcwe_lu46">
         <w:r>
           <w:rPr>
             <w:rFonts w:ascii="Open Sans" w:cs="Open Sans" w:eastAsia="Open Sans" w:hAnsi="Open Sans"/>
@@ -924,7 +924,7 @@
         </w:rPr>
         <w:t xml:space="preserve">	</w:t>
       </w:r>
-      <w:hyperlink w:history="1" r:id="rId02uoksnp2n7dozcix0cxk">
+      <w:hyperlink w:history="1" r:id="rIdbchmiin4ap0ogd3ho60jt">
         <w:r>
           <w:rPr>
             <w:rFonts w:ascii="Open Sans" w:cs="Open Sans" w:eastAsia="Open Sans" w:hAnsi="Open Sans"/>
@@ -967,43 +967,43 @@
           <w:sz w:val="19"/>
           <w:szCs w:val="19"/>
         </w:rPr>
-        <w:t xml:space="preserve">Reconciled data from 4 national agencies into a Power BI galaxy schema, tracking Australia’s renewable share from 9% to 35% (2005–2024) against Germany, New Zealand and China.</w:t>
-      </w:r>
-    </w:p>
-    <w:p>
-      <w:pPr>
-        <w:pStyle w:val="ListParagraph"/>
-        <w:numPr>
-          <w:ilvl w:val="0"/>
-          <w:numId w:val="2"/>
-        </w:numPr>
-      </w:pPr>
-      <w:r>
-        <w:rPr>
-          <w:rFonts w:ascii="Open Sans" w:cs="Open Sans" w:eastAsia="Open Sans" w:hAnsi="Open Sans"/>
-          <w:color w:val="000000"/>
-          <w:sz w:val="19"/>
-          <w:szCs w:val="19"/>
-        </w:rPr>
-        <w:t xml:space="preserve">Linked the trend to policy: share stalled at 13–15% during the 2014 investment freeze over the Renewable Energy Target review, then grew 2.5 points a year after the 2015 target reset, nearly 5× the earlier pace.</w:t>
-      </w:r>
-    </w:p>
-    <w:p>
-      <w:pPr>
-        <w:pStyle w:val="ListParagraph"/>
-        <w:numPr>
-          <w:ilvl w:val="0"/>
-          <w:numId w:val="2"/>
-        </w:numPr>
-      </w:pPr>
-      <w:r>
-        <w:rPr>
-          <w:rFonts w:ascii="Open Sans" w:cs="Open Sans" w:eastAsia="Open Sans" w:hAnsi="Open Sans"/>
-          <w:color w:val="000000"/>
-          <w:sz w:val="19"/>
-          <w:szCs w:val="19"/>
-        </w:rPr>
-        <w:t xml:space="preserve">Forecast with R linear regression (R² 0.85) that Australia reaches only 37.8% by 2030 and 44.6% by 2035; even the 95% upper bound for 2030 is 46.6%, so the 82% target is unlikely on the current trend.</w:t>
+        <w:t xml:space="preserve">Reconciled data from national energy agencies into a Power BI galaxy schema, showing Australia’s renewable share rising from 9% to 35%, benchmarked against Germany, New Zealand and China.</w:t>
+      </w:r>
+    </w:p>
+    <w:p>
+      <w:pPr>
+        <w:pStyle w:val="ListParagraph"/>
+        <w:numPr>
+          <w:ilvl w:val="0"/>
+          <w:numId w:val="2"/>
+        </w:numPr>
+      </w:pPr>
+      <w:r>
+        <w:rPr>
+          <w:rFonts w:ascii="Open Sans" w:cs="Open Sans" w:eastAsia="Open Sans" w:hAnsi="Open Sans"/>
+          <w:color w:val="000000"/>
+          <w:sz w:val="19"/>
+          <w:szCs w:val="19"/>
+        </w:rPr>
+        <w:t xml:space="preserve">Linked the trend to policy: share stalled while the Renewable Energy Target was under review, then grew nearly 5× faster after the 2015 target reset.</w:t>
+      </w:r>
+    </w:p>
+    <w:p>
+      <w:pPr>
+        <w:pStyle w:val="ListParagraph"/>
+        <w:numPr>
+          <w:ilvl w:val="0"/>
+          <w:numId w:val="2"/>
+        </w:numPr>
+      </w:pPr>
+      <w:r>
+        <w:rPr>
+          <w:rFonts w:ascii="Open Sans" w:cs="Open Sans" w:eastAsia="Open Sans" w:hAnsi="Open Sans"/>
+          <w:color w:val="000000"/>
+          <w:sz w:val="19"/>
+          <w:szCs w:val="19"/>
+        </w:rPr>
+        <w:t xml:space="preserve">Forecast with R linear regression that Australia reaches only 37.8% renewable share by 2030 against the 82% target, so the target is unlikely on the current trend.</w:t>
       </w:r>
     </w:p>
     <w:p>
@@ -1034,7 +1034,7 @@
         </w:rPr>
         <w:t xml:space="preserve">	</w:t>
       </w:r>
-      <w:hyperlink w:history="1" r:id="rIdjcjqz25vhnkkesrgil-cv">
+      <w:hyperlink w:history="1" r:id="rId-g-_ofm5yjkno6qnnv3qs">
         <w:r>
           <w:rPr>
             <w:rFonts w:ascii="Open Sans" w:cs="Open Sans" w:eastAsia="Open Sans" w:hAnsi="Open Sans"/>
@@ -1131,7 +1131,7 @@
           <w:sz w:val="19"/>
           <w:szCs w:val="19"/>
         </w:rPr>
-        <w:t xml:space="preserve">Created a data dictionary and inserted a full sample season (8 clubs, 96 players, 56 games, 154 goals), so the schema is documented for others and every query is tested on realistic data.</w:t>
+        <w:t xml:space="preserve">Created a data dictionary and inserted a full sample season of 56 games and 154 goals, so the schema is documented for others and every query is tested on realistic data.</w:t>
       </w:r>
     </w:p>
     <w:p>

</xml_diff>

<commit_message>
CV: football data dictionary bullet moved up, SQL bullets combined
Co-Authored-By: Claude Opus 5.5 <noreply@anthropic.com>
Claude-Session: https://claude.ai/code/session_011X2nibp2ZJGG1sr585TrFg
</commit_message>
<xml_diff>
--- a/Waranyu-Bancherdvanich-CV.docx
+++ b/Waranyu-Bancherdvanich-CV.docx
@@ -25,7 +25,7 @@
         <w:spacing w:after="0"/>
         <w:jc w:val="center"/>
       </w:pPr>
-      <w:hyperlink w:history="1" r:id="rIdzpnx_yxvyagauk2ks0myj">
+      <w:hyperlink w:history="1" r:id="rIdtmpsiwnylppkzplrxbdc6">
         <w:r>
           <w:rPr>
             <w:rFonts w:ascii="Open Sans" w:cs="Open Sans" w:eastAsia="Open Sans" w:hAnsi="Open Sans"/>
@@ -50,7 +50,7 @@
         </w:rPr>
         <w:t xml:space="preserve"> | </w:t>
       </w:r>
-      <w:hyperlink w:history="1" r:id="rIddlky7kqtbyiyvfuujcadq">
+      <w:hyperlink w:history="1" r:id="rIdb8wsftoy0ujizkaiay0c_">
         <w:r>
           <w:rPr>
             <w:rFonts w:ascii="Open Sans" w:cs="Open Sans" w:eastAsia="Open Sans" w:hAnsi="Open Sans"/>
@@ -70,7 +70,7 @@
         <w:spacing w:after="120"/>
         <w:jc w:val="center"/>
       </w:pPr>
-      <w:hyperlink w:history="1" r:id="rId1vxd-ctuix2xv4gf4hlkg">
+      <w:hyperlink w:history="1" r:id="rIdtymxc4czkmscj5xrom6st">
         <w:r>
           <w:rPr>
             <w:rFonts w:ascii="Open Sans" w:cs="Open Sans" w:eastAsia="Open Sans" w:hAnsi="Open Sans"/>
@@ -95,7 +95,7 @@
         </w:rPr>
         <w:t xml:space="preserve"> | </w:t>
       </w:r>
-      <w:hyperlink w:history="1" r:id="rIdfui-ioppw3djkeb2vvcjp">
+      <w:hyperlink w:history="1" r:id="rIdfllt6wmk-3jkd0xgledkv">
         <w:r>
           <w:rPr>
             <w:rFonts w:ascii="Open Sans" w:cs="Open Sans" w:eastAsia="Open Sans" w:hAnsi="Open Sans"/>
@@ -814,7 +814,7 @@
         </w:rPr>
         <w:t xml:space="preserve">	</w:t>
       </w:r>
-      <w:hyperlink w:history="1" r:id="rIdx2ms0hjlposukcwe_lu46">
+      <w:hyperlink w:history="1" r:id="rIdchgkbyjv5miwb0h3veybf">
         <w:r>
           <w:rPr>
             <w:rFonts w:ascii="Open Sans" w:cs="Open Sans" w:eastAsia="Open Sans" w:hAnsi="Open Sans"/>
@@ -924,7 +924,7 @@
         </w:rPr>
         <w:t xml:space="preserve">	</w:t>
       </w:r>
-      <w:hyperlink w:history="1" r:id="rIdbchmiin4ap0ogd3ho60jt">
+      <w:hyperlink w:history="1" r:id="rIdaaz13uifkmo9ubagnyzih">
         <w:r>
           <w:rPr>
             <w:rFonts w:ascii="Open Sans" w:cs="Open Sans" w:eastAsia="Open Sans" w:hAnsi="Open Sans"/>
@@ -1034,7 +1034,7 @@
         </w:rPr>
         <w:t xml:space="preserve">	</w:t>
       </w:r>
-      <w:hyperlink w:history="1" r:id="rId-g-_ofm5yjkno6qnnv3qs">
+      <w:hyperlink w:history="1" r:id="rId2zvjw6dptsb0gutsh7hbk">
         <w:r>
           <w:rPr>
             <w:rFonts w:ascii="Open Sans" w:cs="Open Sans" w:eastAsia="Open Sans" w:hAnsi="Open Sans"/>
@@ -1095,43 +1095,25 @@
           <w:sz w:val="19"/>
           <w:szCs w:val="19"/>
         </w:rPr>
-        <w:t xml:space="preserve">Wrote 9 analytical SQL queries using joins, subqueries and HAVING, answering real organiser questions such as the ladder, top scorers and goals per ground.</w:t>
-      </w:r>
-    </w:p>
-    <w:p>
-      <w:pPr>
-        <w:pStyle w:val="ListParagraph"/>
-        <w:numPr>
-          <w:ilvl w:val="0"/>
-          <w:numId w:val="2"/>
-        </w:numPr>
-      </w:pPr>
-      <w:r>
-        <w:rPr>
-          <w:rFonts w:ascii="Open Sans" w:cs="Open Sans" w:eastAsia="Open Sans" w:hAnsi="Open Sans"/>
-          <w:color w:val="000000"/>
-          <w:sz w:val="19"/>
-          <w:szCs w:val="19"/>
-        </w:rPr>
-        <w:t xml:space="preserve">Used a LEFT JOIN to keep goalless games in the averages, avoiding the inflated goals-per-ground figures an inner join would have produced.</w:t>
-      </w:r>
-    </w:p>
-    <w:p>
-      <w:pPr>
-        <w:pStyle w:val="ListParagraph"/>
-        <w:numPr>
-          <w:ilvl w:val="0"/>
-          <w:numId w:val="2"/>
-        </w:numPr>
-      </w:pPr>
-      <w:r>
-        <w:rPr>
-          <w:rFonts w:ascii="Open Sans" w:cs="Open Sans" w:eastAsia="Open Sans" w:hAnsi="Open Sans"/>
-          <w:color w:val="000000"/>
-          <w:sz w:val="19"/>
-          <w:szCs w:val="19"/>
-        </w:rPr>
         <w:t xml:space="preserve">Created a data dictionary and inserted a full sample season of 56 games and 154 goals, so the schema is documented for others and every query is tested on realistic data.</w:t>
+      </w:r>
+    </w:p>
+    <w:p>
+      <w:pPr>
+        <w:pStyle w:val="ListParagraph"/>
+        <w:numPr>
+          <w:ilvl w:val="0"/>
+          <w:numId w:val="2"/>
+        </w:numPr>
+      </w:pPr>
+      <w:r>
+        <w:rPr>
+          <w:rFonts w:ascii="Open Sans" w:cs="Open Sans" w:eastAsia="Open Sans" w:hAnsi="Open Sans"/>
+          <w:color w:val="000000"/>
+          <w:sz w:val="19"/>
+          <w:szCs w:val="19"/>
+        </w:rPr>
+        <w:t xml:space="preserve">Wrote 9 analytical SQL queries using joins, subqueries and HAVING to answer organiser questions such as the ladder, with a LEFT JOIN so goalless games keep goals-per-ground averages accurate.</w:t>
       </w:r>
     </w:p>
     <w:p>

</xml_diff>

<commit_message>
CV: FreshMart bullet and keywords name data cleaning
Co-Authored-By: Claude Opus 5.5 <noreply@anthropic.com>
Claude-Session: https://claude.ai/code/session_011X2nibp2ZJGG1sr585TrFg
</commit_message>
<xml_diff>
--- a/Waranyu-Bancherdvanich-CV.docx
+++ b/Waranyu-Bancherdvanich-CV.docx
@@ -25,7 +25,7 @@
         <w:spacing w:after="0"/>
         <w:jc w:val="center"/>
       </w:pPr>
-      <w:hyperlink w:history="1" r:id="rIdtmpsiwnylppkzplrxbdc6">
+      <w:hyperlink w:history="1" r:id="rIdpbdxsyn5alhvhsrowwhai">
         <w:r>
           <w:rPr>
             <w:rFonts w:ascii="Open Sans" w:cs="Open Sans" w:eastAsia="Open Sans" w:hAnsi="Open Sans"/>
@@ -50,7 +50,7 @@
         </w:rPr>
         <w:t xml:space="preserve"> | </w:t>
       </w:r>
-      <w:hyperlink w:history="1" r:id="rIdb8wsftoy0ujizkaiay0c_">
+      <w:hyperlink w:history="1" r:id="rIdrzabrtnqk53togg6d7ppg">
         <w:r>
           <w:rPr>
             <w:rFonts w:ascii="Open Sans" w:cs="Open Sans" w:eastAsia="Open Sans" w:hAnsi="Open Sans"/>
@@ -70,7 +70,7 @@
         <w:spacing w:after="120"/>
         <w:jc w:val="center"/>
       </w:pPr>
-      <w:hyperlink w:history="1" r:id="rIdtymxc4czkmscj5xrom6st">
+      <w:hyperlink w:history="1" r:id="rIdj9fhwpoassbwnuqo4jh3d">
         <w:r>
           <w:rPr>
             <w:rFonts w:ascii="Open Sans" w:cs="Open Sans" w:eastAsia="Open Sans" w:hAnsi="Open Sans"/>
@@ -95,7 +95,7 @@
         </w:rPr>
         <w:t xml:space="preserve"> | </w:t>
       </w:r>
-      <w:hyperlink w:history="1" r:id="rIdfllt6wmk-3jkd0xgledkv">
+      <w:hyperlink w:history="1" r:id="rIdma9625nx59rpmf97ctcrh">
         <w:r>
           <w:rPr>
             <w:rFonts w:ascii="Open Sans" w:cs="Open Sans" w:eastAsia="Open Sans" w:hAnsi="Open Sans"/>
@@ -814,7 +814,7 @@
         </w:rPr>
         <w:t xml:space="preserve">	</w:t>
       </w:r>
-      <w:hyperlink w:history="1" r:id="rIdchgkbyjv5miwb0h3veybf">
+      <w:hyperlink w:history="1" r:id="rIdfyvspsb0jj40mecj6mcki">
         <w:r>
           <w:rPr>
             <w:rFonts w:ascii="Open Sans" w:cs="Open Sans" w:eastAsia="Open Sans" w:hAnsi="Open Sans"/>
@@ -839,25 +839,25 @@
           <w:sz w:val="19"/>
           <w:szCs w:val="19"/>
         </w:rPr>
-        <w:t xml:space="preserve">Power BI, Power Query, DAX, Kimball Star Schema</w:t>
-      </w:r>
-    </w:p>
-    <w:p>
-      <w:pPr>
-        <w:pStyle w:val="ListParagraph"/>
-        <w:numPr>
-          <w:ilvl w:val="0"/>
-          <w:numId w:val="2"/>
-        </w:numPr>
-      </w:pPr>
-      <w:r>
-        <w:rPr>
-          <w:rFonts w:ascii="Open Sans" w:cs="Open Sans" w:eastAsia="Open Sans" w:hAnsi="Open Sans"/>
-          <w:color w:val="000000"/>
-          <w:sz w:val="19"/>
-          <w:szCs w:val="19"/>
-        </w:rPr>
-        <w:t xml:space="preserve">Audited 5 raw operational files in Power Query and remapped 93 orphaned sales rows instead of dropping them, keeping revenue totals accurate and the data gap visible.</w:t>
+        <w:t xml:space="preserve">Power BI, Power Query, Data Cleaning, DAX, Kimball Star Schema</w:t>
+      </w:r>
+    </w:p>
+    <w:p>
+      <w:pPr>
+        <w:pStyle w:val="ListParagraph"/>
+        <w:numPr>
+          <w:ilvl w:val="0"/>
+          <w:numId w:val="2"/>
+        </w:numPr>
+      </w:pPr>
+      <w:r>
+        <w:rPr>
+          <w:rFonts w:ascii="Open Sans" w:cs="Open Sans" w:eastAsia="Open Sans" w:hAnsi="Open Sans"/>
+          <w:color w:val="000000"/>
+          <w:sz w:val="19"/>
+          <w:szCs w:val="19"/>
+        </w:rPr>
+        <w:t xml:space="preserve">Cleaned data from 5 raw operational files in Power Query, remapping 93 orphaned sales rows instead of dropping them, keeping revenue totals accurate and the data gap visible.</w:t>
       </w:r>
     </w:p>
     <w:p>
@@ -924,7 +924,7 @@
         </w:rPr>
         <w:t xml:space="preserve">	</w:t>
       </w:r>
-      <w:hyperlink w:history="1" r:id="rIdaaz13uifkmo9ubagnyzih">
+      <w:hyperlink w:history="1" r:id="rIdd7zrzafe9ld4bww9-y9oi">
         <w:r>
           <w:rPr>
             <w:rFonts w:ascii="Open Sans" w:cs="Open Sans" w:eastAsia="Open Sans" w:hAnsi="Open Sans"/>
@@ -1034,7 +1034,7 @@
         </w:rPr>
         <w:t xml:space="preserve">	</w:t>
       </w:r>
-      <w:hyperlink w:history="1" r:id="rId2zvjw6dptsb0gutsh7hbk">
+      <w:hyperlink w:history="1" r:id="rIdshy9r8eyxdz5tpvcu9skd">
         <w:r>
           <w:rPr>
             <w:rFonts w:ascii="Open Sans" w:cs="Open Sans" w:eastAsia="Open Sans" w:hAnsi="Open Sans"/>

</xml_diff>

<commit_message>
CV: capstone bullet names the LoRA method behind the accuracy gain
Co-Authored-By: Claude Opus 5.5 <noreply@anthropic.com>
Claude-Session: https://claude.ai/code/session_011X2nibp2ZJGG1sr585TrFg
</commit_message>
<xml_diff>
--- a/Waranyu-Bancherdvanich-CV.docx
+++ b/Waranyu-Bancherdvanich-CV.docx
@@ -25,7 +25,7 @@
         <w:spacing w:after="0"/>
         <w:jc w:val="center"/>
       </w:pPr>
-      <w:hyperlink w:history="1" r:id="rIdpbdxsyn5alhvhsrowwhai">
+      <w:hyperlink w:history="1" r:id="rIdill1tbu0gguixl1vjaise">
         <w:r>
           <w:rPr>
             <w:rFonts w:ascii="Open Sans" w:cs="Open Sans" w:eastAsia="Open Sans" w:hAnsi="Open Sans"/>
@@ -50,7 +50,7 @@
         </w:rPr>
         <w:t xml:space="preserve"> | </w:t>
       </w:r>
-      <w:hyperlink w:history="1" r:id="rIdrzabrtnqk53togg6d7ppg">
+      <w:hyperlink w:history="1" r:id="rId5w-qawz5egxkcoowq2-x_">
         <w:r>
           <w:rPr>
             <w:rFonts w:ascii="Open Sans" w:cs="Open Sans" w:eastAsia="Open Sans" w:hAnsi="Open Sans"/>
@@ -70,7 +70,7 @@
         <w:spacing w:after="120"/>
         <w:jc w:val="center"/>
       </w:pPr>
-      <w:hyperlink w:history="1" r:id="rIdj9fhwpoassbwnuqo4jh3d">
+      <w:hyperlink w:history="1" r:id="rIddcky92peilxp88ntouc5j">
         <w:r>
           <w:rPr>
             <w:rFonts w:ascii="Open Sans" w:cs="Open Sans" w:eastAsia="Open Sans" w:hAnsi="Open Sans"/>
@@ -95,7 +95,7 @@
         </w:rPr>
         <w:t xml:space="preserve"> | </w:t>
       </w:r>
-      <w:hyperlink w:history="1" r:id="rIdma9625nx59rpmf97ctcrh">
+      <w:hyperlink w:history="1" r:id="rIdjx479it5il2dmbxtmom2p">
         <w:r>
           <w:rPr>
             <w:rFonts w:ascii="Open Sans" w:cs="Open Sans" w:eastAsia="Open Sans" w:hAnsi="Open Sans"/>
@@ -765,7 +765,7 @@
           <w:sz w:val="19"/>
           <w:szCs w:val="19"/>
         </w:rPr>
-        <w:t xml:space="preserve">Found a one-line training setting that more than doubled accuracy (38% to 81%), now the core of the recipe recommended to the client.</w:t>
+        <w:t xml:space="preserve">Used LoRA fine-tuning on the model’s MLP layers to increase accuracy from 38% to 81%, the project’s biggest gain and now the core of the recipe recommended to the client.</w:t>
       </w:r>
     </w:p>
     <w:p>
@@ -814,7 +814,7 @@
         </w:rPr>
         <w:t xml:space="preserve">	</w:t>
       </w:r>
-      <w:hyperlink w:history="1" r:id="rIdfyvspsb0jj40mecj6mcki">
+      <w:hyperlink w:history="1" r:id="rIdvqxezdnrf9ere2nd_fivb">
         <w:r>
           <w:rPr>
             <w:rFonts w:ascii="Open Sans" w:cs="Open Sans" w:eastAsia="Open Sans" w:hAnsi="Open Sans"/>
@@ -924,7 +924,7 @@
         </w:rPr>
         <w:t xml:space="preserve">	</w:t>
       </w:r>
-      <w:hyperlink w:history="1" r:id="rIdd7zrzafe9ld4bww9-y9oi">
+      <w:hyperlink w:history="1" r:id="rIdbxtgmukalloop_euxakqs">
         <w:r>
           <w:rPr>
             <w:rFonts w:ascii="Open Sans" w:cs="Open Sans" w:eastAsia="Open Sans" w:hAnsi="Open Sans"/>
@@ -1034,7 +1034,7 @@
         </w:rPr>
         <w:t xml:space="preserve">	</w:t>
       </w:r>
-      <w:hyperlink w:history="1" r:id="rIdshy9r8eyxdz5tpvcu9skd">
+      <w:hyperlink w:history="1" r:id="rIdu4bjpvnlpedemflsnbmzb">
         <w:r>
           <w:rPr>
             <w:rFonts w:ascii="Open Sans" w:cs="Open Sans" w:eastAsia="Open Sans" w:hAnsi="Open Sans"/>

</xml_diff>

<commit_message>
CV: supervisor role adds training new staff
Co-Authored-By: Claude Opus 5.5 <noreply@anthropic.com>
Claude-Session: https://claude.ai/code/session_011X2nibp2ZJGG1sr585TrFg
</commit_message>
<xml_diff>
--- a/Waranyu-Bancherdvanich-CV.docx
+++ b/Waranyu-Bancherdvanich-CV.docx
@@ -25,7 +25,7 @@
         <w:spacing w:after="0"/>
         <w:jc w:val="center"/>
       </w:pPr>
-      <w:hyperlink w:history="1" r:id="rIdill1tbu0gguixl1vjaise">
+      <w:hyperlink w:history="1" r:id="rId045yf6sa7h6dot8xavzjb">
         <w:r>
           <w:rPr>
             <w:rFonts w:ascii="Open Sans" w:cs="Open Sans" w:eastAsia="Open Sans" w:hAnsi="Open Sans"/>
@@ -50,7 +50,7 @@
         </w:rPr>
         <w:t xml:space="preserve"> | </w:t>
       </w:r>
-      <w:hyperlink w:history="1" r:id="rId5w-qawz5egxkcoowq2-x_">
+      <w:hyperlink w:history="1" r:id="rId90aptqznd8tnmvoxqalhc">
         <w:r>
           <w:rPr>
             <w:rFonts w:ascii="Open Sans" w:cs="Open Sans" w:eastAsia="Open Sans" w:hAnsi="Open Sans"/>
@@ -70,7 +70,7 @@
         <w:spacing w:after="120"/>
         <w:jc w:val="center"/>
       </w:pPr>
-      <w:hyperlink w:history="1" r:id="rIddcky92peilxp88ntouc5j">
+      <w:hyperlink w:history="1" r:id="rIdb0l4l515yc3h4hkeq-tl2">
         <w:r>
           <w:rPr>
             <w:rFonts w:ascii="Open Sans" w:cs="Open Sans" w:eastAsia="Open Sans" w:hAnsi="Open Sans"/>
@@ -95,7 +95,7 @@
         </w:rPr>
         <w:t xml:space="preserve"> | </w:t>
       </w:r>
-      <w:hyperlink w:history="1" r:id="rIdjx479it5il2dmbxtmom2p">
+      <w:hyperlink w:history="1" r:id="rIdnlnzvzclytkjw263cx9iz">
         <w:r>
           <w:rPr>
             <w:rFonts w:ascii="Open Sans" w:cs="Open Sans" w:eastAsia="Open Sans" w:hAnsi="Open Sans"/>
@@ -814,7 +814,7 @@
         </w:rPr>
         <w:t xml:space="preserve">	</w:t>
       </w:r>
-      <w:hyperlink w:history="1" r:id="rIdvqxezdnrf9ere2nd_fivb">
+      <w:hyperlink w:history="1" r:id="rId_ybhiybxc3cbzb1v-0fwx">
         <w:r>
           <w:rPr>
             <w:rFonts w:ascii="Open Sans" w:cs="Open Sans" w:eastAsia="Open Sans" w:hAnsi="Open Sans"/>
@@ -924,7 +924,7 @@
         </w:rPr>
         <w:t xml:space="preserve">	</w:t>
       </w:r>
-      <w:hyperlink w:history="1" r:id="rIdbxtgmukalloop_euxakqs">
+      <w:hyperlink w:history="1" r:id="rIdlinatyozjhxbypfd9p-vm">
         <w:r>
           <w:rPr>
             <w:rFonts w:ascii="Open Sans" w:cs="Open Sans" w:eastAsia="Open Sans" w:hAnsi="Open Sans"/>
@@ -1034,7 +1034,7 @@
         </w:rPr>
         <w:t xml:space="preserve">	</w:t>
       </w:r>
-      <w:hyperlink w:history="1" r:id="rIdu4bjpvnlpedemflsnbmzb">
+      <w:hyperlink w:history="1" r:id="rId0jp_l84hgokpwnoa8z6lr">
         <w:r>
           <w:rPr>
             <w:rFonts w:ascii="Open Sans" w:cs="Open Sans" w:eastAsia="Open Sans" w:hAnsi="Open Sans"/>
@@ -1200,6 +1200,24 @@
           <w:szCs w:val="19"/>
         </w:rPr>
         <w:t xml:space="preserve">Delivered customer service in a fast-paced restaurant environment, including taking orders, serving food and drinks, bartending, and processing bills.</w:t>
+      </w:r>
+    </w:p>
+    <w:p>
+      <w:pPr>
+        <w:pStyle w:val="ListParagraph"/>
+        <w:numPr>
+          <w:ilvl w:val="0"/>
+          <w:numId w:val="2"/>
+        </w:numPr>
+      </w:pPr>
+      <w:r>
+        <w:rPr>
+          <w:rFonts w:ascii="Open Sans" w:cs="Open Sans" w:eastAsia="Open Sans" w:hAnsi="Open Sans"/>
+          <w:color w:val="000000"/>
+          <w:sz w:val="19"/>
+          <w:szCs w:val="19"/>
+        </w:rPr>
+        <w:t xml:space="preserve">Trained new staff on service standards, ordering and payment processes, so the team keeps service consistent during busy shifts.</w:t>
       </w:r>
     </w:p>
     <w:p>

</xml_diff>

<commit_message>
CV: capstone renamed to its project title (LocoLLM)
Co-Authored-By: Claude Opus 5.5 <noreply@anthropic.com>
Claude-Session: https://claude.ai/code/session_011X2nibp2ZJGG1sr585TrFg
</commit_message>
<xml_diff>
--- a/Waranyu-Bancherdvanich-CV.docx
+++ b/Waranyu-Bancherdvanich-CV.docx
@@ -25,7 +25,7 @@
         <w:spacing w:after="0"/>
         <w:jc w:val="center"/>
       </w:pPr>
-      <w:hyperlink w:history="1" r:id="rId045yf6sa7h6dot8xavzjb">
+      <w:hyperlink w:history="1" r:id="rIdfvd3jfe8jmbl6-j7wfsxt">
         <w:r>
           <w:rPr>
             <w:rFonts w:ascii="Open Sans" w:cs="Open Sans" w:eastAsia="Open Sans" w:hAnsi="Open Sans"/>
@@ -50,7 +50,7 @@
         </w:rPr>
         <w:t xml:space="preserve"> | </w:t>
       </w:r>
-      <w:hyperlink w:history="1" r:id="rId90aptqznd8tnmvoxqalhc">
+      <w:hyperlink w:history="1" r:id="rIdbfapjhc0hduwsabodgjbj">
         <w:r>
           <w:rPr>
             <w:rFonts w:ascii="Open Sans" w:cs="Open Sans" w:eastAsia="Open Sans" w:hAnsi="Open Sans"/>
@@ -70,7 +70,7 @@
         <w:spacing w:after="120"/>
         <w:jc w:val="center"/>
       </w:pPr>
-      <w:hyperlink w:history="1" r:id="rIdb0l4l515yc3h4hkeq-tl2">
+      <w:hyperlink w:history="1" r:id="rIdrshg0agrrbx_whppha3z0">
         <w:r>
           <w:rPr>
             <w:rFonts w:ascii="Open Sans" w:cs="Open Sans" w:eastAsia="Open Sans" w:hAnsi="Open Sans"/>
@@ -95,7 +95,7 @@
         </w:rPr>
         <w:t xml:space="preserve"> | </w:t>
       </w:r>
-      <w:hyperlink w:history="1" r:id="rIdnlnzvzclytkjw263cx9iz">
+      <w:hyperlink w:history="1" r:id="rIdwqacl5_ehukpag0sx8ivk">
         <w:r>
           <w:rPr>
             <w:rFonts w:ascii="Open Sans" w:cs="Open Sans" w:eastAsia="Open Sans" w:hAnsi="Open Sans"/>
@@ -695,7 +695,7 @@
           <w:sz w:val="19"/>
           <w:szCs w:val="19"/>
         </w:rPr>
-        <w:t xml:space="preserve">MGMT6052 Consultancy Project (Capstone)</w:t>
+        <w:t xml:space="preserve">Building and Benchmarking a Domain-Specialist AI Model (LocoLLM)</w:t>
       </w:r>
     </w:p>
     <w:p>
@@ -814,7 +814,7 @@
         </w:rPr>
         <w:t xml:space="preserve">	</w:t>
       </w:r>
-      <w:hyperlink w:history="1" r:id="rId_ybhiybxc3cbzb1v-0fwx">
+      <w:hyperlink w:history="1" r:id="rIdnoj4mfiqoz-23mor-4k8f">
         <w:r>
           <w:rPr>
             <w:rFonts w:ascii="Open Sans" w:cs="Open Sans" w:eastAsia="Open Sans" w:hAnsi="Open Sans"/>
@@ -924,7 +924,7 @@
         </w:rPr>
         <w:t xml:space="preserve">	</w:t>
       </w:r>
-      <w:hyperlink w:history="1" r:id="rIdlinatyozjhxbypfd9p-vm">
+      <w:hyperlink w:history="1" r:id="rIdbyjbjcc9fkjwgrf92wb_0">
         <w:r>
           <w:rPr>
             <w:rFonts w:ascii="Open Sans" w:cs="Open Sans" w:eastAsia="Open Sans" w:hAnsi="Open Sans"/>
@@ -1034,7 +1034,7 @@
         </w:rPr>
         <w:t xml:space="preserve">	</w:t>
       </w:r>
-      <w:hyperlink w:history="1" r:id="rId0jp_l84hgokpwnoa8z6lr">
+      <w:hyperlink w:history="1" r:id="rId3qdlpmwcbd4bwvt-rdp9k">
         <w:r>
           <w:rPr>
             <w:rFonts w:ascii="Open Sans" w:cs="Open Sans" w:eastAsia="Open Sans" w:hAnsi="Open Sans"/>

</xml_diff>

<commit_message>
Add the LocoLLM capstone as a portfolio project
New case study page with an interactive results explorer built from the
team's client presentation: the 15-domain base-model test, accuracy by
question type for each training run, and correct answers per privacy
principle. Links to the LocoLLM repository on GitHub. The home page gets
a project card and the Experience entry links to the case study; the
other projects are renumbered and the next-project chain runs through
the new page. The CV links the capstone to the page and counts five
portfolio projects.

Co-Authored-By: Claude Opus 5.5 <noreply@anthropic.com>
Claude-Session: https://claude.ai/code/session_011X2nibp2ZJGG1sr585TrFg
</commit_message>
<xml_diff>
--- a/Waranyu-Bancherdvanich-CV.docx
+++ b/Waranyu-Bancherdvanich-CV.docx
@@ -25,7 +25,7 @@
         <w:spacing w:after="0"/>
         <w:jc w:val="center"/>
       </w:pPr>
-      <w:hyperlink w:history="1" r:id="rIdfvd3jfe8jmbl6-j7wfsxt">
+      <w:hyperlink w:history="1" r:id="rId4pbigoyhtfsrxeib7a8ug">
         <w:r>
           <w:rPr>
             <w:rFonts w:ascii="Open Sans" w:cs="Open Sans" w:eastAsia="Open Sans" w:hAnsi="Open Sans"/>
@@ -50,7 +50,7 @@
         </w:rPr>
         <w:t xml:space="preserve"> | </w:t>
       </w:r>
-      <w:hyperlink w:history="1" r:id="rIdbfapjhc0hduwsabodgjbj">
+      <w:hyperlink w:history="1" r:id="rIdnbzgiz_f4yrim8rh5nloy">
         <w:r>
           <w:rPr>
             <w:rFonts w:ascii="Open Sans" w:cs="Open Sans" w:eastAsia="Open Sans" w:hAnsi="Open Sans"/>
@@ -70,7 +70,7 @@
         <w:spacing w:after="120"/>
         <w:jc w:val="center"/>
       </w:pPr>
-      <w:hyperlink w:history="1" r:id="rIdrshg0agrrbx_whppha3z0">
+      <w:hyperlink w:history="1" r:id="rIdnhg0ybaammoqb_5af_jem">
         <w:r>
           <w:rPr>
             <w:rFonts w:ascii="Open Sans" w:cs="Open Sans" w:eastAsia="Open Sans" w:hAnsi="Open Sans"/>
@@ -95,7 +95,7 @@
         </w:rPr>
         <w:t xml:space="preserve"> | </w:t>
       </w:r>
-      <w:hyperlink w:history="1" r:id="rIdwqacl5_ehukpag0sx8ivk">
+      <w:hyperlink w:history="1" r:id="rIdgdwbxigsoiiyjenpeuhe5">
         <w:r>
           <w:rPr>
             <w:rFonts w:ascii="Open Sans" w:cs="Open Sans" w:eastAsia="Open Sans" w:hAnsi="Open Sans"/>
@@ -137,7 +137,7 @@
           <w:sz w:val="19"/>
           <w:szCs w:val="19"/>
         </w:rPr>
-        <w:t xml:space="preserve">Master of Information Systems and Technology student at Curtin University, specialising in data analytics and visualisation, with a bachelor’s degree in statistics and finance. I build Power BI dashboards on data I have audited and modelled myself, and I forecast in R so the method can be checked. Most recently I led the financial analysis for a Curtin Consulting Group engagement with Hockey WA. Four portfolio projects run on their real data at waranyu-cv.vercel.app. Seeking a data analyst internship in Perth, and graduate roles from July 2027.</w:t>
+        <w:t xml:space="preserve">Master of Information Systems and Technology student at Curtin University, specialising in data analytics and visualisation, with a bachelor’s degree in statistics and finance. I build Power BI dashboards on data I have audited and modelled myself, and I forecast in R so the method can be checked. Most recently I led the financial analysis for a Curtin Consulting Group engagement with Hockey WA. Five portfolio projects run on their real data at waranyu-cv.vercel.app. Seeking a data analyst internship in Perth, and graduate roles from July 2027.</w:t>
       </w:r>
     </w:p>
     <w:p>
@@ -697,114 +697,6 @@
         </w:rPr>
         <w:t xml:space="preserve">Building and Benchmarking a Domain-Specialist AI Model (LocoLLM)</w:t>
       </w:r>
-    </w:p>
-    <w:p>
-      <w:pPr>
-        <w:keepNext/>
-      </w:pPr>
-      <w:r>
-        <w:rPr>
-          <w:rFonts w:ascii="Open Sans" w:cs="Open Sans" w:eastAsia="Open Sans" w:hAnsi="Open Sans"/>
-          <w:i/>
-          <w:iCs/>
-          <w:color w:val="278067"/>
-          <w:sz w:val="19"/>
-          <w:szCs w:val="19"/>
-        </w:rPr>
-        <w:t xml:space="preserve">Quality and Documentation Manager – Client: LocoLabo, Curtin Business School</w:t>
-      </w:r>
-    </w:p>
-    <w:p>
-      <w:pPr>
-        <w:pStyle w:val="ListParagraph"/>
-        <w:numPr>
-          <w:ilvl w:val="0"/>
-          <w:numId w:val="2"/>
-        </w:numPr>
-      </w:pPr>
-      <w:r>
-        <w:rPr>
-          <w:rFonts w:ascii="Open Sans" w:cs="Open Sans" w:eastAsia="Open Sans" w:hAnsi="Open Sans"/>
-          <w:color w:val="000000"/>
-          <w:sz w:val="19"/>
-          <w:szCs w:val="19"/>
-        </w:rPr>
-        <w:t xml:space="preserve">Tested the base AI model across 15 business areas and identified Australian privacy law as its weakest, giving the client clear evidence to approve the project focus.</w:t>
-      </w:r>
-    </w:p>
-    <w:p>
-      <w:pPr>
-        <w:pStyle w:val="ListParagraph"/>
-        <w:numPr>
-          <w:ilvl w:val="0"/>
-          <w:numId w:val="2"/>
-        </w:numPr>
-      </w:pPr>
-      <w:r>
-        <w:rPr>
-          <w:rFonts w:ascii="Open Sans" w:cs="Open Sans" w:eastAsia="Open Sans" w:hAnsi="Open Sans"/>
-          <w:color w:val="000000"/>
-          <w:sz w:val="19"/>
-          <w:szCs w:val="19"/>
-        </w:rPr>
-        <w:t xml:space="preserve">Trained a privacy-law expert adapter that reached 81% accuracy on a sealed 170-question test, using only free tools, proving the client’s “small model, plug-in expert” idea works.</w:t>
-      </w:r>
-    </w:p>
-    <w:p>
-      <w:pPr>
-        <w:pStyle w:val="ListParagraph"/>
-        <w:numPr>
-          <w:ilvl w:val="0"/>
-          <w:numId w:val="2"/>
-        </w:numPr>
-      </w:pPr>
-      <w:r>
-        <w:rPr>
-          <w:rFonts w:ascii="Open Sans" w:cs="Open Sans" w:eastAsia="Open Sans" w:hAnsi="Open Sans"/>
-          <w:color w:val="000000"/>
-          <w:sz w:val="19"/>
-          <w:szCs w:val="19"/>
-        </w:rPr>
-        <w:t xml:space="preserve">Used LoRA fine-tuning on the model’s MLP layers to increase accuracy from 38% to 81%, the project’s biggest gain and now the core of the recipe recommended to the client.</w:t>
-      </w:r>
-    </w:p>
-    <w:p>
-      <w:pPr>
-        <w:pStyle w:val="ListParagraph"/>
-        <w:numPr>
-          <w:ilvl w:val="0"/>
-          <w:numId w:val="2"/>
-        </w:numPr>
-      </w:pPr>
-      <w:r>
-        <w:rPr>
-          <w:rFonts w:ascii="Open Sans" w:cs="Open Sans" w:eastAsia="Open Sans" w:hAnsi="Open Sans"/>
-          <w:color w:val="000000"/>
-          <w:sz w:val="19"/>
-          <w:szCs w:val="19"/>
-        </w:rPr>
-        <w:t xml:space="preserve">Delivered a 6-step handover recipe and client presentation, so the next team can build an adapter for a new subject much faster.</w:t>
-      </w:r>
-    </w:p>
-    <w:p>
-      <w:pPr>
-        <w:keepNext/>
-        <w:tabs>
-          <w:tab w:val="right" w:pos="9978"/>
-        </w:tabs>
-        <w:spacing w:before="120"/>
-      </w:pPr>
-      <w:r>
-        <w:rPr>
-          <w:rFonts w:ascii="Open Sans" w:cs="Open Sans" w:eastAsia="Open Sans" w:hAnsi="Open Sans"/>
-          <w:b/>
-          <w:bCs/>
-          <w:color w:val="000000"/>
-          <w:sz w:val="19"/>
-          <w:szCs w:val="19"/>
-        </w:rPr>
-        <w:t xml:space="preserve">FreshMart Sales Performance Dashboard</w:t>
-      </w:r>
       <w:r>
         <w:rPr>
           <w:rFonts w:ascii="Open Sans" w:cs="Open Sans" w:eastAsia="Open Sans" w:hAnsi="Open Sans"/>
@@ -814,7 +706,7 @@
         </w:rPr>
         <w:t xml:space="preserve">	</w:t>
       </w:r>
-      <w:hyperlink w:history="1" r:id="rIdnoj4mfiqoz-23mor-4k8f">
+      <w:hyperlink w:history="1" r:id="rIdzmc1qz0v1hnc948gxfwei">
         <w:r>
           <w:rPr>
             <w:rFonts w:ascii="Open Sans" w:cs="Open Sans" w:eastAsia="Open Sans" w:hAnsi="Open Sans"/>
@@ -839,61 +731,79 @@
           <w:sz w:val="19"/>
           <w:szCs w:val="19"/>
         </w:rPr>
-        <w:t xml:space="preserve">Power BI, Power Query, Data Cleaning, DAX, Kimball Star Schema</w:t>
-      </w:r>
-    </w:p>
-    <w:p>
-      <w:pPr>
-        <w:pStyle w:val="ListParagraph"/>
-        <w:numPr>
-          <w:ilvl w:val="0"/>
-          <w:numId w:val="2"/>
-        </w:numPr>
-      </w:pPr>
-      <w:r>
-        <w:rPr>
-          <w:rFonts w:ascii="Open Sans" w:cs="Open Sans" w:eastAsia="Open Sans" w:hAnsi="Open Sans"/>
-          <w:color w:val="000000"/>
-          <w:sz w:val="19"/>
-          <w:szCs w:val="19"/>
-        </w:rPr>
-        <w:t xml:space="preserve">Cleaned data from 5 raw operational files in Power Query, remapping 93 orphaned sales rows instead of dropping them, keeping revenue totals accurate and the data gap visible.</w:t>
-      </w:r>
-    </w:p>
-    <w:p>
-      <w:pPr>
-        <w:pStyle w:val="ListParagraph"/>
-        <w:numPr>
-          <w:ilvl w:val="0"/>
-          <w:numId w:val="2"/>
-        </w:numPr>
-      </w:pPr>
-      <w:r>
-        <w:rPr>
-          <w:rFonts w:ascii="Open Sans" w:cs="Open Sans" w:eastAsia="Open Sans" w:hAnsi="Open Sans"/>
-          <w:color w:val="000000"/>
-          <w:sz w:val="19"/>
-          <w:szCs w:val="19"/>
-        </w:rPr>
-        <w:t xml:space="preserve">Modelled 17,697 transactions across 12 stores into a Kimball star schema, so managers can see which regions and categories drive profit without stitching spreadsheets together.</w:t>
-      </w:r>
-    </w:p>
-    <w:p>
-      <w:pPr>
-        <w:pStyle w:val="ListParagraph"/>
-        <w:numPr>
-          <w:ilvl w:val="0"/>
-          <w:numId w:val="2"/>
-        </w:numPr>
-      </w:pPr>
-      <w:r>
-        <w:rPr>
-          <w:rFonts w:ascii="Open Sans" w:cs="Open Sans" w:eastAsia="Open Sans" w:hAnsi="Open Sans"/>
-          <w:color w:val="000000"/>
-          <w:sz w:val="19"/>
-          <w:szCs w:val="19"/>
-        </w:rPr>
-        <w:t xml:space="preserve">Built DAX measures for revenue, gross margin and year-on-year time intelligence, so growth is judged against a fair like-for-like comparison rather than a raw total.</w:t>
+        <w:t xml:space="preserve">Quality and Documentation Manager – Client: LocoLabo, Curtin Business School</w:t>
+      </w:r>
+    </w:p>
+    <w:p>
+      <w:pPr>
+        <w:pStyle w:val="ListParagraph"/>
+        <w:numPr>
+          <w:ilvl w:val="0"/>
+          <w:numId w:val="2"/>
+        </w:numPr>
+      </w:pPr>
+      <w:r>
+        <w:rPr>
+          <w:rFonts w:ascii="Open Sans" w:cs="Open Sans" w:eastAsia="Open Sans" w:hAnsi="Open Sans"/>
+          <w:color w:val="000000"/>
+          <w:sz w:val="19"/>
+          <w:szCs w:val="19"/>
+        </w:rPr>
+        <w:t xml:space="preserve">Tested the base AI model across 15 business areas and pinpointed Australian privacy law as a weak spot, giving the client clear evidence to approve the project focus.</w:t>
+      </w:r>
+    </w:p>
+    <w:p>
+      <w:pPr>
+        <w:pStyle w:val="ListParagraph"/>
+        <w:numPr>
+          <w:ilvl w:val="0"/>
+          <w:numId w:val="2"/>
+        </w:numPr>
+      </w:pPr>
+      <w:r>
+        <w:rPr>
+          <w:rFonts w:ascii="Open Sans" w:cs="Open Sans" w:eastAsia="Open Sans" w:hAnsi="Open Sans"/>
+          <w:color w:val="000000"/>
+          <w:sz w:val="19"/>
+          <w:szCs w:val="19"/>
+        </w:rPr>
+        <w:t xml:space="preserve">Trained a privacy-law expert adapter that reached 81% accuracy on a sealed 170-question test, using only free tools, proving the client’s “small model, plug-in expert” idea works.</w:t>
+      </w:r>
+    </w:p>
+    <w:p>
+      <w:pPr>
+        <w:pStyle w:val="ListParagraph"/>
+        <w:numPr>
+          <w:ilvl w:val="0"/>
+          <w:numId w:val="2"/>
+        </w:numPr>
+      </w:pPr>
+      <w:r>
+        <w:rPr>
+          <w:rFonts w:ascii="Open Sans" w:cs="Open Sans" w:eastAsia="Open Sans" w:hAnsi="Open Sans"/>
+          <w:color w:val="000000"/>
+          <w:sz w:val="19"/>
+          <w:szCs w:val="19"/>
+        </w:rPr>
+        <w:t xml:space="preserve">Used LoRA fine-tuning on the model’s MLP layers to increase accuracy from 38% to 81%, the project’s biggest gain and now the core of the recipe recommended to the client.</w:t>
+      </w:r>
+    </w:p>
+    <w:p>
+      <w:pPr>
+        <w:pStyle w:val="ListParagraph"/>
+        <w:numPr>
+          <w:ilvl w:val="0"/>
+          <w:numId w:val="2"/>
+        </w:numPr>
+      </w:pPr>
+      <w:r>
+        <w:rPr>
+          <w:rFonts w:ascii="Open Sans" w:cs="Open Sans" w:eastAsia="Open Sans" w:hAnsi="Open Sans"/>
+          <w:color w:val="000000"/>
+          <w:sz w:val="19"/>
+          <w:szCs w:val="19"/>
+        </w:rPr>
+        <w:t xml:space="preserve">Delivered a 6-step handover recipe and client presentation, so the next team can build an adapter for a new subject much faster.</w:t>
       </w:r>
     </w:p>
     <w:p>
@@ -913,7 +823,7 @@
           <w:sz w:val="19"/>
           <w:szCs w:val="19"/>
         </w:rPr>
-        <w:t xml:space="preserve">Renewable Electricity Transition Dashboard</w:t>
+        <w:t xml:space="preserve">FreshMart Sales Performance Dashboard</w:t>
       </w:r>
       <w:r>
         <w:rPr>
@@ -924,7 +834,7 @@
         </w:rPr>
         <w:t xml:space="preserve">	</w:t>
       </w:r>
-      <w:hyperlink w:history="1" r:id="rIdbyjbjcc9fkjwgrf92wb_0">
+      <w:hyperlink w:history="1" r:id="rIdven5lctdsarjp2o1txq_e">
         <w:r>
           <w:rPr>
             <w:rFonts w:ascii="Open Sans" w:cs="Open Sans" w:eastAsia="Open Sans" w:hAnsi="Open Sans"/>
@@ -949,61 +859,61 @@
           <w:sz w:val="19"/>
           <w:szCs w:val="19"/>
         </w:rPr>
-        <w:t xml:space="preserve">Power BI, Power Query, DAX, R, Linear Regression, Policy Analysis</w:t>
-      </w:r>
-    </w:p>
-    <w:p>
-      <w:pPr>
-        <w:pStyle w:val="ListParagraph"/>
-        <w:numPr>
-          <w:ilvl w:val="0"/>
-          <w:numId w:val="2"/>
-        </w:numPr>
-      </w:pPr>
-      <w:r>
-        <w:rPr>
-          <w:rFonts w:ascii="Open Sans" w:cs="Open Sans" w:eastAsia="Open Sans" w:hAnsi="Open Sans"/>
-          <w:color w:val="000000"/>
-          <w:sz w:val="19"/>
-          <w:szCs w:val="19"/>
-        </w:rPr>
-        <w:t xml:space="preserve">Reconciled data from national energy agencies into a Power BI galaxy schema, showing Australia’s renewable share rising from 9% to 35%, benchmarked against Germany, New Zealand and China.</w:t>
-      </w:r>
-    </w:p>
-    <w:p>
-      <w:pPr>
-        <w:pStyle w:val="ListParagraph"/>
-        <w:numPr>
-          <w:ilvl w:val="0"/>
-          <w:numId w:val="2"/>
-        </w:numPr>
-      </w:pPr>
-      <w:r>
-        <w:rPr>
-          <w:rFonts w:ascii="Open Sans" w:cs="Open Sans" w:eastAsia="Open Sans" w:hAnsi="Open Sans"/>
-          <w:color w:val="000000"/>
-          <w:sz w:val="19"/>
-          <w:szCs w:val="19"/>
-        </w:rPr>
-        <w:t xml:space="preserve">Linked the trend to policy: share stalled while the Renewable Energy Target was under review, then grew nearly 5× faster after the 2015 target reset.</w:t>
-      </w:r>
-    </w:p>
-    <w:p>
-      <w:pPr>
-        <w:pStyle w:val="ListParagraph"/>
-        <w:numPr>
-          <w:ilvl w:val="0"/>
-          <w:numId w:val="2"/>
-        </w:numPr>
-      </w:pPr>
-      <w:r>
-        <w:rPr>
-          <w:rFonts w:ascii="Open Sans" w:cs="Open Sans" w:eastAsia="Open Sans" w:hAnsi="Open Sans"/>
-          <w:color w:val="000000"/>
-          <w:sz w:val="19"/>
-          <w:szCs w:val="19"/>
-        </w:rPr>
-        <w:t xml:space="preserve">Forecast with R linear regression that Australia reaches only 37.8% renewable share by 2030 against the 82% target, so the target is unlikely on the current trend.</w:t>
+        <w:t xml:space="preserve">Power BI, Power Query, Data Cleaning, DAX, Kimball Star Schema</w:t>
+      </w:r>
+    </w:p>
+    <w:p>
+      <w:pPr>
+        <w:pStyle w:val="ListParagraph"/>
+        <w:numPr>
+          <w:ilvl w:val="0"/>
+          <w:numId w:val="2"/>
+        </w:numPr>
+      </w:pPr>
+      <w:r>
+        <w:rPr>
+          <w:rFonts w:ascii="Open Sans" w:cs="Open Sans" w:eastAsia="Open Sans" w:hAnsi="Open Sans"/>
+          <w:color w:val="000000"/>
+          <w:sz w:val="19"/>
+          <w:szCs w:val="19"/>
+        </w:rPr>
+        <w:t xml:space="preserve">Cleaned data from 5 raw operational files in Power Query, remapping 93 orphaned sales rows instead of dropping them, keeping revenue totals accurate and the data gap visible.</w:t>
+      </w:r>
+    </w:p>
+    <w:p>
+      <w:pPr>
+        <w:pStyle w:val="ListParagraph"/>
+        <w:numPr>
+          <w:ilvl w:val="0"/>
+          <w:numId w:val="2"/>
+        </w:numPr>
+      </w:pPr>
+      <w:r>
+        <w:rPr>
+          <w:rFonts w:ascii="Open Sans" w:cs="Open Sans" w:eastAsia="Open Sans" w:hAnsi="Open Sans"/>
+          <w:color w:val="000000"/>
+          <w:sz w:val="19"/>
+          <w:szCs w:val="19"/>
+        </w:rPr>
+        <w:t xml:space="preserve">Modelled 17,697 transactions across 12 stores into a Kimball star schema, so managers can see which regions and categories drive profit without stitching spreadsheets together.</w:t>
+      </w:r>
+    </w:p>
+    <w:p>
+      <w:pPr>
+        <w:pStyle w:val="ListParagraph"/>
+        <w:numPr>
+          <w:ilvl w:val="0"/>
+          <w:numId w:val="2"/>
+        </w:numPr>
+      </w:pPr>
+      <w:r>
+        <w:rPr>
+          <w:rFonts w:ascii="Open Sans" w:cs="Open Sans" w:eastAsia="Open Sans" w:hAnsi="Open Sans"/>
+          <w:color w:val="000000"/>
+          <w:sz w:val="19"/>
+          <w:szCs w:val="19"/>
+        </w:rPr>
+        <w:t xml:space="preserve">Built DAX measures for revenue, gross margin and year-on-year time intelligence, so growth is judged against a fair like-for-like comparison rather than a raw total.</w:t>
       </w:r>
     </w:p>
     <w:p>
@@ -1023,6 +933,116 @@
           <w:sz w:val="19"/>
           <w:szCs w:val="19"/>
         </w:rPr>
+        <w:t xml:space="preserve">Renewable Electricity Transition Dashboard</w:t>
+      </w:r>
+      <w:r>
+        <w:rPr>
+          <w:rFonts w:ascii="Open Sans" w:cs="Open Sans" w:eastAsia="Open Sans" w:hAnsi="Open Sans"/>
+          <w:color w:val="000000"/>
+          <w:sz w:val="19"/>
+          <w:szCs w:val="19"/>
+        </w:rPr>
+        <w:t xml:space="preserve">	</w:t>
+      </w:r>
+      <w:hyperlink w:history="1" r:id="rIdmhtokfwspv0slfly7uoba">
+        <w:r>
+          <w:rPr>
+            <w:rFonts w:ascii="Open Sans" w:cs="Open Sans" w:eastAsia="Open Sans" w:hAnsi="Open Sans"/>
+            <w:color w:val="278067"/>
+            <w:sz w:val="17"/>
+            <w:szCs w:val="17"/>
+          </w:rPr>
+          <w:t xml:space="preserve">See the project ↗</w:t>
+        </w:r>
+      </w:hyperlink>
+    </w:p>
+    <w:p>
+      <w:pPr>
+        <w:keepNext/>
+      </w:pPr>
+      <w:r>
+        <w:rPr>
+          <w:rFonts w:ascii="Open Sans" w:cs="Open Sans" w:eastAsia="Open Sans" w:hAnsi="Open Sans"/>
+          <w:i/>
+          <w:iCs/>
+          <w:color w:val="278067"/>
+          <w:sz w:val="19"/>
+          <w:szCs w:val="19"/>
+        </w:rPr>
+        <w:t xml:space="preserve">Power BI, Power Query, DAX, R, Linear Regression, Policy Analysis</w:t>
+      </w:r>
+    </w:p>
+    <w:p>
+      <w:pPr>
+        <w:pStyle w:val="ListParagraph"/>
+        <w:numPr>
+          <w:ilvl w:val="0"/>
+          <w:numId w:val="2"/>
+        </w:numPr>
+      </w:pPr>
+      <w:r>
+        <w:rPr>
+          <w:rFonts w:ascii="Open Sans" w:cs="Open Sans" w:eastAsia="Open Sans" w:hAnsi="Open Sans"/>
+          <w:color w:val="000000"/>
+          <w:sz w:val="19"/>
+          <w:szCs w:val="19"/>
+        </w:rPr>
+        <w:t xml:space="preserve">Reconciled data from national energy agencies into a Power BI galaxy schema, showing Australia’s renewable share rising from 9% to 35%, benchmarked against Germany, New Zealand and China.</w:t>
+      </w:r>
+    </w:p>
+    <w:p>
+      <w:pPr>
+        <w:pStyle w:val="ListParagraph"/>
+        <w:numPr>
+          <w:ilvl w:val="0"/>
+          <w:numId w:val="2"/>
+        </w:numPr>
+      </w:pPr>
+      <w:r>
+        <w:rPr>
+          <w:rFonts w:ascii="Open Sans" w:cs="Open Sans" w:eastAsia="Open Sans" w:hAnsi="Open Sans"/>
+          <w:color w:val="000000"/>
+          <w:sz w:val="19"/>
+          <w:szCs w:val="19"/>
+        </w:rPr>
+        <w:t xml:space="preserve">Linked the trend to policy: share stalled while the Renewable Energy Target was under review, then grew nearly 5× faster after the 2015 target reset.</w:t>
+      </w:r>
+    </w:p>
+    <w:p>
+      <w:pPr>
+        <w:pStyle w:val="ListParagraph"/>
+        <w:numPr>
+          <w:ilvl w:val="0"/>
+          <w:numId w:val="2"/>
+        </w:numPr>
+      </w:pPr>
+      <w:r>
+        <w:rPr>
+          <w:rFonts w:ascii="Open Sans" w:cs="Open Sans" w:eastAsia="Open Sans" w:hAnsi="Open Sans"/>
+          <w:color w:val="000000"/>
+          <w:sz w:val="19"/>
+          <w:szCs w:val="19"/>
+        </w:rPr>
+        <w:t xml:space="preserve">Forecast with R linear regression that Australia reaches only 37.8% renewable share by 2030 against the 82% target, so the target is unlikely on the current trend.</w:t>
+      </w:r>
+    </w:p>
+    <w:p>
+      <w:pPr>
+        <w:keepNext/>
+        <w:tabs>
+          <w:tab w:val="right" w:pos="9978"/>
+        </w:tabs>
+        <w:spacing w:before="120"/>
+      </w:pPr>
+      <w:r>
+        <w:rPr>
+          <w:rFonts w:ascii="Open Sans" w:cs="Open Sans" w:eastAsia="Open Sans" w:hAnsi="Open Sans"/>
+          <w:b/>
+          <w:bCs/>
+          <w:color w:val="000000"/>
+          <w:sz w:val="19"/>
+          <w:szCs w:val="19"/>
+        </w:rPr>
         <w:t xml:space="preserve">Football Club Database Design and SQL Implementation</w:t>
       </w:r>
       <w:r>
@@ -1034,7 +1054,7 @@
         </w:rPr>
         <w:t xml:space="preserve">	</w:t>
       </w:r>
-      <w:hyperlink w:history="1" r:id="rId3qdlpmwcbd4bwvt-rdp9k">
+      <w:hyperlink w:history="1" r:id="rId06f1y7uxv9eajggispf-f">
         <w:r>
           <w:rPr>
             <w:rFonts w:ascii="Open Sans" w:cs="Open Sans" w:eastAsia="Open Sans" w:hAnsi="Open Sans"/>

</xml_diff>

<commit_message>
Site and CV: football What I did section, Hockey WA ongoing, 5x growth states its 2005 to 2015 baseline
</commit_message>
<xml_diff>
--- a/Waranyu-Bancherdvanich-CV.docx
+++ b/Waranyu-Bancherdvanich-CV.docx
@@ -447,7 +447,7 @@
           <w:sz w:val="19"/>
           <w:szCs w:val="19"/>
         </w:rPr>
-        <w:t xml:space="preserve">	Jul 2026 – Nov 2026</w:t>
+        <w:t xml:space="preserve">	Jul 2026 – Present</w:t>
       </w:r>
     </w:p>
     <w:p>
@@ -1005,7 +1005,7 @@
           <w:sz w:val="19"/>
           <w:szCs w:val="19"/>
         </w:rPr>
-        <w:t xml:space="preserve">Linked the trend to policy: share stalled while the Renewable Energy Target was under review, then grew nearly 5× faster after the 2015 target reset.</w:t>
+        <w:t xml:space="preserve">Linked the trend to policy: share stalled while the Renewable Energy Target was under review, then grew about 2.5 points a year after the 2015 target reset, nearly 5× its 2005 to 2015 pace.</w:t>
       </w:r>
     </w:p>
     <w:p>

</xml_diff>